<commit_message>
Cambios en formatos de tdr y arreglo en generación de planilla por parseos
</commit_message>
<xml_diff>
--- a/Modelos_documentos/tdr_administrativo.docx
+++ b/Modelos_documentos/tdr_administrativo.docx
@@ -1,6 +1,6 @@
 
 <file path=word/document.xml><?xml version="1.0" encoding="utf-8"?>
-<w:document xmlns:wpc="http://schemas.microsoft.com/office/word/2010/wordprocessingCanvas" xmlns:cx="http://schemas.microsoft.com/office/drawing/2014/chartex" xmlns:mc="http://schemas.openxmlformats.org/markup-compatibility/2006" xmlns:o="urn:schemas-microsoft-com:office:office" xmlns:r="http://schemas.openxmlformats.org/officeDocument/2006/relationships" xmlns:m="http://schemas.openxmlformats.org/officeDocument/2006/math" xmlns:v="urn:schemas-microsoft-com:vml" xmlns:wp14="http://schemas.microsoft.com/office/word/2010/wordprocessingDrawing" xmlns:wp="http://schemas.openxmlformats.org/drawingml/2006/wordprocessingDrawing" xmlns:w10="urn:schemas-microsoft-com:office:word" xmlns:w="http://schemas.openxmlformats.org/wordprocessingml/2006/main" xmlns:w14="http://schemas.microsoft.com/office/word/2010/wordml" xmlns:w15="http://schemas.microsoft.com/office/word/2012/wordml" xmlns:w16se="http://schemas.microsoft.com/office/word/2015/wordml/symex" xmlns:wpg="http://schemas.microsoft.com/office/word/2010/wordprocessingGroup" xmlns:wpi="http://schemas.microsoft.com/office/word/2010/wordprocessingInk" xmlns:wne="http://schemas.microsoft.com/office/word/2006/wordml" xmlns:wps="http://schemas.microsoft.com/office/word/2010/wordprocessingShape" mc:Ignorable="w14 w15 w16se wp14">
+<w:document xmlns:wpc="http://schemas.microsoft.com/office/word/2010/wordprocessingCanvas" xmlns:cx="http://schemas.microsoft.com/office/drawing/2014/chartex" xmlns:cx1="http://schemas.microsoft.com/office/drawing/2015/9/8/chartex" xmlns:cx2="http://schemas.microsoft.com/office/drawing/2015/10/21/chartex" xmlns:cx3="http://schemas.microsoft.com/office/drawing/2016/5/9/chartex" xmlns:cx4="http://schemas.microsoft.com/office/drawing/2016/5/10/chartex" xmlns:cx5="http://schemas.microsoft.com/office/drawing/2016/5/11/chartex" xmlns:cx6="http://schemas.microsoft.com/office/drawing/2016/5/12/chartex" xmlns:cx7="http://schemas.microsoft.com/office/drawing/2016/5/13/chartex" xmlns:cx8="http://schemas.microsoft.com/office/drawing/2016/5/14/chartex" xmlns:mc="http://schemas.openxmlformats.org/markup-compatibility/2006" xmlns:aink="http://schemas.microsoft.com/office/drawing/2016/ink" xmlns:am3d="http://schemas.microsoft.com/office/drawing/2017/model3d" xmlns:o="urn:schemas-microsoft-com:office:office" xmlns:oel="http://schemas.microsoft.com/office/2019/extlst" xmlns:r="http://schemas.openxmlformats.org/officeDocument/2006/relationships" xmlns:m="http://schemas.openxmlformats.org/officeDocument/2006/math" xmlns:v="urn:schemas-microsoft-com:vml" xmlns:wp14="http://schemas.microsoft.com/office/word/2010/wordprocessingDrawing" xmlns:wp="http://schemas.openxmlformats.org/drawingml/2006/wordprocessingDrawing" xmlns:w10="urn:schemas-microsoft-com:office:word" xmlns:w="http://schemas.openxmlformats.org/wordprocessingml/2006/main" xmlns:w14="http://schemas.microsoft.com/office/word/2010/wordml" xmlns:w15="http://schemas.microsoft.com/office/word/2012/wordml" xmlns:w16cex="http://schemas.microsoft.com/office/word/2018/wordml/cex" xmlns:w16cid="http://schemas.microsoft.com/office/word/2016/wordml/cid" xmlns:w16="http://schemas.microsoft.com/office/word/2018/wordml" xmlns:w16du="http://schemas.microsoft.com/office/word/2023/wordml/word16du" xmlns:w16sdtdh="http://schemas.microsoft.com/office/word/2020/wordml/sdtdatahash" xmlns:w16sdtfl="http://schemas.microsoft.com/office/word/2024/wordml/sdtformatlock" xmlns:w16se="http://schemas.microsoft.com/office/word/2015/wordml/symex" xmlns:wpg="http://schemas.microsoft.com/office/word/2010/wordprocessingGroup" xmlns:wpi="http://schemas.microsoft.com/office/word/2010/wordprocessingInk" xmlns:wne="http://schemas.microsoft.com/office/word/2006/wordml" xmlns:wps="http://schemas.microsoft.com/office/word/2010/wordprocessingShape" mc:Ignorable="w14 w15 w16se w16cid w16 w16cex w16sdtdh w16sdtfl w16du wp14">
   <w:body>
     <w:p>
       <w:pPr>
@@ -12,12 +12,16 @@
         <w:rPr>
           <w:rFonts w:ascii="Garamond" w:hAnsi="Garamond"/>
           <w:b/>
+          <w:sz w:val="20"/>
+          <w:szCs w:val="20"/>
         </w:rPr>
       </w:pPr>
       <w:r>
         <w:rPr>
           <w:rFonts w:ascii="Garamond" w:hAnsi="Garamond"/>
           <w:b/>
+          <w:sz w:val="20"/>
+          <w:szCs w:val="20"/>
         </w:rPr>
         <w:t>TÉRMINOS DE REFERENCIA</w:t>
       </w:r>
@@ -29,8 +33,6 @@
         <w:rPr>
           <w:rFonts w:ascii="Garamond" w:hAnsi="Garamond"/>
           <w:b/>
-          <w:sz w:val="22"/>
-          <w:szCs w:val="22"/>
         </w:rPr>
       </w:pPr>
     </w:p>
@@ -49,6 +51,8 @@
         <w:rPr>
           <w:rFonts w:ascii="Garamond" w:hAnsi="Garamond"/>
           <w:b/>
+          <w:sz w:val="20"/>
+          <w:szCs w:val="20"/>
         </w:rPr>
       </w:pPr>
       <w:r>
@@ -56,6 +60,8 @@
           <w:rFonts w:ascii="Garamond" w:hAnsi="Garamond"/>
           <w:b/>
           <w:spacing w:val="-2"/>
+          <w:sz w:val="20"/>
+          <w:szCs w:val="20"/>
         </w:rPr>
         <w:t>ÁREA</w:t>
       </w:r>
@@ -64,6 +70,8 @@
           <w:rFonts w:ascii="Garamond" w:hAnsi="Garamond"/>
           <w:b/>
           <w:spacing w:val="-8"/>
+          <w:sz w:val="20"/>
+          <w:szCs w:val="20"/>
         </w:rPr>
         <w:t xml:space="preserve"> </w:t>
       </w:r>
@@ -72,6 +80,8 @@
           <w:rFonts w:ascii="Garamond" w:hAnsi="Garamond"/>
           <w:b/>
           <w:spacing w:val="-2"/>
+          <w:sz w:val="20"/>
+          <w:szCs w:val="20"/>
         </w:rPr>
         <w:t>USUARIA:</w:t>
       </w:r>
@@ -116,15 +126,11 @@
         <w:ind w:left="0"/>
         <w:rPr>
           <w:rFonts w:ascii="Garamond" w:hAnsi="Garamond"/>
-          <w:sz w:val="22"/>
-          <w:szCs w:val="22"/>
-        </w:rPr>
-      </w:pPr>
-      <w:r>
-        <w:rPr>
-          <w:rFonts w:ascii="Garamond" w:hAnsi="Garamond"/>
-          <w:sz w:val="22"/>
-          <w:szCs w:val="22"/>
+        </w:rPr>
+      </w:pPr>
+      <w:r>
+        <w:rPr>
+          <w:rFonts w:ascii="Garamond" w:hAnsi="Garamond"/>
         </w:rPr>
         <w:t>OBJETO</w:t>
       </w:r>
@@ -132,16 +138,12 @@
         <w:rPr>
           <w:rFonts w:ascii="Garamond" w:hAnsi="Garamond"/>
           <w:spacing w:val="-13"/>
-          <w:sz w:val="22"/>
-          <w:szCs w:val="22"/>
-        </w:rPr>
-        <w:t xml:space="preserve"> </w:t>
-      </w:r>
-      <w:r>
-        <w:rPr>
-          <w:rFonts w:ascii="Garamond" w:hAnsi="Garamond"/>
-          <w:sz w:val="22"/>
-          <w:szCs w:val="22"/>
+        </w:rPr>
+        <w:t xml:space="preserve"> </w:t>
+      </w:r>
+      <w:r>
+        <w:rPr>
+          <w:rFonts w:ascii="Garamond" w:hAnsi="Garamond"/>
         </w:rPr>
         <w:t>DEL</w:t>
       </w:r>
@@ -149,8 +151,6 @@
         <w:rPr>
           <w:rFonts w:ascii="Garamond" w:hAnsi="Garamond"/>
           <w:spacing w:val="-11"/>
-          <w:sz w:val="22"/>
-          <w:szCs w:val="22"/>
         </w:rPr>
         <w:t xml:space="preserve"> </w:t>
       </w:r>
@@ -158,8 +158,6 @@
         <w:rPr>
           <w:rFonts w:ascii="Garamond" w:hAnsi="Garamond"/>
           <w:spacing w:val="-2"/>
-          <w:sz w:val="22"/>
-          <w:szCs w:val="22"/>
         </w:rPr>
         <w:t>SERVICIO:</w:t>
       </w:r>
@@ -207,8 +205,6 @@
         <w:ind w:left="0"/>
         <w:rPr>
           <w:rFonts w:ascii="Garamond" w:hAnsi="Garamond"/>
-          <w:sz w:val="22"/>
-          <w:szCs w:val="22"/>
         </w:rPr>
       </w:pPr>
       <w:bookmarkStart w:id="1" w:name="III._FINALIDAD_PÚBLICA:"/>
@@ -217,8 +213,6 @@
         <w:rPr>
           <w:rFonts w:ascii="Garamond" w:hAnsi="Garamond"/>
           <w:spacing w:val="-2"/>
-          <w:sz w:val="22"/>
-          <w:szCs w:val="22"/>
         </w:rPr>
         <w:t>FINALIDAD</w:t>
       </w:r>
@@ -226,8 +220,6 @@
         <w:rPr>
           <w:rFonts w:ascii="Garamond" w:hAnsi="Garamond"/>
           <w:spacing w:val="-6"/>
-          <w:sz w:val="22"/>
-          <w:szCs w:val="22"/>
         </w:rPr>
         <w:t xml:space="preserve"> </w:t>
       </w:r>
@@ -235,8 +227,6 @@
         <w:rPr>
           <w:rFonts w:ascii="Garamond" w:hAnsi="Garamond"/>
           <w:spacing w:val="-2"/>
-          <w:sz w:val="22"/>
-          <w:szCs w:val="22"/>
         </w:rPr>
         <w:t>PÚBLICA:</w:t>
       </w:r>
@@ -260,8 +250,6 @@
         </w:rPr>
         <w:t>finalidad_publica</w:t>
       </w:r>
-      <w:bookmarkStart w:id="3" w:name="_GoBack"/>
-      <w:bookmarkEnd w:id="3"/>
       <w:proofErr w:type="spellEnd"/>
     </w:p>
     <w:p>
@@ -270,8 +258,6 @@
         <w:spacing w:line="276" w:lineRule="auto"/>
         <w:rPr>
           <w:rFonts w:ascii="Garamond" w:hAnsi="Garamond"/>
-          <w:sz w:val="22"/>
-          <w:szCs w:val="22"/>
         </w:rPr>
       </w:pPr>
     </w:p>
@@ -289,16 +275,12 @@
         <w:ind w:left="0"/>
         <w:rPr>
           <w:rFonts w:ascii="Garamond" w:hAnsi="Garamond"/>
-          <w:sz w:val="22"/>
-          <w:szCs w:val="22"/>
         </w:rPr>
       </w:pPr>
       <w:r>
         <w:rPr>
           <w:rFonts w:ascii="Garamond" w:hAnsi="Garamond"/>
           <w:spacing w:val="-2"/>
-          <w:sz w:val="22"/>
-          <w:szCs w:val="22"/>
         </w:rPr>
         <w:t>PERFIL</w:t>
       </w:r>
@@ -306,8 +288,6 @@
         <w:rPr>
           <w:rFonts w:ascii="Garamond" w:hAnsi="Garamond"/>
           <w:spacing w:val="1"/>
-          <w:sz w:val="22"/>
-          <w:szCs w:val="22"/>
         </w:rPr>
         <w:t xml:space="preserve"> </w:t>
       </w:r>
@@ -315,8 +295,6 @@
         <w:rPr>
           <w:rFonts w:ascii="Garamond" w:hAnsi="Garamond"/>
           <w:spacing w:val="-2"/>
-          <w:sz w:val="22"/>
-          <w:szCs w:val="22"/>
         </w:rPr>
         <w:t>REQERIDO:</w:t>
       </w:r>
@@ -359,6 +337,8 @@
               <w:rPr>
                 <w:rFonts w:ascii="Garamond" w:hAnsi="Garamond"/>
                 <w:b/>
+                <w:sz w:val="20"/>
+                <w:szCs w:val="20"/>
               </w:rPr>
             </w:pPr>
             <w:r>
@@ -366,6 +346,8 @@
                 <w:rFonts w:ascii="Garamond" w:hAnsi="Garamond"/>
                 <w:b/>
                 <w:w w:val="105"/>
+                <w:sz w:val="20"/>
+                <w:szCs w:val="20"/>
               </w:rPr>
               <w:t>REQUISITOS</w:t>
             </w:r>
@@ -385,6 +367,8 @@
               <w:rPr>
                 <w:rFonts w:ascii="Garamond" w:hAnsi="Garamond"/>
                 <w:b/>
+                <w:sz w:val="20"/>
+                <w:szCs w:val="20"/>
               </w:rPr>
             </w:pPr>
             <w:r>
@@ -392,6 +376,8 @@
                 <w:rFonts w:ascii="Garamond" w:hAnsi="Garamond"/>
                 <w:b/>
                 <w:w w:val="105"/>
+                <w:sz w:val="20"/>
+                <w:szCs w:val="20"/>
               </w:rPr>
               <w:t>DETALLE</w:t>
             </w:r>
@@ -691,6 +677,8 @@
         <w:rPr>
           <w:rFonts w:ascii="Garamond" w:hAnsi="Garamond"/>
           <w:b/>
+          <w:sz w:val="20"/>
+          <w:szCs w:val="20"/>
         </w:rPr>
       </w:pPr>
     </w:p>
@@ -702,82 +690,129 @@
           <w:numId w:val="2"/>
         </w:numPr>
         <w:tabs>
-          <w:tab w:val="left" w:pos="567"/>
-        </w:tabs>
-        <w:spacing w:before="0" w:line="276" w:lineRule="auto"/>
-        <w:ind w:left="0"/>
-        <w:rPr>
-          <w:rFonts w:ascii="Garamond" w:hAnsi="Garamond"/>
-          <w:b/>
-        </w:rPr>
-      </w:pPr>
-      <w:r>
+          <w:tab w:val="left" w:pos="0"/>
+        </w:tabs>
+        <w:spacing w:before="151"/>
+        <w:ind w:hanging="1004"/>
         <w:rPr>
           <w:rFonts w:ascii="Garamond" w:hAnsi="Garamond"/>
           <w:b/>
           <w:spacing w:val="-2"/>
-        </w:rPr>
-        <w:t>ACTIVIDADES A</w:t>
-      </w:r>
-      <w:r>
-        <w:rPr>
-          <w:rFonts w:ascii="Garamond" w:hAnsi="Garamond"/>
-          <w:b/>
-          <w:spacing w:val="-8"/>
-        </w:rPr>
-        <w:t xml:space="preserve"> </w:t>
-      </w:r>
+          <w:sz w:val="20"/>
+          <w:szCs w:val="20"/>
+        </w:rPr>
+      </w:pPr>
       <w:r>
         <w:rPr>
           <w:rFonts w:ascii="Garamond" w:hAnsi="Garamond"/>
           <w:b/>
           <w:spacing w:val="-2"/>
-        </w:rPr>
-        <w:t>REALIZAR:</w:t>
-      </w:r>
-    </w:p>
-    <w:p>
-      <w:pPr>
-        <w:pStyle w:val="Prrafodelista"/>
-        <w:tabs>
-          <w:tab w:val="left" w:pos="567"/>
-        </w:tabs>
-        <w:spacing w:before="0" w:line="276" w:lineRule="auto"/>
-        <w:ind w:left="0" w:firstLine="0"/>
-        <w:rPr>
-          <w:rFonts w:ascii="Garamond" w:hAnsi="Garamond"/>
           <w:sz w:val="20"/>
           <w:szCs w:val="20"/>
         </w:rPr>
-      </w:pPr>
-      <w:proofErr w:type="spellStart"/>
-      <w:r>
-        <w:rPr>
-          <w:rFonts w:ascii="Garamond" w:hAnsi="Garamond"/>
+        <w:t>REQUISITOS MINIMOS QUE DEBE DE CUMPLIR EL CONTRATISTA:</w:t>
+      </w:r>
+    </w:p>
+    <w:p>
+      <w:pPr>
+        <w:pStyle w:val="Textoindependiente"/>
+        <w:numPr>
+          <w:ilvl w:val="0"/>
+          <w:numId w:val="3"/>
+        </w:numPr>
+        <w:tabs>
+          <w:tab w:val="left" w:pos="284"/>
+        </w:tabs>
+        <w:spacing w:before="3"/>
+        <w:ind w:left="284" w:right="69" w:hanging="284"/>
+        <w:rPr>
+          <w:rFonts w:ascii="Garamond" w:eastAsia="Arial" w:hAnsi="Garamond" w:cs="Arial"/>
+          <w:bCs/>
+          <w:spacing w:val="-2"/>
+        </w:rPr>
+      </w:pPr>
+      <w:r>
+        <w:rPr>
+          <w:rFonts w:ascii="Garamond" w:eastAsia="Arial" w:hAnsi="Garamond" w:cs="Arial"/>
+          <w:bCs/>
+          <w:spacing w:val="-2"/>
+        </w:rPr>
+        <w:t>Contar con registro único de contribuyentes (RUC): Vigente, con estado de contribuyente activo y condición de contribuyente habido</w:t>
+      </w:r>
+    </w:p>
+    <w:p>
+      <w:pPr>
+        <w:pStyle w:val="Textoindependiente"/>
+        <w:numPr>
+          <w:ilvl w:val="0"/>
+          <w:numId w:val="3"/>
+        </w:numPr>
+        <w:tabs>
+          <w:tab w:val="left" w:pos="284"/>
+        </w:tabs>
+        <w:spacing w:before="3"/>
+        <w:ind w:left="284" w:right="69" w:hanging="284"/>
+        <w:rPr>
+          <w:rFonts w:ascii="Garamond" w:eastAsia="Arial" w:hAnsi="Garamond" w:cs="Arial"/>
+          <w:bCs/>
+          <w:spacing w:val="-2"/>
+        </w:rPr>
+      </w:pPr>
+      <w:r>
+        <w:rPr>
+          <w:rFonts w:ascii="Garamond" w:eastAsia="Arial" w:hAnsi="Garamond" w:cs="Arial"/>
+          <w:bCs/>
+          <w:spacing w:val="-2"/>
+        </w:rPr>
+        <w:t>Contar con registro nacional de proveedores (RNP): Vigente (servicios). para montos mayores a 1 UIT. (De ser el caso).</w:t>
+      </w:r>
+    </w:p>
+    <w:p>
+      <w:pPr>
+        <w:pStyle w:val="Textoindependiente"/>
+        <w:numPr>
+          <w:ilvl w:val="0"/>
+          <w:numId w:val="3"/>
+        </w:numPr>
+        <w:tabs>
+          <w:tab w:val="left" w:pos="284"/>
+        </w:tabs>
+        <w:spacing w:before="1"/>
+        <w:ind w:left="993" w:right="69" w:hanging="993"/>
+        <w:rPr>
+          <w:rFonts w:ascii="Garamond" w:eastAsia="Arial" w:hAnsi="Garamond" w:cs="Arial"/>
+          <w:bCs/>
+          <w:spacing w:val="-2"/>
+        </w:rPr>
+      </w:pPr>
+      <w:r>
+        <w:rPr>
+          <w:rFonts w:ascii="Garamond" w:eastAsia="Arial" w:hAnsi="Garamond" w:cs="Arial"/>
+          <w:bCs/>
+          <w:spacing w:val="-2"/>
+        </w:rPr>
+        <w:t>No estar inhabilitado para contratar con el estado.</w:t>
+      </w:r>
+    </w:p>
+    <w:p>
+      <w:pPr>
+        <w:pStyle w:val="Prrafodelista"/>
+        <w:tabs>
+          <w:tab w:val="left" w:pos="567"/>
+        </w:tabs>
+        <w:spacing w:before="0" w:line="276" w:lineRule="auto"/>
+        <w:ind w:left="0" w:firstLine="0"/>
+        <w:rPr>
+          <w:rFonts w:ascii="Garamond" w:hAnsi="Garamond"/>
+          <w:b/>
           <w:sz w:val="20"/>
           <w:szCs w:val="20"/>
         </w:rPr>
-        <w:t>actividades_admin</w:t>
-      </w:r>
-      <w:proofErr w:type="spellEnd"/>
+      </w:pPr>
     </w:p>
     <w:p>
       <w:pPr>
         <w:pStyle w:val="Prrafodelista"/>
-        <w:tabs>
-          <w:tab w:val="left" w:pos="567"/>
-        </w:tabs>
-        <w:spacing w:before="0" w:line="276" w:lineRule="auto"/>
-        <w:ind w:left="0" w:firstLine="0"/>
-        <w:rPr>
-          <w:rFonts w:ascii="Garamond" w:hAnsi="Garamond"/>
-          <w:b/>
-        </w:rPr>
-      </w:pPr>
-    </w:p>
-    <w:p>
-      <w:pPr>
-        <w:pStyle w:val="Ttulo1"/>
         <w:numPr>
           <w:ilvl w:val="0"/>
           <w:numId w:val="2"/>
@@ -789,94 +824,92 @@
         <w:ind w:left="0"/>
         <w:rPr>
           <w:rFonts w:ascii="Garamond" w:hAnsi="Garamond"/>
-          <w:sz w:val="22"/>
-          <w:szCs w:val="22"/>
-        </w:rPr>
-      </w:pPr>
-      <w:r>
-        <w:rPr>
-          <w:rFonts w:ascii="Garamond" w:hAnsi="Garamond"/>
+          <w:b/>
+          <w:sz w:val="20"/>
+          <w:szCs w:val="20"/>
+        </w:rPr>
+      </w:pPr>
+      <w:proofErr w:type="gramStart"/>
+      <w:r>
+        <w:rPr>
+          <w:rFonts w:ascii="Garamond" w:hAnsi="Garamond"/>
+          <w:b/>
           <w:spacing w:val="-2"/>
-          <w:sz w:val="22"/>
-          <w:szCs w:val="22"/>
-        </w:rPr>
-        <w:t>MODALIDAD</w:t>
-      </w:r>
-      <w:r>
-        <w:rPr>
-          <w:rFonts w:ascii="Garamond" w:hAnsi="Garamond"/>
-          <w:spacing w:val="-6"/>
-          <w:sz w:val="22"/>
-          <w:szCs w:val="22"/>
-        </w:rPr>
-        <w:t xml:space="preserve"> </w:t>
-      </w:r>
-      <w:r>
-        <w:rPr>
-          <w:rFonts w:ascii="Garamond" w:hAnsi="Garamond"/>
+          <w:sz w:val="20"/>
+          <w:szCs w:val="20"/>
+        </w:rPr>
+        <w:t>ACTIVIDADES A</w:t>
+      </w:r>
+      <w:r>
+        <w:rPr>
+          <w:rFonts w:ascii="Garamond" w:hAnsi="Garamond"/>
+          <w:b/>
+          <w:spacing w:val="-8"/>
+          <w:sz w:val="20"/>
+          <w:szCs w:val="20"/>
+        </w:rPr>
+        <w:t xml:space="preserve"> </w:t>
+      </w:r>
+      <w:r>
+        <w:rPr>
+          <w:rFonts w:ascii="Garamond" w:hAnsi="Garamond"/>
+          <w:b/>
           <w:spacing w:val="-2"/>
-          <w:sz w:val="22"/>
-          <w:szCs w:val="22"/>
-        </w:rPr>
-        <w:t>DEL</w:t>
-      </w:r>
-      <w:r>
-        <w:rPr>
-          <w:rFonts w:ascii="Garamond" w:hAnsi="Garamond"/>
-          <w:spacing w:val="-3"/>
-          <w:sz w:val="22"/>
-          <w:szCs w:val="22"/>
-        </w:rPr>
-        <w:t xml:space="preserve"> </w:t>
-      </w:r>
-      <w:r>
-        <w:rPr>
-          <w:rFonts w:ascii="Garamond" w:hAnsi="Garamond"/>
+          <w:sz w:val="20"/>
+          <w:szCs w:val="20"/>
+        </w:rPr>
+        <w:t>REALIZAR</w:t>
+      </w:r>
+      <w:proofErr w:type="gramEnd"/>
+      <w:r>
+        <w:rPr>
+          <w:rFonts w:ascii="Garamond" w:hAnsi="Garamond"/>
+          <w:b/>
           <w:spacing w:val="-2"/>
-          <w:sz w:val="22"/>
-          <w:szCs w:val="22"/>
-        </w:rPr>
-        <w:t>SERVICIO:</w:t>
-      </w:r>
-    </w:p>
-    <w:p>
-      <w:pPr>
-        <w:pStyle w:val="Ttulo1"/>
-        <w:tabs>
-          <w:tab w:val="left" w:pos="567"/>
-        </w:tabs>
-        <w:spacing w:before="0" w:line="276" w:lineRule="auto"/>
-        <w:ind w:left="0" w:firstLine="0"/>
-        <w:rPr>
-          <w:rFonts w:ascii="Garamond" w:hAnsi="Garamond"/>
-          <w:b w:val="0"/>
-          <w:spacing w:val="-2"/>
+          <w:sz w:val="20"/>
+          <w:szCs w:val="20"/>
+        </w:rPr>
+        <w:t>:</w:t>
+      </w:r>
+    </w:p>
+    <w:p>
+      <w:pPr>
+        <w:pStyle w:val="Prrafodelista"/>
+        <w:tabs>
+          <w:tab w:val="left" w:pos="567"/>
+        </w:tabs>
+        <w:spacing w:before="0" w:line="276" w:lineRule="auto"/>
+        <w:ind w:left="0" w:firstLine="0"/>
+        <w:rPr>
+          <w:rFonts w:ascii="Garamond" w:hAnsi="Garamond"/>
+          <w:sz w:val="20"/>
+          <w:szCs w:val="20"/>
         </w:rPr>
       </w:pPr>
       <w:proofErr w:type="spellStart"/>
       <w:r>
         <w:rPr>
           <w:rFonts w:ascii="Garamond" w:hAnsi="Garamond"/>
-          <w:b w:val="0"/>
-          <w:spacing w:val="-2"/>
-        </w:rPr>
-        <w:t>modalidad_servicio</w:t>
+          <w:sz w:val="20"/>
+          <w:szCs w:val="20"/>
+        </w:rPr>
+        <w:t>actividades_docentes</w:t>
       </w:r>
       <w:proofErr w:type="spellEnd"/>
     </w:p>
     <w:p>
       <w:pPr>
-        <w:pStyle w:val="Ttulo1"/>
-        <w:tabs>
-          <w:tab w:val="left" w:pos="567"/>
-        </w:tabs>
-        <w:spacing w:before="0" w:line="276" w:lineRule="auto"/>
-        <w:ind w:left="0" w:firstLine="0"/>
-        <w:rPr>
-          <w:rFonts w:ascii="Garamond" w:hAnsi="Garamond"/>
-          <w:b w:val="0"/>
-          <w:sz w:val="22"/>
-          <w:szCs w:val="22"/>
+        <w:pStyle w:val="Prrafodelista"/>
+        <w:tabs>
+          <w:tab w:val="left" w:pos="567"/>
+        </w:tabs>
+        <w:spacing w:before="0" w:line="276" w:lineRule="auto"/>
+        <w:ind w:left="0" w:firstLine="0"/>
+        <w:rPr>
+          <w:rFonts w:ascii="Garamond" w:hAnsi="Garamond"/>
+          <w:b/>
+          <w:sz w:val="20"/>
+          <w:szCs w:val="20"/>
         </w:rPr>
       </w:pPr>
     </w:p>
@@ -891,80 +924,36 @@
           <w:tab w:val="left" w:pos="567"/>
         </w:tabs>
         <w:spacing w:before="0" w:line="276" w:lineRule="auto"/>
-        <w:ind w:left="0"/>
-        <w:rPr>
-          <w:rFonts w:ascii="Garamond" w:hAnsi="Garamond"/>
-          <w:sz w:val="22"/>
-          <w:szCs w:val="22"/>
-        </w:rPr>
-      </w:pPr>
-      <w:bookmarkStart w:id="4" w:name="VII._LUGAR_DE_PRESTACIÓN_DEL_SERVICIO:"/>
-      <w:bookmarkEnd w:id="4"/>
-      <w:r>
-        <w:rPr>
-          <w:rFonts w:ascii="Garamond" w:hAnsi="Garamond"/>
-          <w:sz w:val="22"/>
-          <w:szCs w:val="22"/>
-        </w:rPr>
-        <w:t>LUGAR</w:t>
-      </w:r>
-      <w:r>
-        <w:rPr>
-          <w:rFonts w:ascii="Garamond" w:hAnsi="Garamond"/>
-          <w:spacing w:val="-16"/>
-          <w:sz w:val="22"/>
-          <w:szCs w:val="22"/>
-        </w:rPr>
-        <w:t xml:space="preserve"> </w:t>
-      </w:r>
-      <w:r>
-        <w:rPr>
-          <w:rFonts w:ascii="Garamond" w:hAnsi="Garamond"/>
-          <w:sz w:val="22"/>
-          <w:szCs w:val="22"/>
-        </w:rPr>
-        <w:t>DE</w:t>
-      </w:r>
-      <w:r>
-        <w:rPr>
-          <w:rFonts w:ascii="Garamond" w:hAnsi="Garamond"/>
-          <w:spacing w:val="-12"/>
-          <w:sz w:val="22"/>
-          <w:szCs w:val="22"/>
-        </w:rPr>
-        <w:t xml:space="preserve"> </w:t>
-      </w:r>
-      <w:r>
-        <w:rPr>
-          <w:rFonts w:ascii="Garamond" w:hAnsi="Garamond"/>
-          <w:sz w:val="22"/>
-          <w:szCs w:val="22"/>
-        </w:rPr>
-        <w:t>PRESTACIÓN</w:t>
-      </w:r>
-      <w:r>
-        <w:rPr>
-          <w:rFonts w:ascii="Garamond" w:hAnsi="Garamond"/>
-          <w:spacing w:val="-11"/>
-          <w:sz w:val="22"/>
-          <w:szCs w:val="22"/>
-        </w:rPr>
-        <w:t xml:space="preserve"> </w:t>
-      </w:r>
-      <w:r>
-        <w:rPr>
-          <w:rFonts w:ascii="Garamond" w:hAnsi="Garamond"/>
-          <w:sz w:val="22"/>
-          <w:szCs w:val="22"/>
+        <w:ind w:left="0" w:hanging="567"/>
+        <w:rPr>
+          <w:rFonts w:ascii="Garamond" w:hAnsi="Garamond"/>
+        </w:rPr>
+      </w:pPr>
+      <w:r>
+        <w:rPr>
+          <w:rFonts w:ascii="Garamond" w:hAnsi="Garamond"/>
+          <w:spacing w:val="-2"/>
+        </w:rPr>
+        <w:t>MODALIDAD</w:t>
+      </w:r>
+      <w:r>
+        <w:rPr>
+          <w:rFonts w:ascii="Garamond" w:hAnsi="Garamond"/>
+          <w:spacing w:val="-6"/>
+        </w:rPr>
+        <w:t xml:space="preserve"> </w:t>
+      </w:r>
+      <w:r>
+        <w:rPr>
+          <w:rFonts w:ascii="Garamond" w:hAnsi="Garamond"/>
+          <w:spacing w:val="-2"/>
         </w:rPr>
         <w:t>DEL</w:t>
       </w:r>
       <w:r>
         <w:rPr>
           <w:rFonts w:ascii="Garamond" w:hAnsi="Garamond"/>
-          <w:spacing w:val="-10"/>
-          <w:sz w:val="22"/>
-          <w:szCs w:val="22"/>
+          <w:spacing w:val="-3"/>
         </w:rPr>
         <w:t xml:space="preserve"> </w:t>
       </w:r>
@@ -972,13 +961,9 @@
         <w:rPr>
           <w:rFonts w:ascii="Garamond" w:hAnsi="Garamond"/>
           <w:spacing w:val="-2"/>
-          <w:sz w:val="22"/>
-          <w:szCs w:val="22"/>
         </w:rPr>
         <w:t>SERVICIO:</w:t>
       </w:r>
-      <w:bookmarkStart w:id="5" w:name="VIII._PLAZO_DEL_SERVICIO:"/>
-      <w:bookmarkEnd w:id="5"/>
     </w:p>
     <w:p>
       <w:pPr>
@@ -994,118 +979,28 @@
           <w:spacing w:val="-2"/>
         </w:rPr>
       </w:pPr>
-      <w:r>
-        <w:rPr>
-          <w:rFonts w:ascii="Garamond" w:hAnsi="Garamond"/>
-          <w:b w:val="0"/>
-        </w:rPr>
-        <w:t>UNMSM</w:t>
-      </w:r>
-      <w:r>
-        <w:rPr>
-          <w:rFonts w:ascii="Garamond" w:hAnsi="Garamond"/>
-          <w:b w:val="0"/>
-          <w:spacing w:val="-10"/>
-        </w:rPr>
-        <w:t xml:space="preserve"> </w:t>
-      </w:r>
-      <w:r>
-        <w:rPr>
-          <w:rFonts w:ascii="Garamond" w:hAnsi="Garamond"/>
-          <w:b w:val="0"/>
-        </w:rPr>
-        <w:t>–</w:t>
-      </w:r>
-      <w:r>
-        <w:rPr>
-          <w:rFonts w:ascii="Garamond" w:hAnsi="Garamond"/>
-          <w:b w:val="0"/>
-          <w:spacing w:val="-10"/>
-        </w:rPr>
-        <w:t xml:space="preserve"> </w:t>
-      </w:r>
-      <w:r>
-        <w:rPr>
-          <w:rFonts w:ascii="Garamond" w:hAnsi="Garamond"/>
-          <w:b w:val="0"/>
-        </w:rPr>
-        <w:t>FLCH</w:t>
-      </w:r>
-      <w:r>
-        <w:rPr>
-          <w:rFonts w:ascii="Garamond" w:hAnsi="Garamond"/>
-          <w:b w:val="0"/>
-          <w:spacing w:val="-7"/>
-        </w:rPr>
-        <w:t xml:space="preserve"> </w:t>
-      </w:r>
-      <w:r>
-        <w:rPr>
-          <w:rFonts w:ascii="Garamond" w:hAnsi="Garamond"/>
-          <w:b w:val="0"/>
-        </w:rPr>
-        <w:t>–</w:t>
-      </w:r>
-      <w:r>
-        <w:rPr>
-          <w:rFonts w:ascii="Garamond" w:hAnsi="Garamond"/>
-          <w:b w:val="0"/>
-          <w:spacing w:val="-10"/>
-        </w:rPr>
-        <w:t xml:space="preserve"> </w:t>
-      </w:r>
-      <w:r>
-        <w:rPr>
-          <w:rFonts w:ascii="Garamond" w:hAnsi="Garamond"/>
-          <w:b w:val="0"/>
-        </w:rPr>
-        <w:t>Centro</w:t>
-      </w:r>
-      <w:r>
-        <w:rPr>
-          <w:rFonts w:ascii="Garamond" w:hAnsi="Garamond"/>
-          <w:b w:val="0"/>
-          <w:spacing w:val="-5"/>
-        </w:rPr>
-        <w:t xml:space="preserve"> </w:t>
-      </w:r>
-      <w:r>
-        <w:rPr>
-          <w:rFonts w:ascii="Garamond" w:hAnsi="Garamond"/>
-          <w:b w:val="0"/>
-        </w:rPr>
-        <w:t>de</w:t>
-      </w:r>
-      <w:r>
-        <w:rPr>
-          <w:rFonts w:ascii="Garamond" w:hAnsi="Garamond"/>
-          <w:b w:val="0"/>
-          <w:spacing w:val="-10"/>
-        </w:rPr>
-        <w:t xml:space="preserve"> </w:t>
-      </w:r>
+      <w:proofErr w:type="spellStart"/>
       <w:r>
         <w:rPr>
           <w:rFonts w:ascii="Garamond" w:hAnsi="Garamond"/>
           <w:b w:val="0"/>
           <w:spacing w:val="-2"/>
         </w:rPr>
-        <w:t>Idiomas</w:t>
-      </w:r>
-    </w:p>
-    <w:p>
-      <w:pPr>
-        <w:pStyle w:val="Ttulo1"/>
-        <w:tabs>
-          <w:tab w:val="left" w:pos="567"/>
-        </w:tabs>
-        <w:spacing w:before="0" w:line="276" w:lineRule="auto"/>
-        <w:ind w:left="0" w:firstLine="0"/>
-        <w:rPr>
-          <w:rFonts w:ascii="Garamond" w:hAnsi="Garamond"/>
-          <w:b w:val="0"/>
-          <w:sz w:val="22"/>
-          <w:szCs w:val="22"/>
+        <w:t>modalidad_servicio</w:t>
+      </w:r>
+      <w:proofErr w:type="spellEnd"/>
+    </w:p>
+    <w:p>
+      <w:pPr>
+        <w:pStyle w:val="Ttulo1"/>
+        <w:tabs>
+          <w:tab w:val="left" w:pos="567"/>
+        </w:tabs>
+        <w:spacing w:before="0" w:line="276" w:lineRule="auto"/>
+        <w:ind w:left="0" w:firstLine="0"/>
+        <w:rPr>
+          <w:rFonts w:ascii="Garamond" w:hAnsi="Garamond"/>
+          <w:b w:val="0"/>
         </w:rPr>
       </w:pPr>
     </w:p>
@@ -1120,138 +1015,199 @@
           <w:tab w:val="left" w:pos="567"/>
         </w:tabs>
         <w:spacing w:before="0" w:line="276" w:lineRule="auto"/>
-        <w:ind w:left="0"/>
-        <w:rPr>
-          <w:rFonts w:ascii="Garamond" w:hAnsi="Garamond"/>
-          <w:sz w:val="22"/>
-          <w:szCs w:val="22"/>
-        </w:rPr>
-      </w:pPr>
-      <w:r>
-        <w:rPr>
-          <w:rFonts w:ascii="Garamond" w:hAnsi="Garamond"/>
-          <w:sz w:val="22"/>
-          <w:szCs w:val="22"/>
-        </w:rPr>
-        <w:t>PLAZO</w:t>
-      </w:r>
-      <w:r>
-        <w:rPr>
-          <w:rFonts w:ascii="Garamond" w:hAnsi="Garamond"/>
-          <w:spacing w:val="-13"/>
-          <w:sz w:val="22"/>
-          <w:szCs w:val="22"/>
-        </w:rPr>
-        <w:t xml:space="preserve"> </w:t>
-      </w:r>
-      <w:r>
-        <w:rPr>
-          <w:rFonts w:ascii="Garamond" w:hAnsi="Garamond"/>
-          <w:sz w:val="22"/>
-          <w:szCs w:val="22"/>
+        <w:ind w:left="0" w:hanging="567"/>
+        <w:rPr>
+          <w:rFonts w:ascii="Garamond" w:hAnsi="Garamond"/>
+        </w:rPr>
+      </w:pPr>
+      <w:bookmarkStart w:id="3" w:name="VII._LUGAR_DE_PRESTACIÓN_DEL_SERVICIO:"/>
+      <w:bookmarkEnd w:id="3"/>
+      <w:r>
+        <w:rPr>
+          <w:rFonts w:ascii="Garamond" w:hAnsi="Garamond"/>
+        </w:rPr>
+        <w:t>LUGAR</w:t>
+      </w:r>
+      <w:r>
+        <w:rPr>
+          <w:rFonts w:ascii="Garamond" w:hAnsi="Garamond"/>
+          <w:spacing w:val="-16"/>
+        </w:rPr>
+        <w:t xml:space="preserve"> </w:t>
+      </w:r>
+      <w:r>
+        <w:rPr>
+          <w:rFonts w:ascii="Garamond" w:hAnsi="Garamond"/>
+        </w:rPr>
+        <w:t>DE</w:t>
+      </w:r>
+      <w:r>
+        <w:rPr>
+          <w:rFonts w:ascii="Garamond" w:hAnsi="Garamond"/>
+          <w:spacing w:val="-12"/>
+        </w:rPr>
+        <w:t xml:space="preserve"> </w:t>
+      </w:r>
+      <w:r>
+        <w:rPr>
+          <w:rFonts w:ascii="Garamond" w:hAnsi="Garamond"/>
+        </w:rPr>
+        <w:t>PRESTACIÓN</w:t>
+      </w:r>
+      <w:r>
+        <w:rPr>
+          <w:rFonts w:ascii="Garamond" w:hAnsi="Garamond"/>
+          <w:spacing w:val="-11"/>
+        </w:rPr>
+        <w:t xml:space="preserve"> </w:t>
+      </w:r>
+      <w:r>
+        <w:rPr>
+          <w:rFonts w:ascii="Garamond" w:hAnsi="Garamond"/>
         </w:rPr>
         <w:t>DEL</w:t>
       </w:r>
       <w:r>
         <w:rPr>
           <w:rFonts w:ascii="Garamond" w:hAnsi="Garamond"/>
+          <w:spacing w:val="-10"/>
+        </w:rPr>
+        <w:t xml:space="preserve"> </w:t>
+      </w:r>
+      <w:r>
+        <w:rPr>
+          <w:rFonts w:ascii="Garamond" w:hAnsi="Garamond"/>
+          <w:spacing w:val="-2"/>
+        </w:rPr>
+        <w:t>SERVICIO:</w:t>
+      </w:r>
+      <w:bookmarkStart w:id="4" w:name="VIII._PLAZO_DEL_SERVICIO:"/>
+      <w:bookmarkEnd w:id="4"/>
+    </w:p>
+    <w:p>
+      <w:pPr>
+        <w:pStyle w:val="Ttulo1"/>
+        <w:tabs>
+          <w:tab w:val="left" w:pos="567"/>
+        </w:tabs>
+        <w:spacing w:before="0" w:line="276" w:lineRule="auto"/>
+        <w:ind w:left="0" w:firstLine="0"/>
+        <w:rPr>
+          <w:rFonts w:ascii="Garamond" w:hAnsi="Garamond"/>
+          <w:b w:val="0"/>
+          <w:spacing w:val="-2"/>
+        </w:rPr>
+      </w:pPr>
+      <w:r>
+        <w:rPr>
+          <w:rFonts w:ascii="Garamond" w:hAnsi="Garamond"/>
+          <w:b w:val="0"/>
+        </w:rPr>
+        <w:t>UNMSM</w:t>
+      </w:r>
+      <w:r>
+        <w:rPr>
+          <w:rFonts w:ascii="Garamond" w:hAnsi="Garamond"/>
+          <w:b w:val="0"/>
+          <w:spacing w:val="-10"/>
+        </w:rPr>
+        <w:t xml:space="preserve"> </w:t>
+      </w:r>
+      <w:r>
+        <w:rPr>
+          <w:rFonts w:ascii="Garamond" w:hAnsi="Garamond"/>
+          <w:b w:val="0"/>
+        </w:rPr>
+        <w:t>–</w:t>
+      </w:r>
+      <w:r>
+        <w:rPr>
+          <w:rFonts w:ascii="Garamond" w:hAnsi="Garamond"/>
+          <w:b w:val="0"/>
+          <w:spacing w:val="-10"/>
+        </w:rPr>
+        <w:t xml:space="preserve"> </w:t>
+      </w:r>
+      <w:r>
+        <w:rPr>
+          <w:rFonts w:ascii="Garamond" w:hAnsi="Garamond"/>
+          <w:b w:val="0"/>
+        </w:rPr>
+        <w:t>FLCH</w:t>
+      </w:r>
+      <w:r>
+        <w:rPr>
+          <w:rFonts w:ascii="Garamond" w:hAnsi="Garamond"/>
+          <w:b w:val="0"/>
           <w:spacing w:val="-7"/>
-          <w:sz w:val="22"/>
-          <w:szCs w:val="22"/>
-        </w:rPr>
-        <w:t xml:space="preserve"> </w:t>
-      </w:r>
-      <w:r>
-        <w:rPr>
-          <w:rFonts w:ascii="Garamond" w:hAnsi="Garamond"/>
+        </w:rPr>
+        <w:t xml:space="preserve"> </w:t>
+      </w:r>
+      <w:r>
+        <w:rPr>
+          <w:rFonts w:ascii="Garamond" w:hAnsi="Garamond"/>
+          <w:b w:val="0"/>
+        </w:rPr>
+        <w:t>–</w:t>
+      </w:r>
+      <w:r>
+        <w:rPr>
+          <w:rFonts w:ascii="Garamond" w:hAnsi="Garamond"/>
+          <w:b w:val="0"/>
+          <w:spacing w:val="-10"/>
+        </w:rPr>
+        <w:t xml:space="preserve"> </w:t>
+      </w:r>
+      <w:r>
+        <w:rPr>
+          <w:rFonts w:ascii="Garamond" w:hAnsi="Garamond"/>
+          <w:b w:val="0"/>
+        </w:rPr>
+        <w:t>Centro</w:t>
+      </w:r>
+      <w:r>
+        <w:rPr>
+          <w:rFonts w:ascii="Garamond" w:hAnsi="Garamond"/>
+          <w:b w:val="0"/>
+          <w:spacing w:val="-5"/>
+        </w:rPr>
+        <w:t xml:space="preserve"> </w:t>
+      </w:r>
+      <w:r>
+        <w:rPr>
+          <w:rFonts w:ascii="Garamond" w:hAnsi="Garamond"/>
+          <w:b w:val="0"/>
+        </w:rPr>
+        <w:t>de</w:t>
+      </w:r>
+      <w:r>
+        <w:rPr>
+          <w:rFonts w:ascii="Garamond" w:hAnsi="Garamond"/>
+          <w:b w:val="0"/>
+          <w:spacing w:val="-10"/>
+        </w:rPr>
+        <w:t xml:space="preserve"> </w:t>
+      </w:r>
+      <w:r>
+        <w:rPr>
+          <w:rFonts w:ascii="Garamond" w:hAnsi="Garamond"/>
+          <w:b w:val="0"/>
           <w:spacing w:val="-2"/>
-          <w:sz w:val="22"/>
-          <w:szCs w:val="22"/>
-        </w:rPr>
-        <w:t>SERVICIO:</w:t>
-      </w:r>
-    </w:p>
-    <w:p>
-      <w:pPr>
-        <w:pStyle w:val="Ttulo1"/>
-        <w:tabs>
-          <w:tab w:val="left" w:pos="567"/>
-        </w:tabs>
-        <w:spacing w:before="0" w:line="276" w:lineRule="auto"/>
-        <w:ind w:left="0" w:firstLine="0"/>
-        <w:rPr>
-          <w:rFonts w:ascii="Garamond" w:hAnsi="Garamond"/>
-          <w:b w:val="0"/>
-          <w:spacing w:val="-2"/>
-        </w:rPr>
-      </w:pPr>
-      <w:r>
-        <w:rPr>
-          <w:rFonts w:ascii="Garamond" w:hAnsi="Garamond"/>
-          <w:b w:val="0"/>
-        </w:rPr>
-        <w:t>Hasta</w:t>
-      </w:r>
-      <w:r>
-        <w:rPr>
-          <w:rFonts w:ascii="Garamond" w:hAnsi="Garamond"/>
-          <w:b w:val="0"/>
-          <w:spacing w:val="-11"/>
-        </w:rPr>
-        <w:t xml:space="preserve"> </w:t>
-      </w:r>
-      <w:r>
-        <w:rPr>
-          <w:rFonts w:ascii="Garamond" w:hAnsi="Garamond"/>
-          <w:b w:val="0"/>
-        </w:rPr>
-        <w:t>8</w:t>
-      </w:r>
-      <w:r>
-        <w:rPr>
-          <w:rFonts w:ascii="Garamond" w:hAnsi="Garamond"/>
-          <w:b w:val="0"/>
-          <w:spacing w:val="-9"/>
-        </w:rPr>
-        <w:t xml:space="preserve"> </w:t>
-      </w:r>
-      <w:r>
-        <w:rPr>
-          <w:rFonts w:ascii="Garamond" w:hAnsi="Garamond"/>
-          <w:b w:val="0"/>
-        </w:rPr>
-        <w:t>días</w:t>
-      </w:r>
-      <w:r>
-        <w:rPr>
-          <w:rFonts w:ascii="Garamond" w:hAnsi="Garamond"/>
-          <w:b w:val="0"/>
-          <w:spacing w:val="-9"/>
-        </w:rPr>
-        <w:t xml:space="preserve"> </w:t>
-      </w:r>
-      <w:r>
-        <w:rPr>
-          <w:rFonts w:ascii="Garamond" w:hAnsi="Garamond"/>
-          <w:b w:val="0"/>
-          <w:spacing w:val="-2"/>
-        </w:rPr>
-        <w:t>calendarios</w:t>
-      </w:r>
-    </w:p>
-    <w:p>
-      <w:pPr>
-        <w:pStyle w:val="Ttulo1"/>
-        <w:tabs>
-          <w:tab w:val="left" w:pos="567"/>
-        </w:tabs>
-        <w:spacing w:before="0" w:line="276" w:lineRule="auto"/>
-        <w:ind w:left="0" w:firstLine="0"/>
-        <w:rPr>
-          <w:rFonts w:ascii="Garamond" w:hAnsi="Garamond"/>
-          <w:b w:val="0"/>
-          <w:sz w:val="22"/>
-          <w:szCs w:val="22"/>
+        </w:rPr>
+        <w:t>Idiomas</w:t>
+      </w:r>
+    </w:p>
+    <w:p>
+      <w:pPr>
+        <w:pStyle w:val="Ttulo1"/>
+        <w:tabs>
+          <w:tab w:val="left" w:pos="567"/>
+        </w:tabs>
+        <w:spacing w:before="0" w:line="276" w:lineRule="auto"/>
+        <w:ind w:left="0" w:firstLine="0"/>
+        <w:rPr>
+          <w:rFonts w:ascii="Garamond" w:hAnsi="Garamond"/>
+          <w:b w:val="0"/>
         </w:rPr>
       </w:pPr>
     </w:p>
@@ -1266,29 +1222,34 @@
           <w:tab w:val="left" w:pos="567"/>
         </w:tabs>
         <w:spacing w:before="0" w:line="276" w:lineRule="auto"/>
-        <w:ind w:left="0"/>
-        <w:rPr>
-          <w:rFonts w:ascii="Garamond" w:hAnsi="Garamond"/>
-          <w:sz w:val="22"/>
-          <w:szCs w:val="22"/>
-        </w:rPr>
-      </w:pPr>
-      <w:bookmarkStart w:id="6" w:name="IX._MONTO_REFERENCIAL:"/>
-      <w:bookmarkEnd w:id="6"/>
-      <w:r>
-        <w:rPr>
-          <w:rFonts w:ascii="Garamond" w:hAnsi="Garamond"/>
-          <w:sz w:val="22"/>
-          <w:szCs w:val="22"/>
-        </w:rPr>
-        <w:t>MONTO</w:t>
-      </w:r>
-      <w:r>
-        <w:rPr>
-          <w:rFonts w:ascii="Garamond" w:hAnsi="Garamond"/>
-          <w:spacing w:val="-12"/>
-          <w:sz w:val="22"/>
-          <w:szCs w:val="22"/>
+        <w:ind w:left="0" w:hanging="567"/>
+        <w:rPr>
+          <w:rFonts w:ascii="Garamond" w:hAnsi="Garamond"/>
+        </w:rPr>
+      </w:pPr>
+      <w:r>
+        <w:rPr>
+          <w:rFonts w:ascii="Garamond" w:hAnsi="Garamond"/>
+        </w:rPr>
+        <w:t>PLAZO</w:t>
+      </w:r>
+      <w:r>
+        <w:rPr>
+          <w:rFonts w:ascii="Garamond" w:hAnsi="Garamond"/>
+          <w:spacing w:val="-13"/>
+        </w:rPr>
+        <w:t xml:space="preserve"> </w:t>
+      </w:r>
+      <w:r>
+        <w:rPr>
+          <w:rFonts w:ascii="Garamond" w:hAnsi="Garamond"/>
+        </w:rPr>
+        <w:t>DEL</w:t>
+      </w:r>
+      <w:r>
+        <w:rPr>
+          <w:rFonts w:ascii="Garamond" w:hAnsi="Garamond"/>
+          <w:spacing w:val="-7"/>
         </w:rPr>
         <w:t xml:space="preserve"> </w:t>
       </w:r>
@@ -1296,70 +1257,90 @@
         <w:rPr>
           <w:rFonts w:ascii="Garamond" w:hAnsi="Garamond"/>
           <w:spacing w:val="-2"/>
-          <w:sz w:val="22"/>
-          <w:szCs w:val="22"/>
-        </w:rPr>
-        <w:t>REFERENCIAL:</w:t>
-      </w:r>
-    </w:p>
-    <w:p>
-      <w:pPr>
-        <w:pStyle w:val="Ttulo1"/>
-        <w:tabs>
-          <w:tab w:val="left" w:pos="567"/>
-        </w:tabs>
-        <w:spacing w:before="0" w:line="276" w:lineRule="auto"/>
-        <w:ind w:left="0" w:firstLine="0"/>
-        <w:rPr>
-          <w:rFonts w:ascii="Garamond" w:hAnsi="Garamond"/>
-          <w:b w:val="0"/>
-        </w:rPr>
-      </w:pPr>
-      <w:r>
-        <w:rPr>
-          <w:rFonts w:ascii="Garamond" w:hAnsi="Garamond"/>
-          <w:b w:val="0"/>
-          <w:bCs w:val="0"/>
-        </w:rPr>
-        <w:t>Monto del servicio:</w:t>
-      </w:r>
-      <w:r>
-        <w:rPr>
-          <w:rFonts w:ascii="Garamond" w:hAnsi="Garamond"/>
-        </w:rPr>
-        <w:t xml:space="preserve"> </w:t>
-      </w:r>
-      <w:proofErr w:type="spellStart"/>
-      <w:r>
-        <w:rPr>
-          <w:rFonts w:ascii="Garamond" w:hAnsi="Garamond"/>
-          <w:b w:val="0"/>
-          <w:bCs w:val="0"/>
-        </w:rPr>
-        <w:t>monto_subtotal</w:t>
-      </w:r>
-      <w:proofErr w:type="spellEnd"/>
-      <w:r>
-        <w:rPr>
-          <w:rFonts w:ascii="Garamond" w:hAnsi="Garamond"/>
-          <w:b w:val="0"/>
-        </w:rPr>
-        <w:t>. Incluye el impuesto y la contribución de ley.</w:t>
-      </w:r>
-    </w:p>
-    <w:p>
-      <w:pPr>
-        <w:pStyle w:val="Ttulo1"/>
-        <w:tabs>
-          <w:tab w:val="left" w:pos="567"/>
-        </w:tabs>
-        <w:spacing w:before="0" w:line="276" w:lineRule="auto"/>
-        <w:ind w:left="0" w:firstLine="0"/>
-        <w:rPr>
-          <w:rFonts w:ascii="Garamond" w:hAnsi="Garamond"/>
-          <w:b w:val="0"/>
-          <w:sz w:val="22"/>
-          <w:szCs w:val="22"/>
+        </w:rPr>
+        <w:t>SERVICIO:</w:t>
+      </w:r>
+    </w:p>
+    <w:p>
+      <w:pPr>
+        <w:pStyle w:val="Ttulo1"/>
+        <w:tabs>
+          <w:tab w:val="left" w:pos="567"/>
+        </w:tabs>
+        <w:spacing w:before="0" w:line="276" w:lineRule="auto"/>
+        <w:ind w:left="0" w:firstLine="0"/>
+        <w:rPr>
+          <w:rFonts w:ascii="Garamond" w:hAnsi="Garamond"/>
+          <w:b w:val="0"/>
+          <w:spacing w:val="-2"/>
+        </w:rPr>
+      </w:pPr>
+      <w:r>
+        <w:rPr>
+          <w:rFonts w:ascii="Garamond" w:hAnsi="Garamond"/>
+          <w:b w:val="0"/>
+        </w:rPr>
+        <w:t>Hasta</w:t>
+      </w:r>
+      <w:r>
+        <w:rPr>
+          <w:rFonts w:ascii="Garamond" w:hAnsi="Garamond"/>
+          <w:b w:val="0"/>
+          <w:spacing w:val="-11"/>
+        </w:rPr>
+        <w:t xml:space="preserve"> </w:t>
+      </w:r>
+      <w:r>
+        <w:rPr>
+          <w:rFonts w:ascii="Garamond" w:hAnsi="Garamond"/>
+          <w:b w:val="0"/>
+        </w:rPr>
+        <w:t>8</w:t>
+      </w:r>
+      <w:r>
+        <w:rPr>
+          <w:rFonts w:ascii="Garamond" w:hAnsi="Garamond"/>
+          <w:b w:val="0"/>
+          <w:spacing w:val="-9"/>
+        </w:rPr>
+        <w:t xml:space="preserve"> </w:t>
+      </w:r>
+      <w:r>
+        <w:rPr>
+          <w:rFonts w:ascii="Garamond" w:hAnsi="Garamond"/>
+          <w:b w:val="0"/>
+        </w:rPr>
+        <w:t>días</w:t>
+      </w:r>
+      <w:r>
+        <w:rPr>
+          <w:rFonts w:ascii="Garamond" w:hAnsi="Garamond"/>
+          <w:b w:val="0"/>
+          <w:spacing w:val="-9"/>
+        </w:rPr>
+        <w:t xml:space="preserve"> </w:t>
+      </w:r>
+      <w:r>
+        <w:rPr>
+          <w:rFonts w:ascii="Garamond" w:hAnsi="Garamond"/>
+          <w:b w:val="0"/>
+          <w:spacing w:val="-2"/>
+        </w:rPr>
+        <w:t>calendarios</w:t>
+      </w:r>
+    </w:p>
+    <w:p>
+      <w:pPr>
+        <w:pStyle w:val="Ttulo1"/>
+        <w:tabs>
+          <w:tab w:val="left" w:pos="567"/>
+        </w:tabs>
+        <w:spacing w:before="0" w:line="276" w:lineRule="auto"/>
+        <w:ind w:left="0" w:firstLine="0"/>
+        <w:rPr>
+          <w:rFonts w:ascii="Garamond" w:hAnsi="Garamond"/>
+          <w:b w:val="0"/>
+          <w:spacing w:val="-2"/>
         </w:rPr>
       </w:pPr>
     </w:p>
@@ -1374,19 +1355,908 @@
           <w:tab w:val="left" w:pos="567"/>
         </w:tabs>
         <w:spacing w:before="0" w:line="276" w:lineRule="auto"/>
-        <w:ind w:left="0"/>
-        <w:rPr>
-          <w:rFonts w:ascii="Garamond" w:hAnsi="Garamond"/>
-          <w:sz w:val="22"/>
-          <w:szCs w:val="22"/>
-        </w:rPr>
-      </w:pPr>
+        <w:ind w:left="0" w:hanging="567"/>
+        <w:rPr>
+          <w:rFonts w:ascii="Garamond" w:hAnsi="Garamond"/>
+        </w:rPr>
+      </w:pPr>
+      <w:r>
+        <w:rPr>
+          <w:rFonts w:ascii="Garamond" w:hAnsi="Garamond"/>
+        </w:rPr>
+        <w:t>PRODUCTO O ENTREGABLE</w:t>
+      </w:r>
+    </w:p>
+    <w:p>
+      <w:pPr>
+        <w:pStyle w:val="Ttulo1"/>
+        <w:tabs>
+          <w:tab w:val="left" w:pos="567"/>
+        </w:tabs>
+        <w:spacing w:before="0" w:line="276" w:lineRule="auto"/>
+        <w:ind w:left="0" w:firstLine="0"/>
+        <w:rPr>
+          <w:rFonts w:ascii="Garamond" w:hAnsi="Garamond"/>
+          <w:b w:val="0"/>
+          <w:bCs w:val="0"/>
+        </w:rPr>
+      </w:pPr>
+      <w:r>
+        <w:rPr>
+          <w:rFonts w:ascii="Garamond" w:hAnsi="Garamond"/>
+          <w:b w:val="0"/>
+          <w:bCs w:val="0"/>
+        </w:rPr>
+        <w:t>El contratista deberá entregar, ya sea a través de informe y/o documento desarrollado con motivo de la prestación del servicio mencionado precisando lo realizado en dicho documento, conforme a las actividades determinadas en el numeral VI.</w:t>
+      </w:r>
+    </w:p>
+    <w:p>
+      <w:pPr>
+        <w:pStyle w:val="Ttulo1"/>
+        <w:numPr>
+          <w:ilvl w:val="0"/>
+          <w:numId w:val="2"/>
+        </w:numPr>
+        <w:tabs>
+          <w:tab w:val="left" w:pos="567"/>
+        </w:tabs>
+        <w:spacing w:before="0" w:line="276" w:lineRule="auto"/>
+        <w:ind w:left="0" w:hanging="567"/>
+        <w:rPr>
+          <w:rFonts w:ascii="Garamond" w:hAnsi="Garamond"/>
+        </w:rPr>
+      </w:pPr>
+      <w:r>
+        <w:rPr>
+          <w:rFonts w:ascii="Garamond" w:hAnsi="Garamond"/>
+        </w:rPr>
+        <w:t>RECURSOS Y/O FACILIDADES A SER PROVISTOS POR LA FACULTAD</w:t>
+      </w:r>
+    </w:p>
+    <w:p>
+      <w:pPr>
+        <w:pStyle w:val="Ttulo1"/>
+        <w:tabs>
+          <w:tab w:val="left" w:pos="567"/>
+        </w:tabs>
+        <w:spacing w:before="0" w:line="276" w:lineRule="auto"/>
+        <w:ind w:left="0" w:firstLine="0"/>
+        <w:rPr>
+          <w:rFonts w:ascii="Garamond" w:hAnsi="Garamond"/>
+          <w:b w:val="0"/>
+          <w:bCs w:val="0"/>
+        </w:rPr>
+      </w:pPr>
+      <w:r>
+        <w:rPr>
+          <w:rFonts w:ascii="Garamond" w:hAnsi="Garamond"/>
+          <w:b w:val="0"/>
+          <w:bCs w:val="0"/>
+        </w:rPr>
+        <w:t>Para la ejecución del servicio contratado, la Facultad brindara al contratista los recursos y/o facilidades del caso, una vez terminado el servicio serán devueltos a la Facultad.</w:t>
+      </w:r>
+    </w:p>
+    <w:p>
+      <w:pPr>
+        <w:pStyle w:val="Ttulo1"/>
+        <w:tabs>
+          <w:tab w:val="left" w:pos="567"/>
+        </w:tabs>
+        <w:spacing w:before="0" w:line="276" w:lineRule="auto"/>
+        <w:ind w:left="0" w:firstLine="0"/>
+        <w:rPr>
+          <w:rFonts w:ascii="Garamond" w:hAnsi="Garamond"/>
+          <w:b w:val="0"/>
+          <w:bCs w:val="0"/>
+        </w:rPr>
+      </w:pPr>
+    </w:p>
+    <w:p>
+      <w:pPr>
+        <w:pStyle w:val="Ttulo1"/>
+        <w:numPr>
+          <w:ilvl w:val="0"/>
+          <w:numId w:val="2"/>
+        </w:numPr>
+        <w:tabs>
+          <w:tab w:val="left" w:pos="567"/>
+        </w:tabs>
+        <w:spacing w:before="0" w:line="276" w:lineRule="auto"/>
+        <w:ind w:left="0" w:hanging="567"/>
+        <w:rPr>
+          <w:rFonts w:ascii="Garamond" w:hAnsi="Garamond"/>
+        </w:rPr>
+      </w:pPr>
+      <w:r>
+        <w:rPr>
+          <w:rFonts w:ascii="Garamond" w:hAnsi="Garamond"/>
+        </w:rPr>
+        <w:t>CONFIDENCIALIDAD DE LA INFORMACIÓN.</w:t>
+      </w:r>
+    </w:p>
+    <w:p>
+      <w:pPr>
+        <w:pStyle w:val="Ttulo1"/>
+        <w:tabs>
+          <w:tab w:val="left" w:pos="567"/>
+        </w:tabs>
+        <w:spacing w:before="0" w:line="276" w:lineRule="auto"/>
+        <w:ind w:left="0" w:firstLine="0"/>
+        <w:rPr>
+          <w:rFonts w:ascii="Garamond" w:hAnsi="Garamond"/>
+          <w:b w:val="0"/>
+          <w:bCs w:val="0"/>
+        </w:rPr>
+      </w:pPr>
+      <w:r>
+        <w:rPr>
+          <w:rFonts w:ascii="Garamond" w:hAnsi="Garamond"/>
+          <w:b w:val="0"/>
+          <w:bCs w:val="0"/>
+        </w:rPr>
+        <w:t>Si como parte de la prestación, el proveedor pudiera tomar conocimiento e información (oral o escrita) de la Facultad, esta información debe mantenerse reservada, por tanto, el proveedor debe mantener la confidencialidad de esta. El compromiso de confidencialidad se prolonga aún después de terminada la contratación.</w:t>
+      </w:r>
+    </w:p>
+    <w:p>
+      <w:pPr>
+        <w:pStyle w:val="Ttulo1"/>
+        <w:tabs>
+          <w:tab w:val="left" w:pos="567"/>
+        </w:tabs>
+        <w:spacing w:before="0" w:line="276" w:lineRule="auto"/>
+        <w:ind w:left="0" w:firstLine="0"/>
+        <w:rPr>
+          <w:rFonts w:ascii="Garamond" w:hAnsi="Garamond"/>
+          <w:b w:val="0"/>
+          <w:bCs w:val="0"/>
+        </w:rPr>
+      </w:pPr>
+      <w:r>
+        <w:rPr>
+          <w:rFonts w:ascii="Garamond" w:hAnsi="Garamond"/>
+          <w:b w:val="0"/>
+          <w:bCs w:val="0"/>
+        </w:rPr>
+        <w:t xml:space="preserve">El contratista deberá cumplir con la confidencialidad y reserva absoluta en el manejo de información a la que se tenga acceso y que se encuentre relacionada con la prestación, quedando prohibido revelar dicha información a terceros. </w:t>
+      </w:r>
+    </w:p>
+    <w:p>
+      <w:pPr>
+        <w:pStyle w:val="Ttulo1"/>
+        <w:tabs>
+          <w:tab w:val="left" w:pos="567"/>
+        </w:tabs>
+        <w:spacing w:before="0" w:line="276" w:lineRule="auto"/>
+        <w:ind w:left="0" w:firstLine="0"/>
+        <w:rPr>
+          <w:rFonts w:ascii="Garamond" w:hAnsi="Garamond"/>
+          <w:b w:val="0"/>
+          <w:bCs w:val="0"/>
+        </w:rPr>
+      </w:pPr>
+      <w:r>
+        <w:rPr>
+          <w:rFonts w:ascii="Garamond" w:hAnsi="Garamond"/>
+          <w:b w:val="0"/>
+          <w:bCs w:val="0"/>
+        </w:rPr>
+        <w:t xml:space="preserve">En tal sentido, el contratista deberá dar cumplimiento a todas las políticas y estándares impartidas por la Facultad de Letras y Ciencias Humanas en materia de seguridad de la información. Dicha obligación comprende la información </w:t>
+      </w:r>
+      <w:r>
+        <w:rPr>
+          <w:rFonts w:ascii="Garamond" w:hAnsi="Garamond"/>
+          <w:b w:val="0"/>
+          <w:bCs w:val="0"/>
+        </w:rPr>
+        <w:lastRenderedPageBreak/>
+        <w:t>que se le entrega, así como la que genera durante la ejecución de las prestaciones y la información producida una vez que se haya concluido las prestaciones. Dicha información puede consistir en informes, oficios, resoluciones, presupuestos, recomendaciones y demás documentos e información compilados o recibidos por el contratista.</w:t>
+      </w:r>
+    </w:p>
+    <w:p>
+      <w:pPr>
+        <w:pStyle w:val="Ttulo1"/>
+        <w:tabs>
+          <w:tab w:val="left" w:pos="567"/>
+        </w:tabs>
+        <w:spacing w:before="0" w:line="276" w:lineRule="auto"/>
+        <w:ind w:left="0" w:firstLine="0"/>
+        <w:rPr>
+          <w:rFonts w:ascii="Garamond" w:hAnsi="Garamond"/>
+          <w:b w:val="0"/>
+          <w:bCs w:val="0"/>
+        </w:rPr>
+      </w:pPr>
+    </w:p>
+    <w:p>
+      <w:pPr>
+        <w:pStyle w:val="Ttulo1"/>
+        <w:numPr>
+          <w:ilvl w:val="0"/>
+          <w:numId w:val="2"/>
+        </w:numPr>
+        <w:tabs>
+          <w:tab w:val="left" w:pos="567"/>
+        </w:tabs>
+        <w:spacing w:before="0" w:line="276" w:lineRule="auto"/>
+        <w:ind w:left="0" w:hanging="567"/>
+        <w:rPr>
+          <w:rFonts w:ascii="Garamond" w:hAnsi="Garamond"/>
+        </w:rPr>
+      </w:pPr>
+      <w:r>
+        <w:rPr>
+          <w:rFonts w:ascii="Garamond" w:hAnsi="Garamond"/>
+        </w:rPr>
+        <w:t>PROPIEDAD INTELECTUAL</w:t>
+      </w:r>
+    </w:p>
+    <w:p>
+      <w:pPr>
+        <w:pStyle w:val="Ttulo1"/>
+        <w:tabs>
+          <w:tab w:val="left" w:pos="567"/>
+        </w:tabs>
+        <w:spacing w:before="0" w:line="276" w:lineRule="auto"/>
+        <w:ind w:left="0" w:firstLine="0"/>
+        <w:rPr>
+          <w:rFonts w:ascii="Garamond" w:hAnsi="Garamond"/>
+        </w:rPr>
+      </w:pPr>
+      <w:r>
+        <w:rPr>
+          <w:rFonts w:ascii="Garamond" w:hAnsi="Garamond"/>
+          <w:b w:val="0"/>
+          <w:bCs w:val="0"/>
+        </w:rPr>
+        <w:t>La Facultad de Letras y Ciencias Humanas, tendrá todos los derechos de propiedad intelectual, incluido sin limitación, las patentes, derechos de autor, nombres comerciales y marcas registradas, respecto a los productos o documentos y otros materiales que guarden una relación directa con la ejecución del servicio o que se hubieren creado o producido como consecuencia o en el curso de la ejecución del servicio</w:t>
+      </w:r>
+      <w:r>
+        <w:rPr>
+          <w:rFonts w:ascii="Garamond" w:hAnsi="Garamond"/>
+        </w:rPr>
+        <w:t>.</w:t>
+      </w:r>
+    </w:p>
+    <w:p>
+      <w:pPr>
+        <w:pStyle w:val="Ttulo1"/>
+        <w:tabs>
+          <w:tab w:val="left" w:pos="567"/>
+        </w:tabs>
+        <w:spacing w:before="0" w:line="276" w:lineRule="auto"/>
+        <w:ind w:left="0" w:firstLine="0"/>
+        <w:rPr>
+          <w:rFonts w:ascii="Garamond" w:hAnsi="Garamond"/>
+        </w:rPr>
+      </w:pPr>
+    </w:p>
+    <w:p>
+      <w:pPr>
+        <w:pStyle w:val="Ttulo1"/>
+        <w:numPr>
+          <w:ilvl w:val="0"/>
+          <w:numId w:val="2"/>
+        </w:numPr>
+        <w:tabs>
+          <w:tab w:val="left" w:pos="567"/>
+        </w:tabs>
+        <w:spacing w:before="0" w:line="276" w:lineRule="auto"/>
+        <w:ind w:left="0" w:hanging="567"/>
+        <w:rPr>
+          <w:rFonts w:ascii="Garamond" w:hAnsi="Garamond"/>
+        </w:rPr>
+      </w:pPr>
+      <w:r>
+        <w:rPr>
+          <w:rFonts w:ascii="Garamond" w:hAnsi="Garamond"/>
+        </w:rPr>
+        <w:t>ANTICORRUPCIÓN.</w:t>
+      </w:r>
+    </w:p>
+    <w:p>
+      <w:pPr>
+        <w:pStyle w:val="Ttulo1"/>
+        <w:tabs>
+          <w:tab w:val="left" w:pos="567"/>
+        </w:tabs>
+        <w:spacing w:before="0" w:line="276" w:lineRule="auto"/>
+        <w:ind w:left="0" w:firstLine="0"/>
+        <w:rPr>
+          <w:rFonts w:ascii="Garamond" w:hAnsi="Garamond"/>
+          <w:b w:val="0"/>
+          <w:bCs w:val="0"/>
+        </w:rPr>
+      </w:pPr>
+      <w:r>
+        <w:rPr>
+          <w:rFonts w:ascii="Garamond" w:hAnsi="Garamond"/>
+          <w:b w:val="0"/>
+          <w:bCs w:val="0"/>
+        </w:rPr>
+        <w:t xml:space="preserve">El contratista se obliga a conducirse en todo momento, durante la ejecución del contrato, con honestidad, probidad, veracidad e integridad y de no cometer actos ilegales o de corrupción, directa o indirectamente. </w:t>
+      </w:r>
+    </w:p>
+    <w:p>
+      <w:pPr>
+        <w:pStyle w:val="Ttulo1"/>
+        <w:tabs>
+          <w:tab w:val="left" w:pos="567"/>
+        </w:tabs>
+        <w:spacing w:before="0" w:line="276" w:lineRule="auto"/>
+        <w:ind w:left="0" w:firstLine="0"/>
+        <w:rPr>
+          <w:rFonts w:ascii="Garamond" w:hAnsi="Garamond"/>
+          <w:b w:val="0"/>
+          <w:bCs w:val="0"/>
+        </w:rPr>
+      </w:pPr>
+      <w:r>
+        <w:rPr>
+          <w:rFonts w:ascii="Garamond" w:hAnsi="Garamond"/>
+          <w:b w:val="0"/>
+          <w:bCs w:val="0"/>
+        </w:rPr>
+        <w:t>Además, el contratista se compromete a:</w:t>
+      </w:r>
+    </w:p>
+    <w:p>
+      <w:pPr>
+        <w:pStyle w:val="Ttulo1"/>
+        <w:tabs>
+          <w:tab w:val="left" w:pos="567"/>
+        </w:tabs>
+        <w:spacing w:before="0" w:line="276" w:lineRule="auto"/>
+        <w:ind w:left="0" w:firstLine="0"/>
+        <w:rPr>
+          <w:rFonts w:ascii="Garamond" w:hAnsi="Garamond"/>
+          <w:b w:val="0"/>
+          <w:bCs w:val="0"/>
+        </w:rPr>
+      </w:pPr>
+      <w:r>
+        <w:rPr>
+          <w:rFonts w:ascii="Garamond" w:hAnsi="Garamond"/>
+          <w:b w:val="0"/>
+          <w:bCs w:val="0"/>
+        </w:rPr>
+        <w:t>Comunicar a las autoridades competentes, de manera directa y oportuna, cualquier acto o conducta ilícita o corrupta de la que tuviera conocimiento.</w:t>
+      </w:r>
+    </w:p>
+    <w:p>
+      <w:pPr>
+        <w:pStyle w:val="Ttulo1"/>
+        <w:tabs>
+          <w:tab w:val="left" w:pos="567"/>
+        </w:tabs>
+        <w:spacing w:before="0" w:line="276" w:lineRule="auto"/>
+        <w:ind w:left="0" w:firstLine="0"/>
+        <w:rPr>
+          <w:rFonts w:ascii="Garamond" w:hAnsi="Garamond"/>
+          <w:b w:val="0"/>
+          <w:bCs w:val="0"/>
+        </w:rPr>
+      </w:pPr>
+      <w:r>
+        <w:rPr>
+          <w:rFonts w:ascii="Garamond" w:hAnsi="Garamond"/>
+          <w:b w:val="0"/>
+          <w:bCs w:val="0"/>
+        </w:rPr>
+        <w:t>Adoptar medidas técnicas, organizativas y/o de personal apropiadas para evitar los referidos actos o prácticas.</w:t>
+      </w:r>
+    </w:p>
+    <w:p>
+      <w:pPr>
+        <w:pStyle w:val="Ttulo1"/>
+        <w:tabs>
+          <w:tab w:val="left" w:pos="567"/>
+        </w:tabs>
+        <w:spacing w:before="0" w:line="276" w:lineRule="auto"/>
+        <w:ind w:left="0" w:firstLine="0"/>
+        <w:rPr>
+          <w:rFonts w:ascii="Garamond" w:hAnsi="Garamond"/>
+          <w:b w:val="0"/>
+          <w:bCs w:val="0"/>
+        </w:rPr>
+      </w:pPr>
+    </w:p>
+    <w:p>
+      <w:pPr>
+        <w:pStyle w:val="Ttulo1"/>
+        <w:numPr>
+          <w:ilvl w:val="0"/>
+          <w:numId w:val="2"/>
+        </w:numPr>
+        <w:tabs>
+          <w:tab w:val="left" w:pos="567"/>
+        </w:tabs>
+        <w:spacing w:before="0" w:line="276" w:lineRule="auto"/>
+        <w:ind w:left="0" w:hanging="567"/>
+        <w:rPr>
+          <w:rFonts w:ascii="Garamond" w:hAnsi="Garamond"/>
+        </w:rPr>
+      </w:pPr>
+      <w:r>
+        <w:rPr>
+          <w:rFonts w:ascii="Garamond" w:hAnsi="Garamond"/>
+        </w:rPr>
+        <w:t>PENALIDADES POR MORA</w:t>
+      </w:r>
+    </w:p>
+    <w:p>
+      <w:pPr>
+        <w:pStyle w:val="Ttulo1"/>
+        <w:tabs>
+          <w:tab w:val="left" w:pos="567"/>
+        </w:tabs>
+        <w:spacing w:before="0" w:line="276" w:lineRule="auto"/>
+        <w:ind w:left="0" w:firstLine="0"/>
+        <w:rPr>
+          <w:rFonts w:ascii="Garamond" w:hAnsi="Garamond"/>
+          <w:b w:val="0"/>
+          <w:bCs w:val="0"/>
+        </w:rPr>
+      </w:pPr>
+      <w:r>
+        <w:rPr>
+          <w:rFonts w:ascii="Garamond" w:hAnsi="Garamond"/>
+          <w:b w:val="0"/>
+          <w:bCs w:val="0"/>
+        </w:rPr>
+        <w:t>Penalidad por Mora en la ejecución de la prestación:</w:t>
+      </w:r>
+    </w:p>
+    <w:p>
+      <w:pPr>
+        <w:pStyle w:val="Ttulo1"/>
+        <w:tabs>
+          <w:tab w:val="left" w:pos="567"/>
+        </w:tabs>
+        <w:spacing w:before="0" w:line="276" w:lineRule="auto"/>
+        <w:ind w:left="0" w:firstLine="0"/>
+        <w:rPr>
+          <w:rFonts w:ascii="Garamond" w:hAnsi="Garamond"/>
+          <w:b w:val="0"/>
+          <w:bCs w:val="0"/>
+        </w:rPr>
+      </w:pPr>
+      <w:r>
+        <w:rPr>
+          <w:rFonts w:ascii="Garamond" w:hAnsi="Garamond"/>
+          <w:b w:val="0"/>
+          <w:bCs w:val="0"/>
+        </w:rPr>
+        <w:t xml:space="preserve">En caso de retraso injustificado del proveedor en la ejecución de las prestaciones objeto del contrato, la Entidad le aplica automáticamente una penalidad por mora por cada día de atraso. La penalidad se aplica automáticamente y se calcula </w:t>
+      </w:r>
+      <w:proofErr w:type="gramStart"/>
+      <w:r>
+        <w:rPr>
+          <w:rFonts w:ascii="Garamond" w:hAnsi="Garamond"/>
+          <w:b w:val="0"/>
+          <w:bCs w:val="0"/>
+        </w:rPr>
+        <w:t>de acuerdo a</w:t>
+      </w:r>
+      <w:proofErr w:type="gramEnd"/>
+      <w:r>
+        <w:rPr>
+          <w:rFonts w:ascii="Garamond" w:hAnsi="Garamond"/>
+          <w:b w:val="0"/>
+          <w:bCs w:val="0"/>
+        </w:rPr>
+        <w:t xml:space="preserve"> la siguiente fórmula: </w:t>
+      </w:r>
+    </w:p>
+    <w:p>
+      <w:pPr>
+        <w:pStyle w:val="Ttulo1"/>
+        <w:tabs>
+          <w:tab w:val="left" w:pos="567"/>
+        </w:tabs>
+        <w:spacing w:before="0" w:line="276" w:lineRule="auto"/>
+        <w:ind w:left="0" w:firstLine="0"/>
+        <w:rPr>
+          <w:rFonts w:ascii="Garamond" w:hAnsi="Garamond"/>
+          <w:b w:val="0"/>
+          <w:bCs w:val="0"/>
+        </w:rPr>
+      </w:pPr>
+    </w:p>
+    <w:p>
+      <w:pPr>
+        <w:pStyle w:val="Ttulo1"/>
+        <w:tabs>
+          <w:tab w:val="left" w:pos="567"/>
+        </w:tabs>
+        <w:spacing w:before="0" w:line="276" w:lineRule="auto"/>
+        <w:ind w:left="0" w:firstLine="0"/>
+        <w:rPr>
+          <w:rFonts w:ascii="Garamond" w:hAnsi="Garamond"/>
+          <w:b w:val="0"/>
+          <w:bCs w:val="0"/>
+        </w:rPr>
+      </w:pPr>
+      <m:oMathPara>
+        <m:oMath>
+          <m:r>
+            <m:rPr>
+              <m:sty m:val="b"/>
+            </m:rPr>
+            <w:rPr>
+              <w:rFonts w:ascii="Cambria Math" w:hAnsi="Cambria Math"/>
+            </w:rPr>
+            <m:t>Penalidad diaria=</m:t>
+          </m:r>
+          <m:f>
+            <m:fPr>
+              <m:ctrlPr>
+                <w:rPr>
+                  <w:rFonts w:ascii="Cambria Math" w:hAnsi="Cambria Math"/>
+                  <w:b w:val="0"/>
+                  <w:bCs w:val="0"/>
+                </w:rPr>
+              </m:ctrlPr>
+            </m:fPr>
+            <m:num>
+              <m:r>
+                <m:rPr>
+                  <m:sty m:val="b"/>
+                </m:rPr>
+                <w:rPr>
+                  <w:rFonts w:ascii="Cambria Math" w:hAnsi="Cambria Math"/>
+                </w:rPr>
+                <m:t>(0.10 x monto)</m:t>
+              </m:r>
+            </m:num>
+            <m:den>
+              <m:r>
+                <m:rPr>
+                  <m:sty m:val="b"/>
+                </m:rPr>
+                <w:rPr>
+                  <w:rFonts w:ascii="Cambria Math" w:hAnsi="Cambria Math"/>
+                </w:rPr>
+                <m:t xml:space="preserve">(F x plazo en días) </m:t>
+              </m:r>
+            </m:den>
+          </m:f>
+        </m:oMath>
+      </m:oMathPara>
+    </w:p>
+    <w:p>
+      <w:pPr>
+        <w:pStyle w:val="Ttulo1"/>
+        <w:tabs>
+          <w:tab w:val="left" w:pos="567"/>
+        </w:tabs>
+        <w:spacing w:before="0" w:line="276" w:lineRule="auto"/>
+        <w:ind w:left="0" w:firstLine="0"/>
+        <w:rPr>
+          <w:rFonts w:ascii="Garamond" w:hAnsi="Garamond"/>
+          <w:b w:val="0"/>
+          <w:bCs w:val="0"/>
+        </w:rPr>
+      </w:pPr>
+    </w:p>
+    <w:p>
+      <w:pPr>
+        <w:pStyle w:val="Ttulo1"/>
+        <w:tabs>
+          <w:tab w:val="left" w:pos="567"/>
+        </w:tabs>
+        <w:spacing w:before="0" w:line="276" w:lineRule="auto"/>
+        <w:ind w:left="0" w:firstLine="0"/>
+        <w:rPr>
+          <w:rFonts w:ascii="Garamond" w:hAnsi="Garamond"/>
+          <w:b w:val="0"/>
+          <w:bCs w:val="0"/>
+        </w:rPr>
+      </w:pPr>
+      <w:r>
+        <w:rPr>
+          <w:rFonts w:ascii="Garamond" w:hAnsi="Garamond"/>
+          <w:b w:val="0"/>
+          <w:bCs w:val="0"/>
+        </w:rPr>
+        <w:t>Donde “F” tiene los siguientes valores:</w:t>
+      </w:r>
+    </w:p>
+    <w:p>
+      <w:pPr>
+        <w:pStyle w:val="Ttulo1"/>
+        <w:tabs>
+          <w:tab w:val="left" w:pos="567"/>
+        </w:tabs>
+        <w:spacing w:before="0" w:line="276" w:lineRule="auto"/>
+        <w:ind w:left="0" w:firstLine="0"/>
+        <w:rPr>
+          <w:rFonts w:ascii="Garamond" w:hAnsi="Garamond"/>
+          <w:b w:val="0"/>
+          <w:bCs w:val="0"/>
+        </w:rPr>
+      </w:pPr>
+      <w:r>
+        <w:rPr>
+          <w:rFonts w:ascii="Garamond" w:hAnsi="Garamond"/>
+          <w:b w:val="0"/>
+          <w:bCs w:val="0"/>
+        </w:rPr>
+        <w:t xml:space="preserve">F = 0.25 para plazos mayores a sesenta (60) días </w:t>
+      </w:r>
+    </w:p>
+    <w:p>
+      <w:pPr>
+        <w:pStyle w:val="Ttulo1"/>
+        <w:tabs>
+          <w:tab w:val="left" w:pos="567"/>
+        </w:tabs>
+        <w:spacing w:before="0" w:line="276" w:lineRule="auto"/>
+        <w:ind w:left="0" w:firstLine="0"/>
+        <w:rPr>
+          <w:rFonts w:ascii="Garamond" w:hAnsi="Garamond"/>
+          <w:b w:val="0"/>
+          <w:bCs w:val="0"/>
+        </w:rPr>
+      </w:pPr>
+      <w:r>
+        <w:rPr>
+          <w:rFonts w:ascii="Garamond" w:hAnsi="Garamond"/>
+          <w:b w:val="0"/>
+          <w:bCs w:val="0"/>
+        </w:rPr>
+        <w:t xml:space="preserve">F = 0.40 para plazos menores o iguales a sesenta (60) días </w:t>
+      </w:r>
+    </w:p>
+    <w:p>
+      <w:pPr>
+        <w:pStyle w:val="Ttulo1"/>
+        <w:tabs>
+          <w:tab w:val="left" w:pos="567"/>
+        </w:tabs>
+        <w:spacing w:before="0" w:line="276" w:lineRule="auto"/>
+        <w:ind w:left="0" w:firstLine="0"/>
+        <w:rPr>
+          <w:rFonts w:ascii="Garamond" w:hAnsi="Garamond"/>
+          <w:b w:val="0"/>
+          <w:bCs w:val="0"/>
+        </w:rPr>
+      </w:pPr>
+      <w:r>
+        <w:rPr>
+          <w:rFonts w:ascii="Garamond" w:hAnsi="Garamond"/>
+          <w:b w:val="0"/>
+          <w:bCs w:val="0"/>
+        </w:rPr>
+        <w:t>b.1) para bienes, servicios en general y consultorías: f = 0.25.</w:t>
+      </w:r>
+    </w:p>
+    <w:p>
+      <w:pPr>
+        <w:pStyle w:val="Ttulo1"/>
+        <w:tabs>
+          <w:tab w:val="left" w:pos="567"/>
+        </w:tabs>
+        <w:spacing w:before="0" w:line="276" w:lineRule="auto"/>
+        <w:ind w:left="0" w:firstLine="0"/>
+        <w:rPr>
+          <w:rFonts w:ascii="Garamond" w:hAnsi="Garamond"/>
+          <w:b w:val="0"/>
+          <w:bCs w:val="0"/>
+        </w:rPr>
+      </w:pPr>
+      <w:r>
+        <w:rPr>
+          <w:rFonts w:ascii="Garamond" w:hAnsi="Garamond"/>
+          <w:b w:val="0"/>
+          <w:bCs w:val="0"/>
+        </w:rPr>
+        <w:t>b.2) para obras: f = 0.15</w:t>
+      </w:r>
+    </w:p>
+    <w:p>
+      <w:pPr>
+        <w:pStyle w:val="Ttulo1"/>
+        <w:tabs>
+          <w:tab w:val="left" w:pos="567"/>
+        </w:tabs>
+        <w:spacing w:before="0" w:line="276" w:lineRule="auto"/>
+        <w:ind w:left="0" w:firstLine="0"/>
+        <w:rPr>
+          <w:rFonts w:ascii="Garamond" w:hAnsi="Garamond"/>
+          <w:b w:val="0"/>
+        </w:rPr>
+      </w:pPr>
+    </w:p>
+    <w:p>
+      <w:pPr>
+        <w:pStyle w:val="Ttulo1"/>
+        <w:numPr>
+          <w:ilvl w:val="0"/>
+          <w:numId w:val="2"/>
+        </w:numPr>
+        <w:tabs>
+          <w:tab w:val="left" w:pos="567"/>
+        </w:tabs>
+        <w:spacing w:before="0" w:line="276" w:lineRule="auto"/>
+        <w:ind w:left="0" w:hanging="567"/>
+        <w:rPr>
+          <w:rFonts w:ascii="Garamond" w:hAnsi="Garamond"/>
+        </w:rPr>
+      </w:pPr>
+      <w:bookmarkStart w:id="5" w:name="IX._MONTO_REFERENCIAL:"/>
+      <w:bookmarkEnd w:id="5"/>
+      <w:r>
+        <w:rPr>
+          <w:rFonts w:ascii="Garamond" w:hAnsi="Garamond"/>
+        </w:rPr>
+        <w:t>MONTO</w:t>
+      </w:r>
+      <w:r>
+        <w:rPr>
+          <w:rFonts w:ascii="Garamond" w:hAnsi="Garamond"/>
+          <w:spacing w:val="-12"/>
+        </w:rPr>
+        <w:t xml:space="preserve"> </w:t>
+      </w:r>
       <w:r>
         <w:rPr>
           <w:rFonts w:ascii="Garamond" w:hAnsi="Garamond"/>
           <w:spacing w:val="-2"/>
-          <w:sz w:val="22"/>
-          <w:szCs w:val="22"/>
+        </w:rPr>
+        <w:t>REFERENCIAL:</w:t>
+      </w:r>
+    </w:p>
+    <w:p>
+      <w:pPr>
+        <w:pStyle w:val="Ttulo1"/>
+        <w:tabs>
+          <w:tab w:val="left" w:pos="567"/>
+        </w:tabs>
+        <w:spacing w:before="0" w:line="276" w:lineRule="auto"/>
+        <w:ind w:left="0" w:firstLine="0"/>
+        <w:rPr>
+          <w:rFonts w:ascii="Garamond" w:hAnsi="Garamond"/>
+        </w:rPr>
+      </w:pPr>
+      <w:r>
+        <w:rPr>
+          <w:rFonts w:ascii="Garamond" w:hAnsi="Garamond"/>
+          <w:b w:val="0"/>
+        </w:rPr>
+        <w:t>Monto</w:t>
+      </w:r>
+      <w:r>
+        <w:rPr>
+          <w:rFonts w:ascii="Garamond" w:hAnsi="Garamond"/>
+          <w:b w:val="0"/>
+          <w:spacing w:val="-3"/>
+        </w:rPr>
+        <w:t xml:space="preserve"> </w:t>
+      </w:r>
+      <w:r>
+        <w:rPr>
+          <w:rFonts w:ascii="Garamond" w:hAnsi="Garamond"/>
+          <w:b w:val="0"/>
+        </w:rPr>
+        <w:t>por</w:t>
+      </w:r>
+      <w:r>
+        <w:rPr>
+          <w:rFonts w:ascii="Garamond" w:hAnsi="Garamond"/>
+          <w:b w:val="0"/>
+          <w:spacing w:val="-2"/>
+        </w:rPr>
+        <w:t xml:space="preserve"> </w:t>
+      </w:r>
+      <w:r>
+        <w:rPr>
+          <w:rFonts w:ascii="Garamond" w:hAnsi="Garamond"/>
+          <w:b w:val="0"/>
+        </w:rPr>
+        <w:t>hora:</w:t>
+      </w:r>
+      <w:r>
+        <w:rPr>
+          <w:rFonts w:ascii="Garamond" w:hAnsi="Garamond"/>
+        </w:rPr>
+        <w:t xml:space="preserve"> </w:t>
+      </w:r>
+      <w:proofErr w:type="spellStart"/>
+      <w:r>
+        <w:rPr>
+          <w:rFonts w:ascii="Garamond" w:hAnsi="Garamond"/>
+          <w:b w:val="0"/>
+          <w:bCs w:val="0"/>
+        </w:rPr>
+        <w:t>categoria</w:t>
+      </w:r>
+      <w:proofErr w:type="spellEnd"/>
+      <w:r>
+        <w:rPr>
+          <w:rFonts w:ascii="Garamond" w:hAnsi="Garamond"/>
+        </w:rPr>
+        <w:t>.</w:t>
+      </w:r>
+    </w:p>
+    <w:p>
+      <w:pPr>
+        <w:pStyle w:val="Ttulo1"/>
+        <w:tabs>
+          <w:tab w:val="left" w:pos="567"/>
+        </w:tabs>
+        <w:spacing w:before="0" w:line="276" w:lineRule="auto"/>
+        <w:ind w:left="0" w:firstLine="0"/>
+        <w:rPr>
+          <w:rFonts w:ascii="Garamond" w:hAnsi="Garamond"/>
+          <w:b w:val="0"/>
+        </w:rPr>
+      </w:pPr>
+      <w:r>
+        <w:rPr>
+          <w:rFonts w:ascii="Garamond" w:hAnsi="Garamond"/>
+          <w:b w:val="0"/>
+          <w:bCs w:val="0"/>
+        </w:rPr>
+        <w:t>Monto del servicio:</w:t>
+      </w:r>
+      <w:r>
+        <w:rPr>
+          <w:rFonts w:ascii="Garamond" w:hAnsi="Garamond"/>
+        </w:rPr>
+        <w:t xml:space="preserve"> </w:t>
+      </w:r>
+      <w:proofErr w:type="spellStart"/>
+      <w:r>
+        <w:rPr>
+          <w:rFonts w:ascii="Garamond" w:hAnsi="Garamond"/>
+          <w:b w:val="0"/>
+          <w:bCs w:val="0"/>
+        </w:rPr>
+        <w:t>monto_subtotal</w:t>
+      </w:r>
+      <w:proofErr w:type="spellEnd"/>
+      <w:r>
+        <w:rPr>
+          <w:rFonts w:ascii="Garamond" w:hAnsi="Garamond"/>
+          <w:b w:val="0"/>
+        </w:rPr>
+        <w:t>.</w:t>
+      </w:r>
+    </w:p>
+    <w:p>
+      <w:pPr>
+        <w:pStyle w:val="Ttulo1"/>
+        <w:tabs>
+          <w:tab w:val="left" w:pos="567"/>
+        </w:tabs>
+        <w:spacing w:before="0" w:line="276" w:lineRule="auto"/>
+        <w:ind w:left="0" w:firstLine="0"/>
+        <w:rPr>
+          <w:rFonts w:ascii="Garamond" w:hAnsi="Garamond"/>
+          <w:b w:val="0"/>
+        </w:rPr>
+      </w:pPr>
+    </w:p>
+    <w:p>
+      <w:pPr>
+        <w:pStyle w:val="Ttulo1"/>
+        <w:numPr>
+          <w:ilvl w:val="0"/>
+          <w:numId w:val="2"/>
+        </w:numPr>
+        <w:tabs>
+          <w:tab w:val="left" w:pos="567"/>
+        </w:tabs>
+        <w:spacing w:before="0" w:line="276" w:lineRule="auto"/>
+        <w:ind w:left="0" w:hanging="567"/>
+        <w:rPr>
+          <w:rFonts w:ascii="Garamond" w:hAnsi="Garamond"/>
+        </w:rPr>
+      </w:pPr>
+      <w:r>
+        <w:rPr>
+          <w:rFonts w:ascii="Garamond" w:hAnsi="Garamond"/>
+          <w:spacing w:val="-2"/>
         </w:rPr>
         <w:t>CONFORMIDAD</w:t>
       </w:r>
@@ -1394,8 +2264,6 @@
         <w:rPr>
           <w:rFonts w:ascii="Garamond" w:hAnsi="Garamond"/>
           <w:spacing w:val="-4"/>
-          <w:sz w:val="22"/>
-          <w:szCs w:val="22"/>
         </w:rPr>
         <w:t xml:space="preserve"> </w:t>
       </w:r>
@@ -1403,8 +2271,6 @@
         <w:rPr>
           <w:rFonts w:ascii="Garamond" w:hAnsi="Garamond"/>
           <w:spacing w:val="-2"/>
-          <w:sz w:val="22"/>
-          <w:szCs w:val="22"/>
         </w:rPr>
         <w:t>DEL</w:t>
       </w:r>
@@ -1412,8 +2278,6 @@
         <w:rPr>
           <w:rFonts w:ascii="Garamond" w:hAnsi="Garamond"/>
           <w:spacing w:val="-1"/>
-          <w:sz w:val="22"/>
-          <w:szCs w:val="22"/>
         </w:rPr>
         <w:t xml:space="preserve"> </w:t>
       </w:r>
@@ -1421,8 +2285,6 @@
         <w:rPr>
           <w:rFonts w:ascii="Garamond" w:hAnsi="Garamond"/>
           <w:spacing w:val="-2"/>
-          <w:sz w:val="22"/>
-          <w:szCs w:val="22"/>
         </w:rPr>
         <w:t>SERVICIO:</w:t>
       </w:r>
@@ -1566,14 +2428,7 @@
           <w:rFonts w:ascii="Garamond" w:hAnsi="Garamond"/>
           <w:b w:val="0"/>
         </w:rPr>
-        <w:t>d</w:t>
-      </w:r>
-      <w:r>
-        <w:rPr>
-          <w:rFonts w:ascii="Garamond" w:hAnsi="Garamond"/>
-          <w:b w:val="0"/>
-        </w:rPr>
-        <w:t>irector</w:t>
+        <w:t>director</w:t>
       </w:r>
       <w:r>
         <w:rPr>
@@ -1596,37 +2451,13 @@
           <w:b w:val="0"/>
           <w:spacing w:val="-12"/>
         </w:rPr>
-        <w:t xml:space="preserve"> </w:t>
-      </w:r>
-      <w:r>
-        <w:rPr>
-          <w:rFonts w:ascii="Garamond" w:hAnsi="Garamond"/>
-          <w:b w:val="0"/>
-          <w:spacing w:val="-12"/>
-        </w:rPr>
-        <w:t xml:space="preserve">la </w:t>
-      </w:r>
-      <w:r>
-        <w:rPr>
-          <w:rFonts w:ascii="Garamond" w:hAnsi="Garamond"/>
-          <w:b w:val="0"/>
-          <w:spacing w:val="-12"/>
-        </w:rPr>
-        <w:t xml:space="preserve">Dirección </w:t>
-      </w:r>
-      <w:r>
-        <w:rPr>
-          <w:rFonts w:ascii="Garamond" w:hAnsi="Garamond"/>
-          <w:b w:val="0"/>
-          <w:spacing w:val="-12"/>
-        </w:rPr>
-        <w:t>Ejecutiva</w:t>
-      </w:r>
-      <w:r>
-        <w:rPr>
-          <w:rFonts w:ascii="Garamond" w:hAnsi="Garamond"/>
-          <w:b w:val="0"/>
-          <w:spacing w:val="-12"/>
+        <w:t xml:space="preserve"> la Dirección Ejecutiva</w:t>
+      </w:r>
+      <w:r>
+        <w:rPr>
+          <w:rFonts w:ascii="Garamond" w:hAnsi="Garamond"/>
+          <w:b w:val="0"/>
+          <w:spacing w:val="-8"/>
         </w:rPr>
         <w:t xml:space="preserve"> </w:t>
       </w:r>
@@ -1690,8 +2521,6 @@
         <w:spacing w:line="276" w:lineRule="auto"/>
         <w:rPr>
           <w:rFonts w:ascii="Garamond" w:hAnsi="Garamond"/>
-          <w:sz w:val="22"/>
-          <w:szCs w:val="22"/>
           <w:u w:val="single"/>
         </w:rPr>
       </w:pPr>
@@ -1702,8 +2531,56 @@
         <w:spacing w:line="276" w:lineRule="auto"/>
         <w:rPr>
           <w:rFonts w:ascii="Garamond" w:hAnsi="Garamond"/>
-          <w:sz w:val="22"/>
-          <w:szCs w:val="22"/>
+          <w:u w:val="single"/>
+        </w:rPr>
+      </w:pPr>
+    </w:p>
+    <w:p>
+      <w:pPr>
+        <w:pStyle w:val="Textoindependiente"/>
+        <w:spacing w:line="276" w:lineRule="auto"/>
+        <w:rPr>
+          <w:rFonts w:ascii="Garamond" w:hAnsi="Garamond"/>
+          <w:u w:val="single"/>
+        </w:rPr>
+      </w:pPr>
+    </w:p>
+    <w:p>
+      <w:pPr>
+        <w:pStyle w:val="Textoindependiente"/>
+        <w:spacing w:line="276" w:lineRule="auto"/>
+        <w:rPr>
+          <w:rFonts w:ascii="Garamond" w:hAnsi="Garamond"/>
+          <w:u w:val="single"/>
+        </w:rPr>
+      </w:pPr>
+    </w:p>
+    <w:p>
+      <w:pPr>
+        <w:pStyle w:val="Textoindependiente"/>
+        <w:spacing w:line="276" w:lineRule="auto"/>
+        <w:rPr>
+          <w:rFonts w:ascii="Garamond" w:hAnsi="Garamond"/>
+          <w:u w:val="single"/>
+        </w:rPr>
+      </w:pPr>
+    </w:p>
+    <w:p>
+      <w:pPr>
+        <w:pStyle w:val="Textoindependiente"/>
+        <w:spacing w:line="276" w:lineRule="auto"/>
+        <w:rPr>
+          <w:rFonts w:ascii="Garamond" w:hAnsi="Garamond"/>
+          <w:u w:val="single"/>
+        </w:rPr>
+      </w:pPr>
+    </w:p>
+    <w:p>
+      <w:pPr>
+        <w:pStyle w:val="Textoindependiente"/>
+        <w:spacing w:line="276" w:lineRule="auto"/>
+        <w:rPr>
+          <w:rFonts w:ascii="Garamond" w:hAnsi="Garamond"/>
           <w:u w:val="single"/>
         </w:rPr>
       </w:pPr>
@@ -1716,10 +2593,15 @@
         <w:rPr>
           <w:rFonts w:ascii="Garamond" w:hAnsi="Garamond"/>
           <w:b/>
-          <w:sz w:val="24"/>
-          <w:szCs w:val="22"/>
-        </w:rPr>
-      </w:pPr>
+        </w:rPr>
+      </w:pPr>
+      <w:r>
+        <w:rPr>
+          <w:rFonts w:ascii="Garamond" w:hAnsi="Garamond"/>
+          <w:b/>
+        </w:rPr>
+        <w:t>Dr. Guillaume Yannick Serge Oisel</w:t>
+      </w:r>
     </w:p>
     <w:p>
       <w:pPr>
@@ -1728,131 +2610,27 @@
         <w:jc w:val="center"/>
         <w:rPr>
           <w:rFonts w:ascii="Garamond" w:hAnsi="Garamond"/>
-          <w:b/>
-          <w:sz w:val="24"/>
-          <w:szCs w:val="22"/>
-        </w:rPr>
-      </w:pPr>
-    </w:p>
-    <w:p>
-      <w:pPr>
-        <w:pStyle w:val="Textoindependiente"/>
-        <w:spacing w:line="276" w:lineRule="auto"/>
-        <w:jc w:val="center"/>
-        <w:rPr>
-          <w:rFonts w:ascii="Garamond" w:hAnsi="Garamond"/>
-          <w:b/>
-          <w:sz w:val="24"/>
-          <w:szCs w:val="22"/>
-        </w:rPr>
-      </w:pPr>
-      <w:r>
-        <w:rPr>
-          <w:rFonts w:ascii="Garamond" w:hAnsi="Garamond"/>
-          <w:b/>
-          <w:sz w:val="24"/>
-          <w:szCs w:val="22"/>
-        </w:rPr>
-        <w:t xml:space="preserve">Dr. Guillaume </w:t>
-      </w:r>
-      <w:proofErr w:type="spellStart"/>
-      <w:r>
-        <w:rPr>
-          <w:rFonts w:ascii="Garamond" w:hAnsi="Garamond"/>
-          <w:b/>
-          <w:sz w:val="24"/>
-          <w:szCs w:val="22"/>
-        </w:rPr>
-        <w:t>Yannick</w:t>
-      </w:r>
-      <w:proofErr w:type="spellEnd"/>
-      <w:r>
-        <w:rPr>
-          <w:rFonts w:ascii="Garamond" w:hAnsi="Garamond"/>
-          <w:b/>
-          <w:sz w:val="24"/>
-          <w:szCs w:val="22"/>
-        </w:rPr>
-        <w:t xml:space="preserve"> </w:t>
-      </w:r>
-      <w:proofErr w:type="spellStart"/>
-      <w:r>
-        <w:rPr>
-          <w:rFonts w:ascii="Garamond" w:hAnsi="Garamond"/>
-          <w:b/>
-          <w:sz w:val="24"/>
-          <w:szCs w:val="22"/>
-        </w:rPr>
-        <w:t>Serge</w:t>
-      </w:r>
-      <w:proofErr w:type="spellEnd"/>
-      <w:r>
-        <w:rPr>
-          <w:rFonts w:ascii="Garamond" w:hAnsi="Garamond"/>
-          <w:b/>
-          <w:sz w:val="24"/>
-          <w:szCs w:val="22"/>
-        </w:rPr>
-        <w:t xml:space="preserve"> </w:t>
-      </w:r>
-      <w:proofErr w:type="spellStart"/>
-      <w:r>
-        <w:rPr>
-          <w:rFonts w:ascii="Garamond" w:hAnsi="Garamond"/>
-          <w:b/>
-          <w:sz w:val="24"/>
-          <w:szCs w:val="22"/>
-        </w:rPr>
-        <w:t>Oisel</w:t>
-      </w:r>
-      <w:proofErr w:type="spellEnd"/>
-    </w:p>
-    <w:p>
-      <w:pPr>
-        <w:pStyle w:val="Textoindependiente"/>
-        <w:spacing w:line="276" w:lineRule="auto"/>
-        <w:jc w:val="center"/>
-        <w:rPr>
-          <w:rFonts w:ascii="Garamond" w:hAnsi="Garamond"/>
-          <w:sz w:val="24"/>
-        </w:rPr>
-      </w:pPr>
-      <w:r>
-        <w:rPr>
-          <w:rFonts w:ascii="Garamond" w:hAnsi="Garamond"/>
-          <w:sz w:val="24"/>
-        </w:rPr>
-        <w:t>Director de la Dirección Ejecutiva</w:t>
-      </w:r>
-    </w:p>
-    <w:p>
-      <w:pPr>
-        <w:pStyle w:val="Textoindependiente"/>
-        <w:spacing w:line="276" w:lineRule="auto"/>
-        <w:jc w:val="center"/>
-        <w:rPr>
-          <w:rFonts w:ascii="Garamond" w:hAnsi="Garamond"/>
-          <w:sz w:val="24"/>
-          <w:szCs w:val="22"/>
-        </w:rPr>
-      </w:pPr>
-      <w:r>
-        <w:rPr>
-          <w:rFonts w:ascii="Garamond" w:hAnsi="Garamond"/>
-          <w:sz w:val="24"/>
-          <w:szCs w:val="22"/>
-        </w:rPr>
-        <w:t>Centro de Idiomas de la UNMSM</w:t>
-      </w:r>
-    </w:p>
-    <w:p>
-      <w:pPr>
-        <w:pStyle w:val="Textoindependiente"/>
-        <w:spacing w:line="276" w:lineRule="auto"/>
-        <w:rPr>
-          <w:rFonts w:ascii="Garamond" w:hAnsi="Garamond"/>
-          <w:sz w:val="22"/>
-          <w:szCs w:val="22"/>
+        </w:rPr>
+      </w:pPr>
+      <w:r>
+        <w:rPr>
+          <w:rFonts w:ascii="Garamond" w:hAnsi="Garamond"/>
+        </w:rPr>
+        <w:t>Director Ejecutivo del Centro de Idiomas de la UNMSM</w:t>
+      </w:r>
+    </w:p>
+    <w:p>
+      <w:pPr>
+        <w:pStyle w:val="Prrafodelista"/>
+        <w:tabs>
+          <w:tab w:val="left" w:pos="567"/>
+        </w:tabs>
+        <w:spacing w:before="0" w:line="276" w:lineRule="auto"/>
+        <w:ind w:left="0" w:firstLine="0"/>
+        <w:rPr>
+          <w:rFonts w:ascii="Garamond" w:hAnsi="Garamond"/>
+          <w:sz w:val="20"/>
+          <w:szCs w:val="20"/>
           <w:u w:val="single"/>
         </w:rPr>
       </w:pPr>
@@ -1863,8 +2641,8 @@
         <w:rPr>
           <w:rFonts w:ascii="Garamond" w:hAnsi="Garamond" w:cs="Arial"/>
           <w:bCs/>
-          <w:sz w:val="24"/>
-          <w:szCs w:val="24"/>
+          <w:sz w:val="20"/>
+          <w:szCs w:val="20"/>
         </w:rPr>
       </w:pPr>
     </w:p>
@@ -1880,7 +2658,7 @@
 </file>
 
 <file path=word/endnotes.xml><?xml version="1.0" encoding="utf-8"?>
-<w:endnotes xmlns:wpc="http://schemas.microsoft.com/office/word/2010/wordprocessingCanvas" xmlns:cx="http://schemas.microsoft.com/office/drawing/2014/chartex" xmlns:mc="http://schemas.openxmlformats.org/markup-compatibility/2006" xmlns:o="urn:schemas-microsoft-com:office:office" xmlns:r="http://schemas.openxmlformats.org/officeDocument/2006/relationships" xmlns:m="http://schemas.openxmlformats.org/officeDocument/2006/math" xmlns:v="urn:schemas-microsoft-com:vml" xmlns:wp14="http://schemas.microsoft.com/office/word/2010/wordprocessingDrawing" xmlns:wp="http://schemas.openxmlformats.org/drawingml/2006/wordprocessingDrawing" xmlns:w10="urn:schemas-microsoft-com:office:word" xmlns:w="http://schemas.openxmlformats.org/wordprocessingml/2006/main" xmlns:w14="http://schemas.microsoft.com/office/word/2010/wordml" xmlns:w15="http://schemas.microsoft.com/office/word/2012/wordml" xmlns:w16se="http://schemas.microsoft.com/office/word/2015/wordml/symex" xmlns:wpg="http://schemas.microsoft.com/office/word/2010/wordprocessingGroup" xmlns:wpi="http://schemas.microsoft.com/office/word/2010/wordprocessingInk" xmlns:wne="http://schemas.microsoft.com/office/word/2006/wordml" xmlns:wps="http://schemas.microsoft.com/office/word/2010/wordprocessingShape" mc:Ignorable="w14 w15 w16se wp14">
+<w:endnotes xmlns:wpc="http://schemas.microsoft.com/office/word/2010/wordprocessingCanvas" xmlns:cx="http://schemas.microsoft.com/office/drawing/2014/chartex" xmlns:cx1="http://schemas.microsoft.com/office/drawing/2015/9/8/chartex" xmlns:cx2="http://schemas.microsoft.com/office/drawing/2015/10/21/chartex" xmlns:cx3="http://schemas.microsoft.com/office/drawing/2016/5/9/chartex" xmlns:cx4="http://schemas.microsoft.com/office/drawing/2016/5/10/chartex" xmlns:cx5="http://schemas.microsoft.com/office/drawing/2016/5/11/chartex" xmlns:cx6="http://schemas.microsoft.com/office/drawing/2016/5/12/chartex" xmlns:cx7="http://schemas.microsoft.com/office/drawing/2016/5/13/chartex" xmlns:cx8="http://schemas.microsoft.com/office/drawing/2016/5/14/chartex" xmlns:mc="http://schemas.openxmlformats.org/markup-compatibility/2006" xmlns:aink="http://schemas.microsoft.com/office/drawing/2016/ink" xmlns:am3d="http://schemas.microsoft.com/office/drawing/2017/model3d" xmlns:o="urn:schemas-microsoft-com:office:office" xmlns:oel="http://schemas.microsoft.com/office/2019/extlst" xmlns:r="http://schemas.openxmlformats.org/officeDocument/2006/relationships" xmlns:m="http://schemas.openxmlformats.org/officeDocument/2006/math" xmlns:v="urn:schemas-microsoft-com:vml" xmlns:wp14="http://schemas.microsoft.com/office/word/2010/wordprocessingDrawing" xmlns:wp="http://schemas.openxmlformats.org/drawingml/2006/wordprocessingDrawing" xmlns:w10="urn:schemas-microsoft-com:office:word" xmlns:w="http://schemas.openxmlformats.org/wordprocessingml/2006/main" xmlns:w14="http://schemas.microsoft.com/office/word/2010/wordml" xmlns:w15="http://schemas.microsoft.com/office/word/2012/wordml" xmlns:w16cex="http://schemas.microsoft.com/office/word/2018/wordml/cex" xmlns:w16cid="http://schemas.microsoft.com/office/word/2016/wordml/cid" xmlns:w16="http://schemas.microsoft.com/office/word/2018/wordml" xmlns:w16du="http://schemas.microsoft.com/office/word/2023/wordml/word16du" xmlns:w16sdtdh="http://schemas.microsoft.com/office/word/2020/wordml/sdtdatahash" xmlns:w16sdtfl="http://schemas.microsoft.com/office/word/2024/wordml/sdtformatlock" xmlns:w16se="http://schemas.microsoft.com/office/word/2015/wordml/symex" xmlns:wpg="http://schemas.microsoft.com/office/word/2010/wordprocessingGroup" xmlns:wpi="http://schemas.microsoft.com/office/word/2010/wordprocessingInk" xmlns:wne="http://schemas.microsoft.com/office/word/2006/wordml" xmlns:wps="http://schemas.microsoft.com/office/word/2010/wordprocessingShape" mc:Ignorable="w14 w15 w16se w16cid w16 w16cex w16sdtdh w16sdtfl w16du wp14">
   <w:endnote w:type="separator" w:id="-1">
     <w:p>
       <w:r>
@@ -1899,7 +2677,7 @@
 </file>
 
 <file path=word/footnotes.xml><?xml version="1.0" encoding="utf-8"?>
-<w:footnotes xmlns:wpc="http://schemas.microsoft.com/office/word/2010/wordprocessingCanvas" xmlns:cx="http://schemas.microsoft.com/office/drawing/2014/chartex" xmlns:mc="http://schemas.openxmlformats.org/markup-compatibility/2006" xmlns:o="urn:schemas-microsoft-com:office:office" xmlns:r="http://schemas.openxmlformats.org/officeDocument/2006/relationships" xmlns:m="http://schemas.openxmlformats.org/officeDocument/2006/math" xmlns:v="urn:schemas-microsoft-com:vml" xmlns:wp14="http://schemas.microsoft.com/office/word/2010/wordprocessingDrawing" xmlns:wp="http://schemas.openxmlformats.org/drawingml/2006/wordprocessingDrawing" xmlns:w10="urn:schemas-microsoft-com:office:word" xmlns:w="http://schemas.openxmlformats.org/wordprocessingml/2006/main" xmlns:w14="http://schemas.microsoft.com/office/word/2010/wordml" xmlns:w15="http://schemas.microsoft.com/office/word/2012/wordml" xmlns:w16se="http://schemas.microsoft.com/office/word/2015/wordml/symex" xmlns:wpg="http://schemas.microsoft.com/office/word/2010/wordprocessingGroup" xmlns:wpi="http://schemas.microsoft.com/office/word/2010/wordprocessingInk" xmlns:wne="http://schemas.microsoft.com/office/word/2006/wordml" xmlns:wps="http://schemas.microsoft.com/office/word/2010/wordprocessingShape" mc:Ignorable="w14 w15 w16se wp14">
+<w:footnotes xmlns:wpc="http://schemas.microsoft.com/office/word/2010/wordprocessingCanvas" xmlns:cx="http://schemas.microsoft.com/office/drawing/2014/chartex" xmlns:cx1="http://schemas.microsoft.com/office/drawing/2015/9/8/chartex" xmlns:cx2="http://schemas.microsoft.com/office/drawing/2015/10/21/chartex" xmlns:cx3="http://schemas.microsoft.com/office/drawing/2016/5/9/chartex" xmlns:cx4="http://schemas.microsoft.com/office/drawing/2016/5/10/chartex" xmlns:cx5="http://schemas.microsoft.com/office/drawing/2016/5/11/chartex" xmlns:cx6="http://schemas.microsoft.com/office/drawing/2016/5/12/chartex" xmlns:cx7="http://schemas.microsoft.com/office/drawing/2016/5/13/chartex" xmlns:cx8="http://schemas.microsoft.com/office/drawing/2016/5/14/chartex" xmlns:mc="http://schemas.openxmlformats.org/markup-compatibility/2006" xmlns:aink="http://schemas.microsoft.com/office/drawing/2016/ink" xmlns:am3d="http://schemas.microsoft.com/office/drawing/2017/model3d" xmlns:o="urn:schemas-microsoft-com:office:office" xmlns:oel="http://schemas.microsoft.com/office/2019/extlst" xmlns:r="http://schemas.openxmlformats.org/officeDocument/2006/relationships" xmlns:m="http://schemas.openxmlformats.org/officeDocument/2006/math" xmlns:v="urn:schemas-microsoft-com:vml" xmlns:wp14="http://schemas.microsoft.com/office/word/2010/wordprocessingDrawing" xmlns:wp="http://schemas.openxmlformats.org/drawingml/2006/wordprocessingDrawing" xmlns:w10="urn:schemas-microsoft-com:office:word" xmlns:w="http://schemas.openxmlformats.org/wordprocessingml/2006/main" xmlns:w14="http://schemas.microsoft.com/office/word/2010/wordml" xmlns:w15="http://schemas.microsoft.com/office/word/2012/wordml" xmlns:w16cex="http://schemas.microsoft.com/office/word/2018/wordml/cex" xmlns:w16cid="http://schemas.microsoft.com/office/word/2016/wordml/cid" xmlns:w16="http://schemas.microsoft.com/office/word/2018/wordml" xmlns:w16du="http://schemas.microsoft.com/office/word/2023/wordml/word16du" xmlns:w16sdtdh="http://schemas.microsoft.com/office/word/2020/wordml/sdtdatahash" xmlns:w16sdtfl="http://schemas.microsoft.com/office/word/2024/wordml/sdtformatlock" xmlns:w16se="http://schemas.microsoft.com/office/word/2015/wordml/symex" xmlns:wpg="http://schemas.microsoft.com/office/word/2010/wordprocessingGroup" xmlns:wpi="http://schemas.microsoft.com/office/word/2010/wordprocessingInk" xmlns:wne="http://schemas.microsoft.com/office/word/2006/wordml" xmlns:wps="http://schemas.microsoft.com/office/word/2010/wordprocessingShape" mc:Ignorable="w14 w15 w16se w16cid w16 w16cex w16sdtdh w16sdtfl w16du wp14">
   <w:footnote w:type="separator" w:id="-1">
     <w:p>
       <w:r>
@@ -1918,7 +2696,7 @@
 </file>
 
 <file path=word/header1.xml><?xml version="1.0" encoding="utf-8"?>
-<w:hdr xmlns:wpc="http://schemas.microsoft.com/office/word/2010/wordprocessingCanvas" xmlns:cx="http://schemas.microsoft.com/office/drawing/2014/chartex" xmlns:mc="http://schemas.openxmlformats.org/markup-compatibility/2006" xmlns:o="urn:schemas-microsoft-com:office:office" xmlns:r="http://schemas.openxmlformats.org/officeDocument/2006/relationships" xmlns:m="http://schemas.openxmlformats.org/officeDocument/2006/math" xmlns:v="urn:schemas-microsoft-com:vml" xmlns:wp14="http://schemas.microsoft.com/office/word/2010/wordprocessingDrawing" xmlns:wp="http://schemas.openxmlformats.org/drawingml/2006/wordprocessingDrawing" xmlns:w10="urn:schemas-microsoft-com:office:word" xmlns:w="http://schemas.openxmlformats.org/wordprocessingml/2006/main" xmlns:w14="http://schemas.microsoft.com/office/word/2010/wordml" xmlns:w15="http://schemas.microsoft.com/office/word/2012/wordml" xmlns:w16se="http://schemas.microsoft.com/office/word/2015/wordml/symex" xmlns:wpg="http://schemas.microsoft.com/office/word/2010/wordprocessingGroup" xmlns:wpi="http://schemas.microsoft.com/office/word/2010/wordprocessingInk" xmlns:wne="http://schemas.microsoft.com/office/word/2006/wordml" xmlns:wps="http://schemas.microsoft.com/office/word/2010/wordprocessingShape" mc:Ignorable="w14 w15 w16se wp14">
+<w:hdr xmlns:wpc="http://schemas.microsoft.com/office/word/2010/wordprocessingCanvas" xmlns:cx="http://schemas.microsoft.com/office/drawing/2014/chartex" xmlns:cx1="http://schemas.microsoft.com/office/drawing/2015/9/8/chartex" xmlns:cx2="http://schemas.microsoft.com/office/drawing/2015/10/21/chartex" xmlns:cx3="http://schemas.microsoft.com/office/drawing/2016/5/9/chartex" xmlns:cx4="http://schemas.microsoft.com/office/drawing/2016/5/10/chartex" xmlns:cx5="http://schemas.microsoft.com/office/drawing/2016/5/11/chartex" xmlns:cx6="http://schemas.microsoft.com/office/drawing/2016/5/12/chartex" xmlns:cx7="http://schemas.microsoft.com/office/drawing/2016/5/13/chartex" xmlns:cx8="http://schemas.microsoft.com/office/drawing/2016/5/14/chartex" xmlns:mc="http://schemas.openxmlformats.org/markup-compatibility/2006" xmlns:aink="http://schemas.microsoft.com/office/drawing/2016/ink" xmlns:am3d="http://schemas.microsoft.com/office/drawing/2017/model3d" xmlns:o="urn:schemas-microsoft-com:office:office" xmlns:oel="http://schemas.microsoft.com/office/2019/extlst" xmlns:r="http://schemas.openxmlformats.org/officeDocument/2006/relationships" xmlns:m="http://schemas.openxmlformats.org/officeDocument/2006/math" xmlns:v="urn:schemas-microsoft-com:vml" xmlns:wp14="http://schemas.microsoft.com/office/word/2010/wordprocessingDrawing" xmlns:wp="http://schemas.openxmlformats.org/drawingml/2006/wordprocessingDrawing" xmlns:w10="urn:schemas-microsoft-com:office:word" xmlns:w="http://schemas.openxmlformats.org/wordprocessingml/2006/main" xmlns:w14="http://schemas.microsoft.com/office/word/2010/wordml" xmlns:w15="http://schemas.microsoft.com/office/word/2012/wordml" xmlns:w16cex="http://schemas.microsoft.com/office/word/2018/wordml/cex" xmlns:w16cid="http://schemas.microsoft.com/office/word/2016/wordml/cid" xmlns:w16="http://schemas.microsoft.com/office/word/2018/wordml" xmlns:w16du="http://schemas.microsoft.com/office/word/2023/wordml/word16du" xmlns:w16sdtdh="http://schemas.microsoft.com/office/word/2020/wordml/sdtdatahash" xmlns:w16sdtfl="http://schemas.microsoft.com/office/word/2024/wordml/sdtformatlock" xmlns:w16se="http://schemas.microsoft.com/office/word/2015/wordml/symex" xmlns:wpg="http://schemas.microsoft.com/office/word/2010/wordprocessingGroup" xmlns:wpi="http://schemas.microsoft.com/office/word/2010/wordprocessingInk" xmlns:wne="http://schemas.microsoft.com/office/word/2006/wordml" xmlns:wps="http://schemas.microsoft.com/office/word/2010/wordprocessingShape" mc:Ignorable="w14 w15 w16se w16cid w16 w16cex w16sdtdh w16sdtfl w16du wp14">
   <w:p>
     <w:pPr>
       <w:pStyle w:val="Encabezado"/>
@@ -1995,8 +2773,121 @@
 </file>
 
 <file path=word/numbering.xml><?xml version="1.0" encoding="utf-8"?>
-<w:numbering xmlns:wpc="http://schemas.microsoft.com/office/word/2010/wordprocessingCanvas" xmlns:cx="http://schemas.microsoft.com/office/drawing/2014/chartex" xmlns:mc="http://schemas.openxmlformats.org/markup-compatibility/2006" xmlns:o="urn:schemas-microsoft-com:office:office" xmlns:r="http://schemas.openxmlformats.org/officeDocument/2006/relationships" xmlns:m="http://schemas.openxmlformats.org/officeDocument/2006/math" xmlns:v="urn:schemas-microsoft-com:vml" xmlns:wp14="http://schemas.microsoft.com/office/word/2010/wordprocessingDrawing" xmlns:wp="http://schemas.openxmlformats.org/drawingml/2006/wordprocessingDrawing" xmlns:w10="urn:schemas-microsoft-com:office:word" xmlns:w="http://schemas.openxmlformats.org/wordprocessingml/2006/main" xmlns:w14="http://schemas.microsoft.com/office/word/2010/wordml" xmlns:w15="http://schemas.microsoft.com/office/word/2012/wordml" xmlns:w16se="http://schemas.microsoft.com/office/word/2015/wordml/symex" xmlns:wpg="http://schemas.microsoft.com/office/word/2010/wordprocessingGroup" xmlns:wpi="http://schemas.microsoft.com/office/word/2010/wordprocessingInk" xmlns:wne="http://schemas.microsoft.com/office/word/2006/wordml" xmlns:wps="http://schemas.microsoft.com/office/word/2010/wordprocessingShape" mc:Ignorable="w14 w15 w16se wp14">
+<w:numbering xmlns:wpc="http://schemas.microsoft.com/office/word/2010/wordprocessingCanvas" xmlns:cx="http://schemas.microsoft.com/office/drawing/2014/chartex" xmlns:cx1="http://schemas.microsoft.com/office/drawing/2015/9/8/chartex" xmlns:cx2="http://schemas.microsoft.com/office/drawing/2015/10/21/chartex" xmlns:cx3="http://schemas.microsoft.com/office/drawing/2016/5/9/chartex" xmlns:cx4="http://schemas.microsoft.com/office/drawing/2016/5/10/chartex" xmlns:cx5="http://schemas.microsoft.com/office/drawing/2016/5/11/chartex" xmlns:cx6="http://schemas.microsoft.com/office/drawing/2016/5/12/chartex" xmlns:cx7="http://schemas.microsoft.com/office/drawing/2016/5/13/chartex" xmlns:cx8="http://schemas.microsoft.com/office/drawing/2016/5/14/chartex" xmlns:mc="http://schemas.openxmlformats.org/markup-compatibility/2006" xmlns:aink="http://schemas.microsoft.com/office/drawing/2016/ink" xmlns:am3d="http://schemas.microsoft.com/office/drawing/2017/model3d" xmlns:o="urn:schemas-microsoft-com:office:office" xmlns:oel="http://schemas.microsoft.com/office/2019/extlst" xmlns:r="http://schemas.openxmlformats.org/officeDocument/2006/relationships" xmlns:m="http://schemas.openxmlformats.org/officeDocument/2006/math" xmlns:v="urn:schemas-microsoft-com:vml" xmlns:wp14="http://schemas.microsoft.com/office/word/2010/wordprocessingDrawing" xmlns:wp="http://schemas.openxmlformats.org/drawingml/2006/wordprocessingDrawing" xmlns:w10="urn:schemas-microsoft-com:office:word" xmlns:w="http://schemas.openxmlformats.org/wordprocessingml/2006/main" xmlns:w14="http://schemas.microsoft.com/office/word/2010/wordml" xmlns:w15="http://schemas.microsoft.com/office/word/2012/wordml" xmlns:w16cex="http://schemas.microsoft.com/office/word/2018/wordml/cex" xmlns:w16cid="http://schemas.microsoft.com/office/word/2016/wordml/cid" xmlns:w16="http://schemas.microsoft.com/office/word/2018/wordml" xmlns:w16du="http://schemas.microsoft.com/office/word/2023/wordml/word16du" xmlns:w16sdtdh="http://schemas.microsoft.com/office/word/2020/wordml/sdtdatahash" xmlns:w16sdtfl="http://schemas.microsoft.com/office/word/2024/wordml/sdtformatlock" xmlns:w16se="http://schemas.microsoft.com/office/word/2015/wordml/symex" xmlns:wpg="http://schemas.microsoft.com/office/word/2010/wordprocessingGroup" xmlns:wpi="http://schemas.microsoft.com/office/word/2010/wordprocessingInk" xmlns:wne="http://schemas.microsoft.com/office/word/2006/wordml" xmlns:wps="http://schemas.microsoft.com/office/word/2010/wordprocessingShape" mc:Ignorable="w14 w15 w16se w16cid w16 w16cex w16sdtdh w16sdtfl w16du wp14">
   <w:abstractNum w:abstractNumId="0" w15:restartNumberingAfterBreak="0">
+    <w:nsid w:val="495B5C67"/>
+    <w:multiLevelType w:val="hybridMultilevel"/>
+    <w:tmpl w:val="F4FE731E"/>
+    <w:lvl w:ilvl="0" w:tplc="280A000B">
+      <w:start w:val="1"/>
+      <w:numFmt w:val="bullet"/>
+      <w:lvlText w:val=""/>
+      <w:lvlJc w:val="left"/>
+      <w:pPr>
+        <w:ind w:left="1367" w:hanging="360"/>
+      </w:pPr>
+      <w:rPr>
+        <w:rFonts w:ascii="Wingdings" w:hAnsi="Wingdings" w:hint="default"/>
+      </w:rPr>
+    </w:lvl>
+    <w:lvl w:ilvl="1" w:tplc="280A0003" w:tentative="1">
+      <w:start w:val="1"/>
+      <w:numFmt w:val="bullet"/>
+      <w:lvlText w:val="o"/>
+      <w:lvlJc w:val="left"/>
+      <w:pPr>
+        <w:ind w:left="2087" w:hanging="360"/>
+      </w:pPr>
+      <w:rPr>
+        <w:rFonts w:ascii="Courier New" w:hAnsi="Courier New" w:cs="Courier New" w:hint="default"/>
+      </w:rPr>
+    </w:lvl>
+    <w:lvl w:ilvl="2" w:tplc="280A0005" w:tentative="1">
+      <w:start w:val="1"/>
+      <w:numFmt w:val="bullet"/>
+      <w:lvlText w:val=""/>
+      <w:lvlJc w:val="left"/>
+      <w:pPr>
+        <w:ind w:left="2807" w:hanging="360"/>
+      </w:pPr>
+      <w:rPr>
+        <w:rFonts w:ascii="Wingdings" w:hAnsi="Wingdings" w:hint="default"/>
+      </w:rPr>
+    </w:lvl>
+    <w:lvl w:ilvl="3" w:tplc="280A0001" w:tentative="1">
+      <w:start w:val="1"/>
+      <w:numFmt w:val="bullet"/>
+      <w:lvlText w:val=""/>
+      <w:lvlJc w:val="left"/>
+      <w:pPr>
+        <w:ind w:left="3527" w:hanging="360"/>
+      </w:pPr>
+      <w:rPr>
+        <w:rFonts w:ascii="Symbol" w:hAnsi="Symbol" w:hint="default"/>
+      </w:rPr>
+    </w:lvl>
+    <w:lvl w:ilvl="4" w:tplc="280A0003" w:tentative="1">
+      <w:start w:val="1"/>
+      <w:numFmt w:val="bullet"/>
+      <w:lvlText w:val="o"/>
+      <w:lvlJc w:val="left"/>
+      <w:pPr>
+        <w:ind w:left="4247" w:hanging="360"/>
+      </w:pPr>
+      <w:rPr>
+        <w:rFonts w:ascii="Courier New" w:hAnsi="Courier New" w:cs="Courier New" w:hint="default"/>
+      </w:rPr>
+    </w:lvl>
+    <w:lvl w:ilvl="5" w:tplc="280A0005" w:tentative="1">
+      <w:start w:val="1"/>
+      <w:numFmt w:val="bullet"/>
+      <w:lvlText w:val=""/>
+      <w:lvlJc w:val="left"/>
+      <w:pPr>
+        <w:ind w:left="4967" w:hanging="360"/>
+      </w:pPr>
+      <w:rPr>
+        <w:rFonts w:ascii="Wingdings" w:hAnsi="Wingdings" w:hint="default"/>
+      </w:rPr>
+    </w:lvl>
+    <w:lvl w:ilvl="6" w:tplc="280A0001" w:tentative="1">
+      <w:start w:val="1"/>
+      <w:numFmt w:val="bullet"/>
+      <w:lvlText w:val=""/>
+      <w:lvlJc w:val="left"/>
+      <w:pPr>
+        <w:ind w:left="5687" w:hanging="360"/>
+      </w:pPr>
+      <w:rPr>
+        <w:rFonts w:ascii="Symbol" w:hAnsi="Symbol" w:hint="default"/>
+      </w:rPr>
+    </w:lvl>
+    <w:lvl w:ilvl="7" w:tplc="280A0003" w:tentative="1">
+      <w:start w:val="1"/>
+      <w:numFmt w:val="bullet"/>
+      <w:lvlText w:val="o"/>
+      <w:lvlJc w:val="left"/>
+      <w:pPr>
+        <w:ind w:left="6407" w:hanging="360"/>
+      </w:pPr>
+      <w:rPr>
+        <w:rFonts w:ascii="Courier New" w:hAnsi="Courier New" w:cs="Courier New" w:hint="default"/>
+      </w:rPr>
+    </w:lvl>
+    <w:lvl w:ilvl="8" w:tplc="280A0005" w:tentative="1">
+      <w:start w:val="1"/>
+      <w:numFmt w:val="bullet"/>
+      <w:lvlText w:val=""/>
+      <w:lvlJc w:val="left"/>
+      <w:pPr>
+        <w:ind w:left="7127" w:hanging="360"/>
+      </w:pPr>
+      <w:rPr>
+        <w:rFonts w:ascii="Wingdings" w:hAnsi="Wingdings" w:hint="default"/>
+      </w:rPr>
+    </w:lvl>
+  </w:abstractNum>
+  <w:abstractNum w:abstractNumId="1" w15:restartNumberingAfterBreak="0">
     <w:nsid w:val="568B6821"/>
     <w:multiLevelType w:val="hybridMultilevel"/>
     <w:tmpl w:val="0BF891BE"/>
@@ -2118,7 +3009,7 @@
       </w:rPr>
     </w:lvl>
   </w:abstractNum>
-  <w:abstractNum w:abstractNumId="1" w15:restartNumberingAfterBreak="0">
+  <w:abstractNum w:abstractNumId="2" w15:restartNumberingAfterBreak="0">
     <w:nsid w:val="77D44D8A"/>
     <w:multiLevelType w:val="hybridMultilevel"/>
     <w:tmpl w:val="FBB4E244"/>
@@ -2204,17 +3095,20 @@
       </w:pPr>
     </w:lvl>
   </w:abstractNum>
-  <w:num w:numId="1">
+  <w:num w:numId="1" w16cid:durableId="144736227">
+    <w:abstractNumId w:val="1"/>
+  </w:num>
+  <w:num w:numId="2" w16cid:durableId="1239711364">
+    <w:abstractNumId w:val="2"/>
+  </w:num>
+  <w:num w:numId="3" w16cid:durableId="944117210">
     <w:abstractNumId w:val="0"/>
-  </w:num>
-  <w:num w:numId="2">
-    <w:abstractNumId w:val="1"/>
   </w:num>
 </w:numbering>
 </file>
 
 <file path=word/styles.xml><?xml version="1.0" encoding="utf-8"?>
-<w:styles xmlns:mc="http://schemas.openxmlformats.org/markup-compatibility/2006" xmlns:r="http://schemas.openxmlformats.org/officeDocument/2006/relationships" xmlns:w="http://schemas.openxmlformats.org/wordprocessingml/2006/main" xmlns:w14="http://schemas.microsoft.com/office/word/2010/wordml" xmlns:w15="http://schemas.microsoft.com/office/word/2012/wordml" xmlns:w16se="http://schemas.microsoft.com/office/word/2015/wordml/symex" mc:Ignorable="w14 w15 w16se">
+<w:styles xmlns:mc="http://schemas.openxmlformats.org/markup-compatibility/2006" xmlns:r="http://schemas.openxmlformats.org/officeDocument/2006/relationships" xmlns:w="http://schemas.openxmlformats.org/wordprocessingml/2006/main" xmlns:w14="http://schemas.microsoft.com/office/word/2010/wordml" xmlns:w15="http://schemas.microsoft.com/office/word/2012/wordml" xmlns:w16cex="http://schemas.microsoft.com/office/word/2018/wordml/cex" xmlns:w16cid="http://schemas.microsoft.com/office/word/2016/wordml/cid" xmlns:w16="http://schemas.microsoft.com/office/word/2018/wordml" xmlns:w16du="http://schemas.microsoft.com/office/word/2023/wordml/word16du" xmlns:w16sdtdh="http://schemas.microsoft.com/office/word/2020/wordml/sdtdatahash" xmlns:w16sdtfl="http://schemas.microsoft.com/office/word/2024/wordml/sdtformatlock" xmlns:w16se="http://schemas.microsoft.com/office/word/2015/wordml/symex" mc:Ignorable="w14 w15 w16se w16cid w16 w16cex w16sdtdh w16sdtfl w16du">
   <w:docDefaults>
     <w:rPrDefault>
       <w:rPr>
@@ -2232,7 +3126,7 @@
       </w:pPr>
     </w:pPrDefault>
   </w:docDefaults>
-  <w:latentStyles w:defLockedState="0" w:defUIPriority="99" w:defSemiHidden="0" w:defUnhideWhenUsed="0" w:defQFormat="0" w:count="371">
+  <w:latentStyles w:defLockedState="0" w:defUIPriority="99" w:defSemiHidden="0" w:defUnhideWhenUsed="0" w:defQFormat="0" w:count="376">
     <w:lsdException w:name="Normal" w:uiPriority="0" w:qFormat="1"/>
     <w:lsdException w:name="heading 1" w:uiPriority="9" w:qFormat="1"/>
     <w:lsdException w:name="heading 2" w:semiHidden="1" w:uiPriority="9" w:unhideWhenUsed="1" w:qFormat="1"/>
@@ -2604,6 +3498,11 @@
     <w:lsdException w:name="List Table 5 Dark Accent 6" w:uiPriority="50"/>
     <w:lsdException w:name="List Table 6 Colorful Accent 6" w:uiPriority="51"/>
     <w:lsdException w:name="List Table 7 Colorful Accent 6" w:uiPriority="52"/>
+    <w:lsdException w:name="Mention" w:semiHidden="1" w:unhideWhenUsed="1"/>
+    <w:lsdException w:name="Smart Hyperlink" w:semiHidden="1" w:unhideWhenUsed="1"/>
+    <w:lsdException w:name="Hashtag" w:semiHidden="1" w:unhideWhenUsed="1"/>
+    <w:lsdException w:name="Unresolved Mention" w:semiHidden="1" w:unhideWhenUsed="1"/>
+    <w:lsdException w:name="Smart Link" w:semiHidden="1" w:unhideWhenUsed="1"/>
   </w:latentStyles>
   <w:style w:type="paragraph" w:default="1" w:styleId="Normal">
     <w:name w:val="Normal"/>
@@ -2617,6 +3516,7 @@
   <w:style w:type="paragraph" w:styleId="Ttulo1">
     <w:name w:val="heading 1"/>
     <w:basedOn w:val="Normal"/>
+    <w:link w:val="Ttulo1Car"/>
     <w:uiPriority w:val="1"/>
     <w:qFormat/>
     <w:pPr>
@@ -2635,7 +3535,6 @@
   <w:style w:type="character" w:default="1" w:styleId="Fuentedeprrafopredeter">
     <w:name w:val="Default Paragraph Font"/>
     <w:uiPriority w:val="1"/>
-    <w:semiHidden/>
     <w:unhideWhenUsed/>
   </w:style>
   <w:style w:type="table" w:default="1" w:styleId="Tablanormal">
@@ -2678,6 +3577,7 @@
   <w:style w:type="paragraph" w:styleId="Textoindependiente">
     <w:name w:val="Body Text"/>
     <w:basedOn w:val="Normal"/>
+    <w:link w:val="TextoindependienteCar"/>
     <w:uiPriority w:val="1"/>
     <w:qFormat/>
     <w:rPr>
@@ -2704,7 +3604,7 @@
   <w:style w:type="paragraph" w:styleId="Prrafodelista">
     <w:name w:val="List Paragraph"/>
     <w:basedOn w:val="Normal"/>
-    <w:uiPriority w:val="1"/>
+    <w:uiPriority w:val="34"/>
     <w:qFormat/>
     <w:pPr>
       <w:spacing w:before="224"/>
@@ -2787,6 +3687,34 @@
       <w:sz w:val="24"/>
       <w:szCs w:val="24"/>
       <w:lang w:val="es-PE"/>
+    </w:rPr>
+  </w:style>
+  <w:style w:type="character" w:customStyle="1" w:styleId="Ttulo1Car">
+    <w:name w:val="Título 1 Car"/>
+    <w:basedOn w:val="Fuentedeprrafopredeter"/>
+    <w:link w:val="Ttulo1"/>
+    <w:uiPriority w:val="1"/>
+    <w:rsid w:val="002C7A21"/>
+    <w:rPr>
+      <w:rFonts w:ascii="Arial" w:eastAsia="Arial" w:hAnsi="Arial" w:cs="Arial"/>
+      <w:b/>
+      <w:bCs/>
+      <w:sz w:val="20"/>
+      <w:szCs w:val="20"/>
+      <w:lang w:val="es-ES"/>
+    </w:rPr>
+  </w:style>
+  <w:style w:type="character" w:customStyle="1" w:styleId="TextoindependienteCar">
+    <w:name w:val="Texto independiente Car"/>
+    <w:basedOn w:val="Fuentedeprrafopredeter"/>
+    <w:link w:val="Textoindependiente"/>
+    <w:uiPriority w:val="1"/>
+    <w:rsid w:val="002C7A21"/>
+    <w:rPr>
+      <w:rFonts w:ascii="Arial MT" w:eastAsia="Arial MT" w:hAnsi="Arial MT" w:cs="Arial MT"/>
+      <w:sz w:val="20"/>
+      <w:szCs w:val="20"/>
+      <w:lang w:val="es-ES"/>
     </w:rPr>
   </w:style>
 </w:styles>

</xml_diff>

<commit_message>
Actualización de campos en el modelo TDR para incluir actividades administrativas
</commit_message>
<xml_diff>
--- a/Modelos_documentos/tdr_administrativo.docx
+++ b/Modelos_documentos/tdr_administrativo.docx
@@ -1,6 +1,6 @@
 
 <file path=word/document.xml><?xml version="1.0" encoding="utf-8"?>
-<w:document xmlns:wpc="http://schemas.microsoft.com/office/word/2010/wordprocessingCanvas" xmlns:cx="http://schemas.microsoft.com/office/drawing/2014/chartex" xmlns:cx1="http://schemas.microsoft.com/office/drawing/2015/9/8/chartex" xmlns:cx2="http://schemas.microsoft.com/office/drawing/2015/10/21/chartex" xmlns:cx3="http://schemas.microsoft.com/office/drawing/2016/5/9/chartex" xmlns:cx4="http://schemas.microsoft.com/office/drawing/2016/5/10/chartex" xmlns:cx5="http://schemas.microsoft.com/office/drawing/2016/5/11/chartex" xmlns:cx6="http://schemas.microsoft.com/office/drawing/2016/5/12/chartex" xmlns:cx7="http://schemas.microsoft.com/office/drawing/2016/5/13/chartex" xmlns:cx8="http://schemas.microsoft.com/office/drawing/2016/5/14/chartex" xmlns:mc="http://schemas.openxmlformats.org/markup-compatibility/2006" xmlns:aink="http://schemas.microsoft.com/office/drawing/2016/ink" xmlns:am3d="http://schemas.microsoft.com/office/drawing/2017/model3d" xmlns:o="urn:schemas-microsoft-com:office:office" xmlns:oel="http://schemas.microsoft.com/office/2019/extlst" xmlns:r="http://schemas.openxmlformats.org/officeDocument/2006/relationships" xmlns:m="http://schemas.openxmlformats.org/officeDocument/2006/math" xmlns:v="urn:schemas-microsoft-com:vml" xmlns:wp14="http://schemas.microsoft.com/office/word/2010/wordprocessingDrawing" xmlns:wp="http://schemas.openxmlformats.org/drawingml/2006/wordprocessingDrawing" xmlns:w10="urn:schemas-microsoft-com:office:word" xmlns:w="http://schemas.openxmlformats.org/wordprocessingml/2006/main" xmlns:w14="http://schemas.microsoft.com/office/word/2010/wordml" xmlns:w15="http://schemas.microsoft.com/office/word/2012/wordml" xmlns:w16cex="http://schemas.microsoft.com/office/word/2018/wordml/cex" xmlns:w16cid="http://schemas.microsoft.com/office/word/2016/wordml/cid" xmlns:w16="http://schemas.microsoft.com/office/word/2018/wordml" xmlns:w16du="http://schemas.microsoft.com/office/word/2023/wordml/word16du" xmlns:w16sdtdh="http://schemas.microsoft.com/office/word/2020/wordml/sdtdatahash" xmlns:w16sdtfl="http://schemas.microsoft.com/office/word/2024/wordml/sdtformatlock" xmlns:w16se="http://schemas.microsoft.com/office/word/2015/wordml/symex" xmlns:wpg="http://schemas.microsoft.com/office/word/2010/wordprocessingGroup" xmlns:wpi="http://schemas.microsoft.com/office/word/2010/wordprocessingInk" xmlns:wne="http://schemas.microsoft.com/office/word/2006/wordml" xmlns:wps="http://schemas.microsoft.com/office/word/2010/wordprocessingShape" mc:Ignorable="w14 w15 w16se w16cid w16 w16cex w16sdtdh w16sdtfl w16du wp14">
+<w:document xmlns:wpc="http://schemas.microsoft.com/office/word/2010/wordprocessingCanvas" xmlns:cx="http://schemas.microsoft.com/office/drawing/2014/chartex" xmlns:cx1="http://schemas.microsoft.com/office/drawing/2015/9/8/chartex" xmlns:cx2="http://schemas.microsoft.com/office/drawing/2015/10/21/chartex" xmlns:cx3="http://schemas.microsoft.com/office/drawing/2016/5/9/chartex" xmlns:cx4="http://schemas.microsoft.com/office/drawing/2016/5/10/chartex" xmlns:cx5="http://schemas.microsoft.com/office/drawing/2016/5/11/chartex" xmlns:cx6="http://schemas.microsoft.com/office/drawing/2016/5/12/chartex" xmlns:cx7="http://schemas.microsoft.com/office/drawing/2016/5/13/chartex" xmlns:cx8="http://schemas.microsoft.com/office/drawing/2016/5/14/chartex" xmlns:mc="http://schemas.openxmlformats.org/markup-compatibility/2006" xmlns:aink="http://schemas.microsoft.com/office/drawing/2016/ink" xmlns:am3d="http://schemas.microsoft.com/office/drawing/2017/model3d" xmlns:o="urn:schemas-microsoft-com:office:office" xmlns:oel="http://schemas.microsoft.com/office/2019/extlst" xmlns:r="http://schemas.openxmlformats.org/officeDocument/2006/relationships" xmlns:m="http://schemas.openxmlformats.org/officeDocument/2006/math" xmlns:v="urn:schemas-microsoft-com:vml" xmlns:wp14="http://schemas.microsoft.com/office/word/2010/wordprocessingDrawing" xmlns:wp="http://schemas.openxmlformats.org/drawingml/2006/wordprocessingDrawing" xmlns:w10="urn:schemas-microsoft-com:office:word" xmlns:w="http://schemas.openxmlformats.org/wordprocessingml/2006/main" xmlns:w14="http://schemas.microsoft.com/office/word/2010/wordml" xmlns:w15="http://schemas.microsoft.com/office/word/2012/wordml" xmlns:w16cex="http://schemas.microsoft.com/office/word/2018/wordml/cex" xmlns:w16cid="http://schemas.microsoft.com/office/word/2016/wordml/cid" xmlns:w16="http://schemas.microsoft.com/office/word/2018/wordml" xmlns:w16sdtdh="http://schemas.microsoft.com/office/word/2020/wordml/sdtdatahash" xmlns:w16se="http://schemas.microsoft.com/office/word/2015/wordml/symex" xmlns:wpg="http://schemas.microsoft.com/office/word/2010/wordprocessingGroup" xmlns:wpi="http://schemas.microsoft.com/office/word/2010/wordprocessingInk" xmlns:wne="http://schemas.microsoft.com/office/word/2006/wordml" xmlns:wps="http://schemas.microsoft.com/office/word/2010/wordprocessingShape" mc:Ignorable="w14 w15 w16se w16cid w16 w16cex w16sdtdh wp14">
   <w:body>
     <w:p>
       <w:pPr>
@@ -175,6 +175,7 @@
           <w:b w:val="0"/>
         </w:rPr>
       </w:pPr>
+      <w:proofErr w:type="spellStart"/>
       <w:r>
         <w:rPr>
           <w:rFonts w:ascii="Garamond" w:hAnsi="Garamond"/>
@@ -183,6 +184,7 @@
         </w:rPr>
         <w:t>descripcion</w:t>
       </w:r>
+      <w:proofErr w:type="spellEnd"/>
       <w:r>
         <w:rPr>
           <w:rFonts w:ascii="Garamond" w:hAnsi="Garamond"/>
@@ -829,7 +831,6 @@
           <w:szCs w:val="20"/>
         </w:rPr>
       </w:pPr>
-      <w:proofErr w:type="gramStart"/>
       <w:r>
         <w:rPr>
           <w:rFonts w:ascii="Garamond" w:hAnsi="Garamond"/>
@@ -858,42 +859,39 @@
           <w:sz w:val="20"/>
           <w:szCs w:val="20"/>
         </w:rPr>
-        <w:t>REALIZAR</w:t>
-      </w:r>
-      <w:proofErr w:type="gramEnd"/>
-      <w:r>
-        <w:rPr>
-          <w:rFonts w:ascii="Garamond" w:hAnsi="Garamond"/>
-          <w:b/>
-          <w:spacing w:val="-2"/>
+        <w:t>REALIZAR:</w:t>
+      </w:r>
+    </w:p>
+    <w:p>
+      <w:pPr>
+        <w:pStyle w:val="Prrafodelista"/>
+        <w:tabs>
+          <w:tab w:val="left" w:pos="567"/>
+        </w:tabs>
+        <w:spacing w:before="0" w:line="276" w:lineRule="auto"/>
+        <w:ind w:left="0" w:firstLine="0"/>
+        <w:rPr>
+          <w:rFonts w:ascii="Garamond" w:hAnsi="Garamond"/>
           <w:sz w:val="20"/>
           <w:szCs w:val="20"/>
         </w:rPr>
-        <w:t>:</w:t>
-      </w:r>
-    </w:p>
-    <w:p>
-      <w:pPr>
-        <w:pStyle w:val="Prrafodelista"/>
-        <w:tabs>
-          <w:tab w:val="left" w:pos="567"/>
-        </w:tabs>
-        <w:spacing w:before="0" w:line="276" w:lineRule="auto"/>
-        <w:ind w:left="0" w:firstLine="0"/>
+      </w:pPr>
+      <w:proofErr w:type="spellStart"/>
+      <w:r>
         <w:rPr>
           <w:rFonts w:ascii="Garamond" w:hAnsi="Garamond"/>
           <w:sz w:val="20"/>
           <w:szCs w:val="20"/>
         </w:rPr>
-      </w:pPr>
-      <w:proofErr w:type="spellStart"/>
+        <w:t>actividades_</w:t>
+      </w:r>
       <w:r>
         <w:rPr>
           <w:rFonts w:ascii="Garamond" w:hAnsi="Garamond"/>
           <w:sz w:val="20"/>
           <w:szCs w:val="20"/>
         </w:rPr>
-        <w:t>actividades_docentes</w:t>
+        <w:t>admin</w:t>
       </w:r>
       <w:proofErr w:type="spellEnd"/>
     </w:p>
@@ -1826,25 +1824,7 @@
           <w:b w:val="0"/>
           <w:bCs w:val="0"/>
         </w:rPr>
-        <w:t xml:space="preserve">En caso de retraso injustificado del proveedor en la ejecución de las prestaciones objeto del contrato, la Entidad le aplica automáticamente una penalidad por mora por cada día de atraso. La penalidad se aplica automáticamente y se calcula </w:t>
-      </w:r>
-      <w:proofErr w:type="gramStart"/>
-      <w:r>
-        <w:rPr>
-          <w:rFonts w:ascii="Garamond" w:hAnsi="Garamond"/>
-          <w:b w:val="0"/>
-          <w:bCs w:val="0"/>
-        </w:rPr>
-        <w:t>de acuerdo a</w:t>
-      </w:r>
-      <w:proofErr w:type="gramEnd"/>
-      <w:r>
-        <w:rPr>
-          <w:rFonts w:ascii="Garamond" w:hAnsi="Garamond"/>
-          <w:b w:val="0"/>
-          <w:bCs w:val="0"/>
-        </w:rPr>
-        <w:t xml:space="preserve"> la siguiente fórmula: </w:t>
+        <w:t xml:space="preserve">En caso de retraso injustificado del proveedor en la ejecución de las prestaciones objeto del contrato, la Entidad le aplica automáticamente una penalidad por mora por cada día de atraso. La penalidad se aplica automáticamente y se calcula de acuerdo a la siguiente fórmula: </w:t>
       </w:r>
     </w:p>
     <w:p>
@@ -2171,12 +2151,6 @@
         <w:t>categoria</w:t>
       </w:r>
       <w:proofErr w:type="spellEnd"/>
-      <w:r>
-        <w:rPr>
-          <w:rFonts w:ascii="Garamond" w:hAnsi="Garamond"/>
-        </w:rPr>
-        <w:t>.</w:t>
-      </w:r>
     </w:p>
     <w:p>
       <w:pPr>
@@ -2215,13 +2189,6 @@
         <w:t>monto_subtotal</w:t>
       </w:r>
       <w:proofErr w:type="spellEnd"/>
-      <w:r>
-        <w:rPr>
-          <w:rFonts w:ascii="Garamond" w:hAnsi="Garamond"/>
-          <w:b w:val="0"/>
-        </w:rPr>
-        <w:t>.</w:t>
-      </w:r>
     </w:p>
     <w:p>
       <w:pPr>
@@ -2600,8 +2567,33 @@
           <w:rFonts w:ascii="Garamond" w:hAnsi="Garamond"/>
           <w:b/>
         </w:rPr>
-        <w:t>Dr. Guillaume Yannick Serge Oisel</w:t>
-      </w:r>
+        <w:t xml:space="preserve">Dr. Guillaume </w:t>
+      </w:r>
+      <w:proofErr w:type="spellStart"/>
+      <w:r>
+        <w:rPr>
+          <w:rFonts w:ascii="Garamond" w:hAnsi="Garamond"/>
+          <w:b/>
+        </w:rPr>
+        <w:t>Yannick</w:t>
+      </w:r>
+      <w:proofErr w:type="spellEnd"/>
+      <w:r>
+        <w:rPr>
+          <w:rFonts w:ascii="Garamond" w:hAnsi="Garamond"/>
+          <w:b/>
+        </w:rPr>
+        <w:t xml:space="preserve"> Serge </w:t>
+      </w:r>
+      <w:proofErr w:type="spellStart"/>
+      <w:r>
+        <w:rPr>
+          <w:rFonts w:ascii="Garamond" w:hAnsi="Garamond"/>
+          <w:b/>
+        </w:rPr>
+        <w:t>Oisel</w:t>
+      </w:r>
+      <w:proofErr w:type="spellEnd"/>
     </w:p>
     <w:p>
       <w:pPr>
@@ -2658,7 +2650,7 @@
 </file>
 
 <file path=word/endnotes.xml><?xml version="1.0" encoding="utf-8"?>
-<w:endnotes xmlns:wpc="http://schemas.microsoft.com/office/word/2010/wordprocessingCanvas" xmlns:cx="http://schemas.microsoft.com/office/drawing/2014/chartex" xmlns:cx1="http://schemas.microsoft.com/office/drawing/2015/9/8/chartex" xmlns:cx2="http://schemas.microsoft.com/office/drawing/2015/10/21/chartex" xmlns:cx3="http://schemas.microsoft.com/office/drawing/2016/5/9/chartex" xmlns:cx4="http://schemas.microsoft.com/office/drawing/2016/5/10/chartex" xmlns:cx5="http://schemas.microsoft.com/office/drawing/2016/5/11/chartex" xmlns:cx6="http://schemas.microsoft.com/office/drawing/2016/5/12/chartex" xmlns:cx7="http://schemas.microsoft.com/office/drawing/2016/5/13/chartex" xmlns:cx8="http://schemas.microsoft.com/office/drawing/2016/5/14/chartex" xmlns:mc="http://schemas.openxmlformats.org/markup-compatibility/2006" xmlns:aink="http://schemas.microsoft.com/office/drawing/2016/ink" xmlns:am3d="http://schemas.microsoft.com/office/drawing/2017/model3d" xmlns:o="urn:schemas-microsoft-com:office:office" xmlns:oel="http://schemas.microsoft.com/office/2019/extlst" xmlns:r="http://schemas.openxmlformats.org/officeDocument/2006/relationships" xmlns:m="http://schemas.openxmlformats.org/officeDocument/2006/math" xmlns:v="urn:schemas-microsoft-com:vml" xmlns:wp14="http://schemas.microsoft.com/office/word/2010/wordprocessingDrawing" xmlns:wp="http://schemas.openxmlformats.org/drawingml/2006/wordprocessingDrawing" xmlns:w10="urn:schemas-microsoft-com:office:word" xmlns:w="http://schemas.openxmlformats.org/wordprocessingml/2006/main" xmlns:w14="http://schemas.microsoft.com/office/word/2010/wordml" xmlns:w15="http://schemas.microsoft.com/office/word/2012/wordml" xmlns:w16cex="http://schemas.microsoft.com/office/word/2018/wordml/cex" xmlns:w16cid="http://schemas.microsoft.com/office/word/2016/wordml/cid" xmlns:w16="http://schemas.microsoft.com/office/word/2018/wordml" xmlns:w16du="http://schemas.microsoft.com/office/word/2023/wordml/word16du" xmlns:w16sdtdh="http://schemas.microsoft.com/office/word/2020/wordml/sdtdatahash" xmlns:w16sdtfl="http://schemas.microsoft.com/office/word/2024/wordml/sdtformatlock" xmlns:w16se="http://schemas.microsoft.com/office/word/2015/wordml/symex" xmlns:wpg="http://schemas.microsoft.com/office/word/2010/wordprocessingGroup" xmlns:wpi="http://schemas.microsoft.com/office/word/2010/wordprocessingInk" xmlns:wne="http://schemas.microsoft.com/office/word/2006/wordml" xmlns:wps="http://schemas.microsoft.com/office/word/2010/wordprocessingShape" mc:Ignorable="w14 w15 w16se w16cid w16 w16cex w16sdtdh w16sdtfl w16du wp14">
+<w:endnotes xmlns:wpc="http://schemas.microsoft.com/office/word/2010/wordprocessingCanvas" xmlns:cx="http://schemas.microsoft.com/office/drawing/2014/chartex" xmlns:cx1="http://schemas.microsoft.com/office/drawing/2015/9/8/chartex" xmlns:cx2="http://schemas.microsoft.com/office/drawing/2015/10/21/chartex" xmlns:cx3="http://schemas.microsoft.com/office/drawing/2016/5/9/chartex" xmlns:cx4="http://schemas.microsoft.com/office/drawing/2016/5/10/chartex" xmlns:cx5="http://schemas.microsoft.com/office/drawing/2016/5/11/chartex" xmlns:cx6="http://schemas.microsoft.com/office/drawing/2016/5/12/chartex" xmlns:cx7="http://schemas.microsoft.com/office/drawing/2016/5/13/chartex" xmlns:cx8="http://schemas.microsoft.com/office/drawing/2016/5/14/chartex" xmlns:mc="http://schemas.openxmlformats.org/markup-compatibility/2006" xmlns:aink="http://schemas.microsoft.com/office/drawing/2016/ink" xmlns:am3d="http://schemas.microsoft.com/office/drawing/2017/model3d" xmlns:o="urn:schemas-microsoft-com:office:office" xmlns:oel="http://schemas.microsoft.com/office/2019/extlst" xmlns:r="http://schemas.openxmlformats.org/officeDocument/2006/relationships" xmlns:m="http://schemas.openxmlformats.org/officeDocument/2006/math" xmlns:v="urn:schemas-microsoft-com:vml" xmlns:wp14="http://schemas.microsoft.com/office/word/2010/wordprocessingDrawing" xmlns:wp="http://schemas.openxmlformats.org/drawingml/2006/wordprocessingDrawing" xmlns:w10="urn:schemas-microsoft-com:office:word" xmlns:w="http://schemas.openxmlformats.org/wordprocessingml/2006/main" xmlns:w14="http://schemas.microsoft.com/office/word/2010/wordml" xmlns:w15="http://schemas.microsoft.com/office/word/2012/wordml" xmlns:w16cex="http://schemas.microsoft.com/office/word/2018/wordml/cex" xmlns:w16cid="http://schemas.microsoft.com/office/word/2016/wordml/cid" xmlns:w16="http://schemas.microsoft.com/office/word/2018/wordml" xmlns:w16sdtdh="http://schemas.microsoft.com/office/word/2020/wordml/sdtdatahash" xmlns:w16se="http://schemas.microsoft.com/office/word/2015/wordml/symex" xmlns:wpg="http://schemas.microsoft.com/office/word/2010/wordprocessingGroup" xmlns:wpi="http://schemas.microsoft.com/office/word/2010/wordprocessingInk" xmlns:wne="http://schemas.microsoft.com/office/word/2006/wordml" xmlns:wps="http://schemas.microsoft.com/office/word/2010/wordprocessingShape" mc:Ignorable="w14 w15 w16se w16cid w16 w16cex w16sdtdh wp14">
   <w:endnote w:type="separator" w:id="-1">
     <w:p>
       <w:r>
@@ -2677,7 +2669,7 @@
 </file>
 
 <file path=word/footnotes.xml><?xml version="1.0" encoding="utf-8"?>
-<w:footnotes xmlns:wpc="http://schemas.microsoft.com/office/word/2010/wordprocessingCanvas" xmlns:cx="http://schemas.microsoft.com/office/drawing/2014/chartex" xmlns:cx1="http://schemas.microsoft.com/office/drawing/2015/9/8/chartex" xmlns:cx2="http://schemas.microsoft.com/office/drawing/2015/10/21/chartex" xmlns:cx3="http://schemas.microsoft.com/office/drawing/2016/5/9/chartex" xmlns:cx4="http://schemas.microsoft.com/office/drawing/2016/5/10/chartex" xmlns:cx5="http://schemas.microsoft.com/office/drawing/2016/5/11/chartex" xmlns:cx6="http://schemas.microsoft.com/office/drawing/2016/5/12/chartex" xmlns:cx7="http://schemas.microsoft.com/office/drawing/2016/5/13/chartex" xmlns:cx8="http://schemas.microsoft.com/office/drawing/2016/5/14/chartex" xmlns:mc="http://schemas.openxmlformats.org/markup-compatibility/2006" xmlns:aink="http://schemas.microsoft.com/office/drawing/2016/ink" xmlns:am3d="http://schemas.microsoft.com/office/drawing/2017/model3d" xmlns:o="urn:schemas-microsoft-com:office:office" xmlns:oel="http://schemas.microsoft.com/office/2019/extlst" xmlns:r="http://schemas.openxmlformats.org/officeDocument/2006/relationships" xmlns:m="http://schemas.openxmlformats.org/officeDocument/2006/math" xmlns:v="urn:schemas-microsoft-com:vml" xmlns:wp14="http://schemas.microsoft.com/office/word/2010/wordprocessingDrawing" xmlns:wp="http://schemas.openxmlformats.org/drawingml/2006/wordprocessingDrawing" xmlns:w10="urn:schemas-microsoft-com:office:word" xmlns:w="http://schemas.openxmlformats.org/wordprocessingml/2006/main" xmlns:w14="http://schemas.microsoft.com/office/word/2010/wordml" xmlns:w15="http://schemas.microsoft.com/office/word/2012/wordml" xmlns:w16cex="http://schemas.microsoft.com/office/word/2018/wordml/cex" xmlns:w16cid="http://schemas.microsoft.com/office/word/2016/wordml/cid" xmlns:w16="http://schemas.microsoft.com/office/word/2018/wordml" xmlns:w16du="http://schemas.microsoft.com/office/word/2023/wordml/word16du" xmlns:w16sdtdh="http://schemas.microsoft.com/office/word/2020/wordml/sdtdatahash" xmlns:w16sdtfl="http://schemas.microsoft.com/office/word/2024/wordml/sdtformatlock" xmlns:w16se="http://schemas.microsoft.com/office/word/2015/wordml/symex" xmlns:wpg="http://schemas.microsoft.com/office/word/2010/wordprocessingGroup" xmlns:wpi="http://schemas.microsoft.com/office/word/2010/wordprocessingInk" xmlns:wne="http://schemas.microsoft.com/office/word/2006/wordml" xmlns:wps="http://schemas.microsoft.com/office/word/2010/wordprocessingShape" mc:Ignorable="w14 w15 w16se w16cid w16 w16cex w16sdtdh w16sdtfl w16du wp14">
+<w:footnotes xmlns:wpc="http://schemas.microsoft.com/office/word/2010/wordprocessingCanvas" xmlns:cx="http://schemas.microsoft.com/office/drawing/2014/chartex" xmlns:cx1="http://schemas.microsoft.com/office/drawing/2015/9/8/chartex" xmlns:cx2="http://schemas.microsoft.com/office/drawing/2015/10/21/chartex" xmlns:cx3="http://schemas.microsoft.com/office/drawing/2016/5/9/chartex" xmlns:cx4="http://schemas.microsoft.com/office/drawing/2016/5/10/chartex" xmlns:cx5="http://schemas.microsoft.com/office/drawing/2016/5/11/chartex" xmlns:cx6="http://schemas.microsoft.com/office/drawing/2016/5/12/chartex" xmlns:cx7="http://schemas.microsoft.com/office/drawing/2016/5/13/chartex" xmlns:cx8="http://schemas.microsoft.com/office/drawing/2016/5/14/chartex" xmlns:mc="http://schemas.openxmlformats.org/markup-compatibility/2006" xmlns:aink="http://schemas.microsoft.com/office/drawing/2016/ink" xmlns:am3d="http://schemas.microsoft.com/office/drawing/2017/model3d" xmlns:o="urn:schemas-microsoft-com:office:office" xmlns:oel="http://schemas.microsoft.com/office/2019/extlst" xmlns:r="http://schemas.openxmlformats.org/officeDocument/2006/relationships" xmlns:m="http://schemas.openxmlformats.org/officeDocument/2006/math" xmlns:v="urn:schemas-microsoft-com:vml" xmlns:wp14="http://schemas.microsoft.com/office/word/2010/wordprocessingDrawing" xmlns:wp="http://schemas.openxmlformats.org/drawingml/2006/wordprocessingDrawing" xmlns:w10="urn:schemas-microsoft-com:office:word" xmlns:w="http://schemas.openxmlformats.org/wordprocessingml/2006/main" xmlns:w14="http://schemas.microsoft.com/office/word/2010/wordml" xmlns:w15="http://schemas.microsoft.com/office/word/2012/wordml" xmlns:w16cex="http://schemas.microsoft.com/office/word/2018/wordml/cex" xmlns:w16cid="http://schemas.microsoft.com/office/word/2016/wordml/cid" xmlns:w16="http://schemas.microsoft.com/office/word/2018/wordml" xmlns:w16sdtdh="http://schemas.microsoft.com/office/word/2020/wordml/sdtdatahash" xmlns:w16se="http://schemas.microsoft.com/office/word/2015/wordml/symex" xmlns:wpg="http://schemas.microsoft.com/office/word/2010/wordprocessingGroup" xmlns:wpi="http://schemas.microsoft.com/office/word/2010/wordprocessingInk" xmlns:wne="http://schemas.microsoft.com/office/word/2006/wordml" xmlns:wps="http://schemas.microsoft.com/office/word/2010/wordprocessingShape" mc:Ignorable="w14 w15 w16se w16cid w16 w16cex w16sdtdh wp14">
   <w:footnote w:type="separator" w:id="-1">
     <w:p>
       <w:r>
@@ -2696,7 +2688,7 @@
 </file>
 
 <file path=word/header1.xml><?xml version="1.0" encoding="utf-8"?>
-<w:hdr xmlns:wpc="http://schemas.microsoft.com/office/word/2010/wordprocessingCanvas" xmlns:cx="http://schemas.microsoft.com/office/drawing/2014/chartex" xmlns:cx1="http://schemas.microsoft.com/office/drawing/2015/9/8/chartex" xmlns:cx2="http://schemas.microsoft.com/office/drawing/2015/10/21/chartex" xmlns:cx3="http://schemas.microsoft.com/office/drawing/2016/5/9/chartex" xmlns:cx4="http://schemas.microsoft.com/office/drawing/2016/5/10/chartex" xmlns:cx5="http://schemas.microsoft.com/office/drawing/2016/5/11/chartex" xmlns:cx6="http://schemas.microsoft.com/office/drawing/2016/5/12/chartex" xmlns:cx7="http://schemas.microsoft.com/office/drawing/2016/5/13/chartex" xmlns:cx8="http://schemas.microsoft.com/office/drawing/2016/5/14/chartex" xmlns:mc="http://schemas.openxmlformats.org/markup-compatibility/2006" xmlns:aink="http://schemas.microsoft.com/office/drawing/2016/ink" xmlns:am3d="http://schemas.microsoft.com/office/drawing/2017/model3d" xmlns:o="urn:schemas-microsoft-com:office:office" xmlns:oel="http://schemas.microsoft.com/office/2019/extlst" xmlns:r="http://schemas.openxmlformats.org/officeDocument/2006/relationships" xmlns:m="http://schemas.openxmlformats.org/officeDocument/2006/math" xmlns:v="urn:schemas-microsoft-com:vml" xmlns:wp14="http://schemas.microsoft.com/office/word/2010/wordprocessingDrawing" xmlns:wp="http://schemas.openxmlformats.org/drawingml/2006/wordprocessingDrawing" xmlns:w10="urn:schemas-microsoft-com:office:word" xmlns:w="http://schemas.openxmlformats.org/wordprocessingml/2006/main" xmlns:w14="http://schemas.microsoft.com/office/word/2010/wordml" xmlns:w15="http://schemas.microsoft.com/office/word/2012/wordml" xmlns:w16cex="http://schemas.microsoft.com/office/word/2018/wordml/cex" xmlns:w16cid="http://schemas.microsoft.com/office/word/2016/wordml/cid" xmlns:w16="http://schemas.microsoft.com/office/word/2018/wordml" xmlns:w16du="http://schemas.microsoft.com/office/word/2023/wordml/word16du" xmlns:w16sdtdh="http://schemas.microsoft.com/office/word/2020/wordml/sdtdatahash" xmlns:w16sdtfl="http://schemas.microsoft.com/office/word/2024/wordml/sdtformatlock" xmlns:w16se="http://schemas.microsoft.com/office/word/2015/wordml/symex" xmlns:wpg="http://schemas.microsoft.com/office/word/2010/wordprocessingGroup" xmlns:wpi="http://schemas.microsoft.com/office/word/2010/wordprocessingInk" xmlns:wne="http://schemas.microsoft.com/office/word/2006/wordml" xmlns:wps="http://schemas.microsoft.com/office/word/2010/wordprocessingShape" mc:Ignorable="w14 w15 w16se w16cid w16 w16cex w16sdtdh w16sdtfl w16du wp14">
+<w:hdr xmlns:wpc="http://schemas.microsoft.com/office/word/2010/wordprocessingCanvas" xmlns:cx="http://schemas.microsoft.com/office/drawing/2014/chartex" xmlns:cx1="http://schemas.microsoft.com/office/drawing/2015/9/8/chartex" xmlns:cx2="http://schemas.microsoft.com/office/drawing/2015/10/21/chartex" xmlns:cx3="http://schemas.microsoft.com/office/drawing/2016/5/9/chartex" xmlns:cx4="http://schemas.microsoft.com/office/drawing/2016/5/10/chartex" xmlns:cx5="http://schemas.microsoft.com/office/drawing/2016/5/11/chartex" xmlns:cx6="http://schemas.microsoft.com/office/drawing/2016/5/12/chartex" xmlns:cx7="http://schemas.microsoft.com/office/drawing/2016/5/13/chartex" xmlns:cx8="http://schemas.microsoft.com/office/drawing/2016/5/14/chartex" xmlns:mc="http://schemas.openxmlformats.org/markup-compatibility/2006" xmlns:aink="http://schemas.microsoft.com/office/drawing/2016/ink" xmlns:am3d="http://schemas.microsoft.com/office/drawing/2017/model3d" xmlns:o="urn:schemas-microsoft-com:office:office" xmlns:oel="http://schemas.microsoft.com/office/2019/extlst" xmlns:r="http://schemas.openxmlformats.org/officeDocument/2006/relationships" xmlns:m="http://schemas.openxmlformats.org/officeDocument/2006/math" xmlns:v="urn:schemas-microsoft-com:vml" xmlns:wp14="http://schemas.microsoft.com/office/word/2010/wordprocessingDrawing" xmlns:wp="http://schemas.openxmlformats.org/drawingml/2006/wordprocessingDrawing" xmlns:w10="urn:schemas-microsoft-com:office:word" xmlns:w="http://schemas.openxmlformats.org/wordprocessingml/2006/main" xmlns:w14="http://schemas.microsoft.com/office/word/2010/wordml" xmlns:w15="http://schemas.microsoft.com/office/word/2012/wordml" xmlns:w16cex="http://schemas.microsoft.com/office/word/2018/wordml/cex" xmlns:w16cid="http://schemas.microsoft.com/office/word/2016/wordml/cid" xmlns:w16="http://schemas.microsoft.com/office/word/2018/wordml" xmlns:w16sdtdh="http://schemas.microsoft.com/office/word/2020/wordml/sdtdatahash" xmlns:w16se="http://schemas.microsoft.com/office/word/2015/wordml/symex" xmlns:wpg="http://schemas.microsoft.com/office/word/2010/wordprocessingGroup" xmlns:wpi="http://schemas.microsoft.com/office/word/2010/wordprocessingInk" xmlns:wne="http://schemas.microsoft.com/office/word/2006/wordml" xmlns:wps="http://schemas.microsoft.com/office/word/2010/wordprocessingShape" mc:Ignorable="w14 w15 w16se w16cid w16 w16cex w16sdtdh wp14">
   <w:p>
     <w:pPr>
       <w:pStyle w:val="Encabezado"/>
@@ -2773,7 +2765,7 @@
 </file>
 
 <file path=word/numbering.xml><?xml version="1.0" encoding="utf-8"?>
-<w:numbering xmlns:wpc="http://schemas.microsoft.com/office/word/2010/wordprocessingCanvas" xmlns:cx="http://schemas.microsoft.com/office/drawing/2014/chartex" xmlns:cx1="http://schemas.microsoft.com/office/drawing/2015/9/8/chartex" xmlns:cx2="http://schemas.microsoft.com/office/drawing/2015/10/21/chartex" xmlns:cx3="http://schemas.microsoft.com/office/drawing/2016/5/9/chartex" xmlns:cx4="http://schemas.microsoft.com/office/drawing/2016/5/10/chartex" xmlns:cx5="http://schemas.microsoft.com/office/drawing/2016/5/11/chartex" xmlns:cx6="http://schemas.microsoft.com/office/drawing/2016/5/12/chartex" xmlns:cx7="http://schemas.microsoft.com/office/drawing/2016/5/13/chartex" xmlns:cx8="http://schemas.microsoft.com/office/drawing/2016/5/14/chartex" xmlns:mc="http://schemas.openxmlformats.org/markup-compatibility/2006" xmlns:aink="http://schemas.microsoft.com/office/drawing/2016/ink" xmlns:am3d="http://schemas.microsoft.com/office/drawing/2017/model3d" xmlns:o="urn:schemas-microsoft-com:office:office" xmlns:oel="http://schemas.microsoft.com/office/2019/extlst" xmlns:r="http://schemas.openxmlformats.org/officeDocument/2006/relationships" xmlns:m="http://schemas.openxmlformats.org/officeDocument/2006/math" xmlns:v="urn:schemas-microsoft-com:vml" xmlns:wp14="http://schemas.microsoft.com/office/word/2010/wordprocessingDrawing" xmlns:wp="http://schemas.openxmlformats.org/drawingml/2006/wordprocessingDrawing" xmlns:w10="urn:schemas-microsoft-com:office:word" xmlns:w="http://schemas.openxmlformats.org/wordprocessingml/2006/main" xmlns:w14="http://schemas.microsoft.com/office/word/2010/wordml" xmlns:w15="http://schemas.microsoft.com/office/word/2012/wordml" xmlns:w16cex="http://schemas.microsoft.com/office/word/2018/wordml/cex" xmlns:w16cid="http://schemas.microsoft.com/office/word/2016/wordml/cid" xmlns:w16="http://schemas.microsoft.com/office/word/2018/wordml" xmlns:w16du="http://schemas.microsoft.com/office/word/2023/wordml/word16du" xmlns:w16sdtdh="http://schemas.microsoft.com/office/word/2020/wordml/sdtdatahash" xmlns:w16sdtfl="http://schemas.microsoft.com/office/word/2024/wordml/sdtformatlock" xmlns:w16se="http://schemas.microsoft.com/office/word/2015/wordml/symex" xmlns:wpg="http://schemas.microsoft.com/office/word/2010/wordprocessingGroup" xmlns:wpi="http://schemas.microsoft.com/office/word/2010/wordprocessingInk" xmlns:wne="http://schemas.microsoft.com/office/word/2006/wordml" xmlns:wps="http://schemas.microsoft.com/office/word/2010/wordprocessingShape" mc:Ignorable="w14 w15 w16se w16cid w16 w16cex w16sdtdh w16sdtfl w16du wp14">
+<w:numbering xmlns:wpc="http://schemas.microsoft.com/office/word/2010/wordprocessingCanvas" xmlns:cx="http://schemas.microsoft.com/office/drawing/2014/chartex" xmlns:cx1="http://schemas.microsoft.com/office/drawing/2015/9/8/chartex" xmlns:cx2="http://schemas.microsoft.com/office/drawing/2015/10/21/chartex" xmlns:cx3="http://schemas.microsoft.com/office/drawing/2016/5/9/chartex" xmlns:cx4="http://schemas.microsoft.com/office/drawing/2016/5/10/chartex" xmlns:cx5="http://schemas.microsoft.com/office/drawing/2016/5/11/chartex" xmlns:cx6="http://schemas.microsoft.com/office/drawing/2016/5/12/chartex" xmlns:cx7="http://schemas.microsoft.com/office/drawing/2016/5/13/chartex" xmlns:cx8="http://schemas.microsoft.com/office/drawing/2016/5/14/chartex" xmlns:mc="http://schemas.openxmlformats.org/markup-compatibility/2006" xmlns:aink="http://schemas.microsoft.com/office/drawing/2016/ink" xmlns:am3d="http://schemas.microsoft.com/office/drawing/2017/model3d" xmlns:o="urn:schemas-microsoft-com:office:office" xmlns:oel="http://schemas.microsoft.com/office/2019/extlst" xmlns:r="http://schemas.openxmlformats.org/officeDocument/2006/relationships" xmlns:m="http://schemas.openxmlformats.org/officeDocument/2006/math" xmlns:v="urn:schemas-microsoft-com:vml" xmlns:wp14="http://schemas.microsoft.com/office/word/2010/wordprocessingDrawing" xmlns:wp="http://schemas.openxmlformats.org/drawingml/2006/wordprocessingDrawing" xmlns:w10="urn:schemas-microsoft-com:office:word" xmlns:w="http://schemas.openxmlformats.org/wordprocessingml/2006/main" xmlns:w14="http://schemas.microsoft.com/office/word/2010/wordml" xmlns:w15="http://schemas.microsoft.com/office/word/2012/wordml" xmlns:w16cex="http://schemas.microsoft.com/office/word/2018/wordml/cex" xmlns:w16cid="http://schemas.microsoft.com/office/word/2016/wordml/cid" xmlns:w16="http://schemas.microsoft.com/office/word/2018/wordml" xmlns:w16sdtdh="http://schemas.microsoft.com/office/word/2020/wordml/sdtdatahash" xmlns:w16se="http://schemas.microsoft.com/office/word/2015/wordml/symex" xmlns:wpg="http://schemas.microsoft.com/office/word/2010/wordprocessingGroup" xmlns:wpi="http://schemas.microsoft.com/office/word/2010/wordprocessingInk" xmlns:wne="http://schemas.microsoft.com/office/word/2006/wordml" xmlns:wps="http://schemas.microsoft.com/office/word/2010/wordprocessingShape" mc:Ignorable="w14 w15 w16se w16cid w16 w16cex w16sdtdh wp14">
   <w:abstractNum w:abstractNumId="0" w15:restartNumberingAfterBreak="0">
     <w:nsid w:val="495B5C67"/>
     <w:multiLevelType w:val="hybridMultilevel"/>
@@ -3108,7 +3100,7 @@
 </file>
 
 <file path=word/styles.xml><?xml version="1.0" encoding="utf-8"?>
-<w:styles xmlns:mc="http://schemas.openxmlformats.org/markup-compatibility/2006" xmlns:r="http://schemas.openxmlformats.org/officeDocument/2006/relationships" xmlns:w="http://schemas.openxmlformats.org/wordprocessingml/2006/main" xmlns:w14="http://schemas.microsoft.com/office/word/2010/wordml" xmlns:w15="http://schemas.microsoft.com/office/word/2012/wordml" xmlns:w16cex="http://schemas.microsoft.com/office/word/2018/wordml/cex" xmlns:w16cid="http://schemas.microsoft.com/office/word/2016/wordml/cid" xmlns:w16="http://schemas.microsoft.com/office/word/2018/wordml" xmlns:w16du="http://schemas.microsoft.com/office/word/2023/wordml/word16du" xmlns:w16sdtdh="http://schemas.microsoft.com/office/word/2020/wordml/sdtdatahash" xmlns:w16sdtfl="http://schemas.microsoft.com/office/word/2024/wordml/sdtformatlock" xmlns:w16se="http://schemas.microsoft.com/office/word/2015/wordml/symex" mc:Ignorable="w14 w15 w16se w16cid w16 w16cex w16sdtdh w16sdtfl w16du">
+<w:styles xmlns:mc="http://schemas.openxmlformats.org/markup-compatibility/2006" xmlns:r="http://schemas.openxmlformats.org/officeDocument/2006/relationships" xmlns:w="http://schemas.openxmlformats.org/wordprocessingml/2006/main" xmlns:w14="http://schemas.microsoft.com/office/word/2010/wordml" xmlns:w15="http://schemas.microsoft.com/office/word/2012/wordml" xmlns:w16cex="http://schemas.microsoft.com/office/word/2018/wordml/cex" xmlns:w16cid="http://schemas.microsoft.com/office/word/2016/wordml/cid" xmlns:w16="http://schemas.microsoft.com/office/word/2018/wordml" xmlns:w16sdtdh="http://schemas.microsoft.com/office/word/2020/wordml/sdtdatahash" xmlns:w16se="http://schemas.microsoft.com/office/word/2015/wordml/symex" mc:Ignorable="w14 w15 w16se w16cid w16 w16cex w16sdtdh">
   <w:docDefaults>
     <w:rPrDefault>
       <w:rPr>
@@ -3535,6 +3527,7 @@
   <w:style w:type="character" w:default="1" w:styleId="Fuentedeprrafopredeter">
     <w:name w:val="Default Paragraph Font"/>
     <w:uiPriority w:val="1"/>
+    <w:semiHidden/>
     <w:unhideWhenUsed/>
   </w:style>
   <w:style w:type="table" w:default="1" w:styleId="Tablanormal">

</xml_diff>

<commit_message>
Limpieza de firmas docentes y administrativas, cambios en modelos de plantillas words y nuevo enrutamiento a plantillas
</commit_message>
<xml_diff>
--- a/Modelos_documentos/tdr_administrativo.docx
+++ b/Modelos_documentos/tdr_administrativo.docx
@@ -1,6 +1,6 @@
 
 <file path=word/document.xml><?xml version="1.0" encoding="utf-8"?>
-<w:document xmlns:wpc="http://schemas.microsoft.com/office/word/2010/wordprocessingCanvas" xmlns:cx="http://schemas.microsoft.com/office/drawing/2014/chartex" xmlns:mc="http://schemas.openxmlformats.org/markup-compatibility/2006" xmlns:o="urn:schemas-microsoft-com:office:office" xmlns:r="http://schemas.openxmlformats.org/officeDocument/2006/relationships" xmlns:m="http://schemas.openxmlformats.org/officeDocument/2006/math" xmlns:v="urn:schemas-microsoft-com:vml" xmlns:wp14="http://schemas.microsoft.com/office/word/2010/wordprocessingDrawing" xmlns:wp="http://schemas.openxmlformats.org/drawingml/2006/wordprocessingDrawing" xmlns:w10="urn:schemas-microsoft-com:office:word" xmlns:w="http://schemas.openxmlformats.org/wordprocessingml/2006/main" xmlns:w14="http://schemas.microsoft.com/office/word/2010/wordml" xmlns:w15="http://schemas.microsoft.com/office/word/2012/wordml" xmlns:w16se="http://schemas.microsoft.com/office/word/2015/wordml/symex" xmlns:wpg="http://schemas.microsoft.com/office/word/2010/wordprocessingGroup" xmlns:wpi="http://schemas.microsoft.com/office/word/2010/wordprocessingInk" xmlns:wne="http://schemas.microsoft.com/office/word/2006/wordml" xmlns:wps="http://schemas.microsoft.com/office/word/2010/wordprocessingShape" mc:Ignorable="w14 w15 w16se wp14">
+<w:document xmlns:wpc="http://schemas.microsoft.com/office/word/2010/wordprocessingCanvas" xmlns:cx="http://schemas.microsoft.com/office/drawing/2014/chartex" xmlns:cx1="http://schemas.microsoft.com/office/drawing/2015/9/8/chartex" xmlns:cx2="http://schemas.microsoft.com/office/drawing/2015/10/21/chartex" xmlns:cx3="http://schemas.microsoft.com/office/drawing/2016/5/9/chartex" xmlns:cx4="http://schemas.microsoft.com/office/drawing/2016/5/10/chartex" xmlns:cx5="http://schemas.microsoft.com/office/drawing/2016/5/11/chartex" xmlns:cx6="http://schemas.microsoft.com/office/drawing/2016/5/12/chartex" xmlns:cx7="http://schemas.microsoft.com/office/drawing/2016/5/13/chartex" xmlns:cx8="http://schemas.microsoft.com/office/drawing/2016/5/14/chartex" xmlns:mc="http://schemas.openxmlformats.org/markup-compatibility/2006" xmlns:aink="http://schemas.microsoft.com/office/drawing/2016/ink" xmlns:am3d="http://schemas.microsoft.com/office/drawing/2017/model3d" xmlns:o="urn:schemas-microsoft-com:office:office" xmlns:oel="http://schemas.microsoft.com/office/2019/extlst" xmlns:r="http://schemas.openxmlformats.org/officeDocument/2006/relationships" xmlns:m="http://schemas.openxmlformats.org/officeDocument/2006/math" xmlns:v="urn:schemas-microsoft-com:vml" xmlns:wp14="http://schemas.microsoft.com/office/word/2010/wordprocessingDrawing" xmlns:wp="http://schemas.openxmlformats.org/drawingml/2006/wordprocessingDrawing" xmlns:w10="urn:schemas-microsoft-com:office:word" xmlns:w="http://schemas.openxmlformats.org/wordprocessingml/2006/main" xmlns:w14="http://schemas.microsoft.com/office/word/2010/wordml" xmlns:w15="http://schemas.microsoft.com/office/word/2012/wordml" xmlns:w16cex="http://schemas.microsoft.com/office/word/2018/wordml/cex" xmlns:w16cid="http://schemas.microsoft.com/office/word/2016/wordml/cid" xmlns:w16="http://schemas.microsoft.com/office/word/2018/wordml" xmlns:w16du="http://schemas.microsoft.com/office/word/2023/wordml/word16du" xmlns:w16sdtdh="http://schemas.microsoft.com/office/word/2020/wordml/sdtdatahash" xmlns:w16sdtfl="http://schemas.microsoft.com/office/word/2024/wordml/sdtformatlock" xmlns:w16se="http://schemas.microsoft.com/office/word/2015/wordml/symex" xmlns:wpg="http://schemas.microsoft.com/office/word/2010/wordprocessingGroup" xmlns:wpi="http://schemas.microsoft.com/office/word/2010/wordprocessingInk" xmlns:wne="http://schemas.microsoft.com/office/word/2006/wordml" xmlns:wps="http://schemas.microsoft.com/office/word/2010/wordprocessingShape" mc:Ignorable="w14 w15 w16se w16cid w16 w16cex w16sdtdh w16sdtfl w16du wp14">
   <w:body>
     <w:p>
       <w:pPr>
@@ -985,8 +985,6 @@
         </w:rPr>
         <w:t>Presencial</w:t>
       </w:r>
-      <w:bookmarkStart w:id="3" w:name="_GoBack"/>
-      <w:bookmarkEnd w:id="3"/>
     </w:p>
     <w:p>
       <w:pPr>
@@ -1018,69 +1016,69 @@
           <w:rFonts w:ascii="Garamond" w:hAnsi="Garamond"/>
         </w:rPr>
       </w:pPr>
-      <w:bookmarkStart w:id="4" w:name="VII._LUGAR_DE_PRESTACIÓN_DEL_SERVICIO:"/>
+      <w:bookmarkStart w:id="3" w:name="VII._LUGAR_DE_PRESTACIÓN_DEL_SERVICIO:"/>
+      <w:bookmarkEnd w:id="3"/>
+      <w:r>
+        <w:rPr>
+          <w:rFonts w:ascii="Garamond" w:hAnsi="Garamond"/>
+        </w:rPr>
+        <w:t>LUGAR</w:t>
+      </w:r>
+      <w:r>
+        <w:rPr>
+          <w:rFonts w:ascii="Garamond" w:hAnsi="Garamond"/>
+          <w:spacing w:val="-16"/>
+        </w:rPr>
+        <w:t xml:space="preserve"> </w:t>
+      </w:r>
+      <w:r>
+        <w:rPr>
+          <w:rFonts w:ascii="Garamond" w:hAnsi="Garamond"/>
+        </w:rPr>
+        <w:t>DE</w:t>
+      </w:r>
+      <w:r>
+        <w:rPr>
+          <w:rFonts w:ascii="Garamond" w:hAnsi="Garamond"/>
+          <w:spacing w:val="-12"/>
+        </w:rPr>
+        <w:t xml:space="preserve"> </w:t>
+      </w:r>
+      <w:r>
+        <w:rPr>
+          <w:rFonts w:ascii="Garamond" w:hAnsi="Garamond"/>
+        </w:rPr>
+        <w:t>PRESTACIÓN</w:t>
+      </w:r>
+      <w:r>
+        <w:rPr>
+          <w:rFonts w:ascii="Garamond" w:hAnsi="Garamond"/>
+          <w:spacing w:val="-11"/>
+        </w:rPr>
+        <w:t xml:space="preserve"> </w:t>
+      </w:r>
+      <w:r>
+        <w:rPr>
+          <w:rFonts w:ascii="Garamond" w:hAnsi="Garamond"/>
+        </w:rPr>
+        <w:t>DEL</w:t>
+      </w:r>
+      <w:r>
+        <w:rPr>
+          <w:rFonts w:ascii="Garamond" w:hAnsi="Garamond"/>
+          <w:spacing w:val="-10"/>
+        </w:rPr>
+        <w:t xml:space="preserve"> </w:t>
+      </w:r>
+      <w:r>
+        <w:rPr>
+          <w:rFonts w:ascii="Garamond" w:hAnsi="Garamond"/>
+          <w:spacing w:val="-2"/>
+        </w:rPr>
+        <w:t>SERVICIO:</w:t>
+      </w:r>
+      <w:bookmarkStart w:id="4" w:name="VIII._PLAZO_DEL_SERVICIO:"/>
       <w:bookmarkEnd w:id="4"/>
-      <w:r>
-        <w:rPr>
-          <w:rFonts w:ascii="Garamond" w:hAnsi="Garamond"/>
-        </w:rPr>
-        <w:t>LUGAR</w:t>
-      </w:r>
-      <w:r>
-        <w:rPr>
-          <w:rFonts w:ascii="Garamond" w:hAnsi="Garamond"/>
-          <w:spacing w:val="-16"/>
-        </w:rPr>
-        <w:t xml:space="preserve"> </w:t>
-      </w:r>
-      <w:r>
-        <w:rPr>
-          <w:rFonts w:ascii="Garamond" w:hAnsi="Garamond"/>
-        </w:rPr>
-        <w:t>DE</w:t>
-      </w:r>
-      <w:r>
-        <w:rPr>
-          <w:rFonts w:ascii="Garamond" w:hAnsi="Garamond"/>
-          <w:spacing w:val="-12"/>
-        </w:rPr>
-        <w:t xml:space="preserve"> </w:t>
-      </w:r>
-      <w:r>
-        <w:rPr>
-          <w:rFonts w:ascii="Garamond" w:hAnsi="Garamond"/>
-        </w:rPr>
-        <w:t>PRESTACIÓN</w:t>
-      </w:r>
-      <w:r>
-        <w:rPr>
-          <w:rFonts w:ascii="Garamond" w:hAnsi="Garamond"/>
-          <w:spacing w:val="-11"/>
-        </w:rPr>
-        <w:t xml:space="preserve"> </w:t>
-      </w:r>
-      <w:r>
-        <w:rPr>
-          <w:rFonts w:ascii="Garamond" w:hAnsi="Garamond"/>
-        </w:rPr>
-        <w:t>DEL</w:t>
-      </w:r>
-      <w:r>
-        <w:rPr>
-          <w:rFonts w:ascii="Garamond" w:hAnsi="Garamond"/>
-          <w:spacing w:val="-10"/>
-        </w:rPr>
-        <w:t xml:space="preserve"> </w:t>
-      </w:r>
-      <w:r>
-        <w:rPr>
-          <w:rFonts w:ascii="Garamond" w:hAnsi="Garamond"/>
-          <w:spacing w:val="-2"/>
-        </w:rPr>
-        <w:t>SERVICIO:</w:t>
-      </w:r>
-      <w:bookmarkStart w:id="5" w:name="VIII._PLAZO_DEL_SERVICIO:"/>
-      <w:bookmarkEnd w:id="5"/>
     </w:p>
     <w:p>
       <w:pPr>
@@ -2009,8 +2007,8 @@
           <w:rFonts w:ascii="Garamond" w:hAnsi="Garamond"/>
         </w:rPr>
       </w:pPr>
-      <w:bookmarkStart w:id="6" w:name="IX._MONTO_REFERENCIAL:"/>
-      <w:bookmarkEnd w:id="6"/>
+      <w:bookmarkStart w:id="5" w:name="IX._MONTO_REFERENCIAL:"/>
+      <w:bookmarkEnd w:id="5"/>
       <w:r>
         <w:rPr>
           <w:rFonts w:ascii="Garamond" w:hAnsi="Garamond"/>
@@ -2031,72 +2029,6 @@
         </w:rPr>
         <w:t>REFERENCIAL:</w:t>
       </w:r>
-    </w:p>
-    <w:p>
-      <w:pPr>
-        <w:pStyle w:val="Ttulo1"/>
-        <w:tabs>
-          <w:tab w:val="left" w:pos="567"/>
-        </w:tabs>
-        <w:spacing w:before="0" w:line="276" w:lineRule="auto"/>
-        <w:ind w:left="0" w:firstLine="0"/>
-        <w:rPr>
-          <w:rFonts w:ascii="Garamond" w:hAnsi="Garamond"/>
-        </w:rPr>
-      </w:pPr>
-      <w:r>
-        <w:rPr>
-          <w:rFonts w:ascii="Garamond" w:hAnsi="Garamond"/>
-          <w:b w:val="0"/>
-        </w:rPr>
-        <w:t>Monto</w:t>
-      </w:r>
-      <w:r>
-        <w:rPr>
-          <w:rFonts w:ascii="Garamond" w:hAnsi="Garamond"/>
-          <w:b w:val="0"/>
-          <w:spacing w:val="-3"/>
-        </w:rPr>
-        <w:t xml:space="preserve"> </w:t>
-      </w:r>
-      <w:r>
-        <w:rPr>
-          <w:rFonts w:ascii="Garamond" w:hAnsi="Garamond"/>
-          <w:b w:val="0"/>
-        </w:rPr>
-        <w:t>por</w:t>
-      </w:r>
-      <w:r>
-        <w:rPr>
-          <w:rFonts w:ascii="Garamond" w:hAnsi="Garamond"/>
-          <w:b w:val="0"/>
-          <w:spacing w:val="-2"/>
-        </w:rPr>
-        <w:t xml:space="preserve"> </w:t>
-      </w:r>
-      <w:r>
-        <w:rPr>
-          <w:rFonts w:ascii="Garamond" w:hAnsi="Garamond"/>
-          <w:b w:val="0"/>
-        </w:rPr>
-        <w:t>hora:</w:t>
-      </w:r>
-      <w:r>
-        <w:rPr>
-          <w:rFonts w:ascii="Garamond" w:hAnsi="Garamond"/>
-        </w:rPr>
-        <w:t xml:space="preserve"> </w:t>
-      </w:r>
-      <w:proofErr w:type="spellStart"/>
-      <w:r>
-        <w:rPr>
-          <w:rFonts w:ascii="Garamond" w:hAnsi="Garamond"/>
-          <w:b w:val="0"/>
-          <w:bCs w:val="0"/>
-        </w:rPr>
-        <w:t>categoria</w:t>
-      </w:r>
-      <w:proofErr w:type="spellEnd"/>
     </w:p>
     <w:p>
       <w:pPr>
@@ -2513,49 +2445,8 @@
           <w:rFonts w:ascii="Garamond" w:hAnsi="Garamond"/>
           <w:b/>
         </w:rPr>
-        <w:t xml:space="preserve">Dr. Guillaume </w:t>
-      </w:r>
-      <w:proofErr w:type="spellStart"/>
-      <w:r>
-        <w:rPr>
-          <w:rFonts w:ascii="Garamond" w:hAnsi="Garamond"/>
-          <w:b/>
-        </w:rPr>
-        <w:t>Yannick</w:t>
-      </w:r>
-      <w:proofErr w:type="spellEnd"/>
-      <w:r>
-        <w:rPr>
-          <w:rFonts w:ascii="Garamond" w:hAnsi="Garamond"/>
-          <w:b/>
-        </w:rPr>
-        <w:t xml:space="preserve"> </w:t>
-      </w:r>
-      <w:proofErr w:type="spellStart"/>
-      <w:r>
-        <w:rPr>
-          <w:rFonts w:ascii="Garamond" w:hAnsi="Garamond"/>
-          <w:b/>
-        </w:rPr>
-        <w:t>Serge</w:t>
-      </w:r>
-      <w:proofErr w:type="spellEnd"/>
-      <w:r>
-        <w:rPr>
-          <w:rFonts w:ascii="Garamond" w:hAnsi="Garamond"/>
-          <w:b/>
-        </w:rPr>
-        <w:t xml:space="preserve"> </w:t>
-      </w:r>
-      <w:proofErr w:type="spellStart"/>
-      <w:r>
-        <w:rPr>
-          <w:rFonts w:ascii="Garamond" w:hAnsi="Garamond"/>
-          <w:b/>
-        </w:rPr>
-        <w:t>Oisel</w:t>
-      </w:r>
-      <w:proofErr w:type="spellEnd"/>
+        <w:t>Dr. Guillaume Yannick Serge Oisel</w:t>
+      </w:r>
     </w:p>
     <w:p>
       <w:pPr>
@@ -2612,7 +2503,7 @@
 </file>
 
 <file path=word/endnotes.xml><?xml version="1.0" encoding="utf-8"?>
-<w:endnotes xmlns:wpc="http://schemas.microsoft.com/office/word/2010/wordprocessingCanvas" xmlns:cx="http://schemas.microsoft.com/office/drawing/2014/chartex" xmlns:mc="http://schemas.openxmlformats.org/markup-compatibility/2006" xmlns:o="urn:schemas-microsoft-com:office:office" xmlns:r="http://schemas.openxmlformats.org/officeDocument/2006/relationships" xmlns:m="http://schemas.openxmlformats.org/officeDocument/2006/math" xmlns:v="urn:schemas-microsoft-com:vml" xmlns:wp14="http://schemas.microsoft.com/office/word/2010/wordprocessingDrawing" xmlns:wp="http://schemas.openxmlformats.org/drawingml/2006/wordprocessingDrawing" xmlns:w10="urn:schemas-microsoft-com:office:word" xmlns:w="http://schemas.openxmlformats.org/wordprocessingml/2006/main" xmlns:w14="http://schemas.microsoft.com/office/word/2010/wordml" xmlns:w15="http://schemas.microsoft.com/office/word/2012/wordml" xmlns:w16se="http://schemas.microsoft.com/office/word/2015/wordml/symex" xmlns:wpg="http://schemas.microsoft.com/office/word/2010/wordprocessingGroup" xmlns:wpi="http://schemas.microsoft.com/office/word/2010/wordprocessingInk" xmlns:wne="http://schemas.microsoft.com/office/word/2006/wordml" xmlns:wps="http://schemas.microsoft.com/office/word/2010/wordprocessingShape" mc:Ignorable="w14 w15 w16se wp14">
+<w:endnotes xmlns:wpc="http://schemas.microsoft.com/office/word/2010/wordprocessingCanvas" xmlns:cx="http://schemas.microsoft.com/office/drawing/2014/chartex" xmlns:cx1="http://schemas.microsoft.com/office/drawing/2015/9/8/chartex" xmlns:cx2="http://schemas.microsoft.com/office/drawing/2015/10/21/chartex" xmlns:cx3="http://schemas.microsoft.com/office/drawing/2016/5/9/chartex" xmlns:cx4="http://schemas.microsoft.com/office/drawing/2016/5/10/chartex" xmlns:cx5="http://schemas.microsoft.com/office/drawing/2016/5/11/chartex" xmlns:cx6="http://schemas.microsoft.com/office/drawing/2016/5/12/chartex" xmlns:cx7="http://schemas.microsoft.com/office/drawing/2016/5/13/chartex" xmlns:cx8="http://schemas.microsoft.com/office/drawing/2016/5/14/chartex" xmlns:mc="http://schemas.openxmlformats.org/markup-compatibility/2006" xmlns:aink="http://schemas.microsoft.com/office/drawing/2016/ink" xmlns:am3d="http://schemas.microsoft.com/office/drawing/2017/model3d" xmlns:o="urn:schemas-microsoft-com:office:office" xmlns:oel="http://schemas.microsoft.com/office/2019/extlst" xmlns:r="http://schemas.openxmlformats.org/officeDocument/2006/relationships" xmlns:m="http://schemas.openxmlformats.org/officeDocument/2006/math" xmlns:v="urn:schemas-microsoft-com:vml" xmlns:wp14="http://schemas.microsoft.com/office/word/2010/wordprocessingDrawing" xmlns:wp="http://schemas.openxmlformats.org/drawingml/2006/wordprocessingDrawing" xmlns:w10="urn:schemas-microsoft-com:office:word" xmlns:w="http://schemas.openxmlformats.org/wordprocessingml/2006/main" xmlns:w14="http://schemas.microsoft.com/office/word/2010/wordml" xmlns:w15="http://schemas.microsoft.com/office/word/2012/wordml" xmlns:w16cex="http://schemas.microsoft.com/office/word/2018/wordml/cex" xmlns:w16cid="http://schemas.microsoft.com/office/word/2016/wordml/cid" xmlns:w16="http://schemas.microsoft.com/office/word/2018/wordml" xmlns:w16du="http://schemas.microsoft.com/office/word/2023/wordml/word16du" xmlns:w16sdtdh="http://schemas.microsoft.com/office/word/2020/wordml/sdtdatahash" xmlns:w16sdtfl="http://schemas.microsoft.com/office/word/2024/wordml/sdtformatlock" xmlns:w16se="http://schemas.microsoft.com/office/word/2015/wordml/symex" xmlns:wpg="http://schemas.microsoft.com/office/word/2010/wordprocessingGroup" xmlns:wpi="http://schemas.microsoft.com/office/word/2010/wordprocessingInk" xmlns:wne="http://schemas.microsoft.com/office/word/2006/wordml" xmlns:wps="http://schemas.microsoft.com/office/word/2010/wordprocessingShape" mc:Ignorable="w14 w15 w16se w16cid w16 w16cex w16sdtdh w16sdtfl w16du wp14">
   <w:endnote w:type="separator" w:id="-1">
     <w:p>
       <w:r>
@@ -2631,7 +2522,7 @@
 </file>
 
 <file path=word/footnotes.xml><?xml version="1.0" encoding="utf-8"?>
-<w:footnotes xmlns:wpc="http://schemas.microsoft.com/office/word/2010/wordprocessingCanvas" xmlns:cx="http://schemas.microsoft.com/office/drawing/2014/chartex" xmlns:mc="http://schemas.openxmlformats.org/markup-compatibility/2006" xmlns:o="urn:schemas-microsoft-com:office:office" xmlns:r="http://schemas.openxmlformats.org/officeDocument/2006/relationships" xmlns:m="http://schemas.openxmlformats.org/officeDocument/2006/math" xmlns:v="urn:schemas-microsoft-com:vml" xmlns:wp14="http://schemas.microsoft.com/office/word/2010/wordprocessingDrawing" xmlns:wp="http://schemas.openxmlformats.org/drawingml/2006/wordprocessingDrawing" xmlns:w10="urn:schemas-microsoft-com:office:word" xmlns:w="http://schemas.openxmlformats.org/wordprocessingml/2006/main" xmlns:w14="http://schemas.microsoft.com/office/word/2010/wordml" xmlns:w15="http://schemas.microsoft.com/office/word/2012/wordml" xmlns:w16se="http://schemas.microsoft.com/office/word/2015/wordml/symex" xmlns:wpg="http://schemas.microsoft.com/office/word/2010/wordprocessingGroup" xmlns:wpi="http://schemas.microsoft.com/office/word/2010/wordprocessingInk" xmlns:wne="http://schemas.microsoft.com/office/word/2006/wordml" xmlns:wps="http://schemas.microsoft.com/office/word/2010/wordprocessingShape" mc:Ignorable="w14 w15 w16se wp14">
+<w:footnotes xmlns:wpc="http://schemas.microsoft.com/office/word/2010/wordprocessingCanvas" xmlns:cx="http://schemas.microsoft.com/office/drawing/2014/chartex" xmlns:cx1="http://schemas.microsoft.com/office/drawing/2015/9/8/chartex" xmlns:cx2="http://schemas.microsoft.com/office/drawing/2015/10/21/chartex" xmlns:cx3="http://schemas.microsoft.com/office/drawing/2016/5/9/chartex" xmlns:cx4="http://schemas.microsoft.com/office/drawing/2016/5/10/chartex" xmlns:cx5="http://schemas.microsoft.com/office/drawing/2016/5/11/chartex" xmlns:cx6="http://schemas.microsoft.com/office/drawing/2016/5/12/chartex" xmlns:cx7="http://schemas.microsoft.com/office/drawing/2016/5/13/chartex" xmlns:cx8="http://schemas.microsoft.com/office/drawing/2016/5/14/chartex" xmlns:mc="http://schemas.openxmlformats.org/markup-compatibility/2006" xmlns:aink="http://schemas.microsoft.com/office/drawing/2016/ink" xmlns:am3d="http://schemas.microsoft.com/office/drawing/2017/model3d" xmlns:o="urn:schemas-microsoft-com:office:office" xmlns:oel="http://schemas.microsoft.com/office/2019/extlst" xmlns:r="http://schemas.openxmlformats.org/officeDocument/2006/relationships" xmlns:m="http://schemas.openxmlformats.org/officeDocument/2006/math" xmlns:v="urn:schemas-microsoft-com:vml" xmlns:wp14="http://schemas.microsoft.com/office/word/2010/wordprocessingDrawing" xmlns:wp="http://schemas.openxmlformats.org/drawingml/2006/wordprocessingDrawing" xmlns:w10="urn:schemas-microsoft-com:office:word" xmlns:w="http://schemas.openxmlformats.org/wordprocessingml/2006/main" xmlns:w14="http://schemas.microsoft.com/office/word/2010/wordml" xmlns:w15="http://schemas.microsoft.com/office/word/2012/wordml" xmlns:w16cex="http://schemas.microsoft.com/office/word/2018/wordml/cex" xmlns:w16cid="http://schemas.microsoft.com/office/word/2016/wordml/cid" xmlns:w16="http://schemas.microsoft.com/office/word/2018/wordml" xmlns:w16du="http://schemas.microsoft.com/office/word/2023/wordml/word16du" xmlns:w16sdtdh="http://schemas.microsoft.com/office/word/2020/wordml/sdtdatahash" xmlns:w16sdtfl="http://schemas.microsoft.com/office/word/2024/wordml/sdtformatlock" xmlns:w16se="http://schemas.microsoft.com/office/word/2015/wordml/symex" xmlns:wpg="http://schemas.microsoft.com/office/word/2010/wordprocessingGroup" xmlns:wpi="http://schemas.microsoft.com/office/word/2010/wordprocessingInk" xmlns:wne="http://schemas.microsoft.com/office/word/2006/wordml" xmlns:wps="http://schemas.microsoft.com/office/word/2010/wordprocessingShape" mc:Ignorable="w14 w15 w16se w16cid w16 w16cex w16sdtdh w16sdtfl w16du wp14">
   <w:footnote w:type="separator" w:id="-1">
     <w:p>
       <w:r>
@@ -2650,7 +2541,7 @@
 </file>
 
 <file path=word/header1.xml><?xml version="1.0" encoding="utf-8"?>
-<w:hdr xmlns:wpc="http://schemas.microsoft.com/office/word/2010/wordprocessingCanvas" xmlns:cx="http://schemas.microsoft.com/office/drawing/2014/chartex" xmlns:mc="http://schemas.openxmlformats.org/markup-compatibility/2006" xmlns:o="urn:schemas-microsoft-com:office:office" xmlns:r="http://schemas.openxmlformats.org/officeDocument/2006/relationships" xmlns:m="http://schemas.openxmlformats.org/officeDocument/2006/math" xmlns:v="urn:schemas-microsoft-com:vml" xmlns:wp14="http://schemas.microsoft.com/office/word/2010/wordprocessingDrawing" xmlns:wp="http://schemas.openxmlformats.org/drawingml/2006/wordprocessingDrawing" xmlns:w10="urn:schemas-microsoft-com:office:word" xmlns:w="http://schemas.openxmlformats.org/wordprocessingml/2006/main" xmlns:w14="http://schemas.microsoft.com/office/word/2010/wordml" xmlns:w15="http://schemas.microsoft.com/office/word/2012/wordml" xmlns:w16se="http://schemas.microsoft.com/office/word/2015/wordml/symex" xmlns:wpg="http://schemas.microsoft.com/office/word/2010/wordprocessingGroup" xmlns:wpi="http://schemas.microsoft.com/office/word/2010/wordprocessingInk" xmlns:wne="http://schemas.microsoft.com/office/word/2006/wordml" xmlns:wps="http://schemas.microsoft.com/office/word/2010/wordprocessingShape" mc:Ignorable="w14 w15 w16se wp14">
+<w:hdr xmlns:wpc="http://schemas.microsoft.com/office/word/2010/wordprocessingCanvas" xmlns:cx="http://schemas.microsoft.com/office/drawing/2014/chartex" xmlns:cx1="http://schemas.microsoft.com/office/drawing/2015/9/8/chartex" xmlns:cx2="http://schemas.microsoft.com/office/drawing/2015/10/21/chartex" xmlns:cx3="http://schemas.microsoft.com/office/drawing/2016/5/9/chartex" xmlns:cx4="http://schemas.microsoft.com/office/drawing/2016/5/10/chartex" xmlns:cx5="http://schemas.microsoft.com/office/drawing/2016/5/11/chartex" xmlns:cx6="http://schemas.microsoft.com/office/drawing/2016/5/12/chartex" xmlns:cx7="http://schemas.microsoft.com/office/drawing/2016/5/13/chartex" xmlns:cx8="http://schemas.microsoft.com/office/drawing/2016/5/14/chartex" xmlns:mc="http://schemas.openxmlformats.org/markup-compatibility/2006" xmlns:aink="http://schemas.microsoft.com/office/drawing/2016/ink" xmlns:am3d="http://schemas.microsoft.com/office/drawing/2017/model3d" xmlns:o="urn:schemas-microsoft-com:office:office" xmlns:oel="http://schemas.microsoft.com/office/2019/extlst" xmlns:r="http://schemas.openxmlformats.org/officeDocument/2006/relationships" xmlns:m="http://schemas.openxmlformats.org/officeDocument/2006/math" xmlns:v="urn:schemas-microsoft-com:vml" xmlns:wp14="http://schemas.microsoft.com/office/word/2010/wordprocessingDrawing" xmlns:wp="http://schemas.openxmlformats.org/drawingml/2006/wordprocessingDrawing" xmlns:w10="urn:schemas-microsoft-com:office:word" xmlns:w="http://schemas.openxmlformats.org/wordprocessingml/2006/main" xmlns:w14="http://schemas.microsoft.com/office/word/2010/wordml" xmlns:w15="http://schemas.microsoft.com/office/word/2012/wordml" xmlns:w16cex="http://schemas.microsoft.com/office/word/2018/wordml/cex" xmlns:w16cid="http://schemas.microsoft.com/office/word/2016/wordml/cid" xmlns:w16="http://schemas.microsoft.com/office/word/2018/wordml" xmlns:w16du="http://schemas.microsoft.com/office/word/2023/wordml/word16du" xmlns:w16sdtdh="http://schemas.microsoft.com/office/word/2020/wordml/sdtdatahash" xmlns:w16sdtfl="http://schemas.microsoft.com/office/word/2024/wordml/sdtformatlock" xmlns:w16se="http://schemas.microsoft.com/office/word/2015/wordml/symex" xmlns:wpg="http://schemas.microsoft.com/office/word/2010/wordprocessingGroup" xmlns:wpi="http://schemas.microsoft.com/office/word/2010/wordprocessingInk" xmlns:wne="http://schemas.microsoft.com/office/word/2006/wordml" xmlns:wps="http://schemas.microsoft.com/office/word/2010/wordprocessingShape" mc:Ignorable="w14 w15 w16se w16cid w16 w16cex w16sdtdh w16sdtfl w16du wp14">
   <w:p>
     <w:pPr>
       <w:pStyle w:val="Encabezado"/>
@@ -2727,7 +2618,7 @@
 </file>
 
 <file path=word/numbering.xml><?xml version="1.0" encoding="utf-8"?>
-<w:numbering xmlns:wpc="http://schemas.microsoft.com/office/word/2010/wordprocessingCanvas" xmlns:cx="http://schemas.microsoft.com/office/drawing/2014/chartex" xmlns:mc="http://schemas.openxmlformats.org/markup-compatibility/2006" xmlns:o="urn:schemas-microsoft-com:office:office" xmlns:r="http://schemas.openxmlformats.org/officeDocument/2006/relationships" xmlns:m="http://schemas.openxmlformats.org/officeDocument/2006/math" xmlns:v="urn:schemas-microsoft-com:vml" xmlns:wp14="http://schemas.microsoft.com/office/word/2010/wordprocessingDrawing" xmlns:wp="http://schemas.openxmlformats.org/drawingml/2006/wordprocessingDrawing" xmlns:w10="urn:schemas-microsoft-com:office:word" xmlns:w="http://schemas.openxmlformats.org/wordprocessingml/2006/main" xmlns:w14="http://schemas.microsoft.com/office/word/2010/wordml" xmlns:w15="http://schemas.microsoft.com/office/word/2012/wordml" xmlns:w16se="http://schemas.microsoft.com/office/word/2015/wordml/symex" xmlns:wpg="http://schemas.microsoft.com/office/word/2010/wordprocessingGroup" xmlns:wpi="http://schemas.microsoft.com/office/word/2010/wordprocessingInk" xmlns:wne="http://schemas.microsoft.com/office/word/2006/wordml" xmlns:wps="http://schemas.microsoft.com/office/word/2010/wordprocessingShape" mc:Ignorable="w14 w15 w16se wp14">
+<w:numbering xmlns:wpc="http://schemas.microsoft.com/office/word/2010/wordprocessingCanvas" xmlns:cx="http://schemas.microsoft.com/office/drawing/2014/chartex" xmlns:cx1="http://schemas.microsoft.com/office/drawing/2015/9/8/chartex" xmlns:cx2="http://schemas.microsoft.com/office/drawing/2015/10/21/chartex" xmlns:cx3="http://schemas.microsoft.com/office/drawing/2016/5/9/chartex" xmlns:cx4="http://schemas.microsoft.com/office/drawing/2016/5/10/chartex" xmlns:cx5="http://schemas.microsoft.com/office/drawing/2016/5/11/chartex" xmlns:cx6="http://schemas.microsoft.com/office/drawing/2016/5/12/chartex" xmlns:cx7="http://schemas.microsoft.com/office/drawing/2016/5/13/chartex" xmlns:cx8="http://schemas.microsoft.com/office/drawing/2016/5/14/chartex" xmlns:mc="http://schemas.openxmlformats.org/markup-compatibility/2006" xmlns:aink="http://schemas.microsoft.com/office/drawing/2016/ink" xmlns:am3d="http://schemas.microsoft.com/office/drawing/2017/model3d" xmlns:o="urn:schemas-microsoft-com:office:office" xmlns:oel="http://schemas.microsoft.com/office/2019/extlst" xmlns:r="http://schemas.openxmlformats.org/officeDocument/2006/relationships" xmlns:m="http://schemas.openxmlformats.org/officeDocument/2006/math" xmlns:v="urn:schemas-microsoft-com:vml" xmlns:wp14="http://schemas.microsoft.com/office/word/2010/wordprocessingDrawing" xmlns:wp="http://schemas.openxmlformats.org/drawingml/2006/wordprocessingDrawing" xmlns:w10="urn:schemas-microsoft-com:office:word" xmlns:w="http://schemas.openxmlformats.org/wordprocessingml/2006/main" xmlns:w14="http://schemas.microsoft.com/office/word/2010/wordml" xmlns:w15="http://schemas.microsoft.com/office/word/2012/wordml" xmlns:w16cex="http://schemas.microsoft.com/office/word/2018/wordml/cex" xmlns:w16cid="http://schemas.microsoft.com/office/word/2016/wordml/cid" xmlns:w16="http://schemas.microsoft.com/office/word/2018/wordml" xmlns:w16du="http://schemas.microsoft.com/office/word/2023/wordml/word16du" xmlns:w16sdtdh="http://schemas.microsoft.com/office/word/2020/wordml/sdtdatahash" xmlns:w16sdtfl="http://schemas.microsoft.com/office/word/2024/wordml/sdtformatlock" xmlns:w16se="http://schemas.microsoft.com/office/word/2015/wordml/symex" xmlns:wpg="http://schemas.microsoft.com/office/word/2010/wordprocessingGroup" xmlns:wpi="http://schemas.microsoft.com/office/word/2010/wordprocessingInk" xmlns:wne="http://schemas.microsoft.com/office/word/2006/wordml" xmlns:wps="http://schemas.microsoft.com/office/word/2010/wordprocessingShape" mc:Ignorable="w14 w15 w16se w16cid w16 w16cex w16sdtdh w16sdtfl w16du wp14">
   <w:abstractNum w:abstractNumId="0" w15:restartNumberingAfterBreak="0">
     <w:nsid w:val="495B5C67"/>
     <w:multiLevelType w:val="hybridMultilevel"/>
@@ -3049,20 +2940,20 @@
       </w:pPr>
     </w:lvl>
   </w:abstractNum>
-  <w:num w:numId="1">
+  <w:num w:numId="1" w16cid:durableId="1242568821">
     <w:abstractNumId w:val="1"/>
   </w:num>
-  <w:num w:numId="2">
+  <w:num w:numId="2" w16cid:durableId="583301216">
     <w:abstractNumId w:val="2"/>
   </w:num>
-  <w:num w:numId="3">
+  <w:num w:numId="3" w16cid:durableId="1419909368">
     <w:abstractNumId w:val="0"/>
   </w:num>
 </w:numbering>
 </file>
 
 <file path=word/styles.xml><?xml version="1.0" encoding="utf-8"?>
-<w:styles xmlns:mc="http://schemas.openxmlformats.org/markup-compatibility/2006" xmlns:r="http://schemas.openxmlformats.org/officeDocument/2006/relationships" xmlns:w="http://schemas.openxmlformats.org/wordprocessingml/2006/main" xmlns:w14="http://schemas.microsoft.com/office/word/2010/wordml" xmlns:w15="http://schemas.microsoft.com/office/word/2012/wordml" xmlns:w16se="http://schemas.microsoft.com/office/word/2015/wordml/symex" mc:Ignorable="w14 w15 w16se">
+<w:styles xmlns:mc="http://schemas.openxmlformats.org/markup-compatibility/2006" xmlns:r="http://schemas.openxmlformats.org/officeDocument/2006/relationships" xmlns:w="http://schemas.openxmlformats.org/wordprocessingml/2006/main" xmlns:w14="http://schemas.microsoft.com/office/word/2010/wordml" xmlns:w15="http://schemas.microsoft.com/office/word/2012/wordml" xmlns:w16cex="http://schemas.microsoft.com/office/word/2018/wordml/cex" xmlns:w16cid="http://schemas.microsoft.com/office/word/2016/wordml/cid" xmlns:w16="http://schemas.microsoft.com/office/word/2018/wordml" xmlns:w16du="http://schemas.microsoft.com/office/word/2023/wordml/word16du" xmlns:w16sdtdh="http://schemas.microsoft.com/office/word/2020/wordml/sdtdatahash" xmlns:w16sdtfl="http://schemas.microsoft.com/office/word/2024/wordml/sdtformatlock" xmlns:w16se="http://schemas.microsoft.com/office/word/2015/wordml/symex" mc:Ignorable="w14 w15 w16se w16cid w16 w16cex w16sdtdh w16sdtfl w16du">
   <w:docDefaults>
     <w:rPrDefault>
       <w:rPr>
@@ -3080,7 +2971,7 @@
       </w:pPr>
     </w:pPrDefault>
   </w:docDefaults>
-  <w:latentStyles w:defLockedState="0" w:defUIPriority="99" w:defSemiHidden="0" w:defUnhideWhenUsed="0" w:defQFormat="0" w:count="371">
+  <w:latentStyles w:defLockedState="0" w:defUIPriority="99" w:defSemiHidden="0" w:defUnhideWhenUsed="0" w:defQFormat="0" w:count="376">
     <w:lsdException w:name="Normal" w:uiPriority="0" w:qFormat="1"/>
     <w:lsdException w:name="heading 1" w:uiPriority="9" w:qFormat="1"/>
     <w:lsdException w:name="heading 2" w:semiHidden="1" w:uiPriority="9" w:unhideWhenUsed="1" w:qFormat="1"/>
@@ -3452,6 +3343,11 @@
     <w:lsdException w:name="List Table 5 Dark Accent 6" w:uiPriority="50"/>
     <w:lsdException w:name="List Table 6 Colorful Accent 6" w:uiPriority="51"/>
     <w:lsdException w:name="List Table 7 Colorful Accent 6" w:uiPriority="52"/>
+    <w:lsdException w:name="Mention" w:semiHidden="1" w:unhideWhenUsed="1"/>
+    <w:lsdException w:name="Smart Hyperlink" w:semiHidden="1" w:unhideWhenUsed="1"/>
+    <w:lsdException w:name="Hashtag" w:semiHidden="1" w:unhideWhenUsed="1"/>
+    <w:lsdException w:name="Unresolved Mention" w:semiHidden="1" w:unhideWhenUsed="1"/>
+    <w:lsdException w:name="Smart Link" w:semiHidden="1" w:unhideWhenUsed="1"/>
   </w:latentStyles>
   <w:style w:type="paragraph" w:default="1" w:styleId="Normal">
     <w:name w:val="Normal"/>

</xml_diff>